<commit_message>
Align ADRs with Production-Readiness Review (v1.1): region classification/input modes/exceptions/VR (ADR-001), quota accounting+groupType (ADR-002), 5-state engine machine (ADR-003), steady-state lifecycle (ADR-004)
</commit_message>
<xml_diff>
--- a/docs/acrme_architecture_decision_records.docx
+++ b/docs/acrme_architecture_decision_records.docx
@@ -2,7 +2,7 @@
 <file path=word/document.xml><?xml version="1.0" encoding="utf-8"?>
 <w:document xmlns:w="http://schemas.openxmlformats.org/wordprocessingml/2006/main" xmlns:m="http://schemas.openxmlformats.org/officeDocument/2006/math" xmlns:r="http://schemas.openxmlformats.org/officeDocument/2006/relationships" xmlns:o="urn:schemas-microsoft-com:office:office" xmlns:v="urn:schemas-microsoft-com:vml" xmlns:w10="urn:schemas-microsoft-com:office:word" xmlns:a="http://schemas.openxmlformats.org/drawingml/2006/main" xmlns:pic="http://schemas.openxmlformats.org/drawingml/2006/picture" xmlns:wp="http://schemas.openxmlformats.org/drawingml/2006/wordprocessingDrawing">
   <w:body>
-    <w:bookmarkStart w:id="44" w:name="acrme-architecture-decision-records-adrs"/>
+    <w:bookmarkStart w:id="60" w:name="acrme-architecture-decision-records-adrs"/>
     <w:p>
       <w:pPr>
         <w:pStyle w:val="Heading1"/>
@@ -58,7 +58,7 @@
         <w:t xml:space="preserve"> </w:t>
       </w:r>
       <w:r>
-        <w:t xml:space="preserve">1.0</w:t>
+        <w:t xml:space="preserve">1.1</w:t>
       </w:r>
       <w:r>
         <w:br/>
@@ -91,6 +91,52 @@
       </w:r>
       <w:r>
         <w:t xml:space="preserve">Accepted</w:t>
+      </w:r>
+      <w:r>
+        <w:br/>
+      </w:r>
+      <w:r>
+        <w:rPr>
+          <w:bCs/>
+          <w:b/>
+        </w:rPr>
+        <w:t xml:space="preserve">Change note (v1.1):</w:t>
+      </w:r>
+      <w:r>
+        <w:t xml:space="preserve"> </w:t>
+      </w:r>
+      <w:r>
+        <w:t xml:space="preserve">Aligned each ADR with the Production-Readiness Review &amp; Architecture (§26–§32) — added the normative region-classification model, Scenario 1/2 input modes, EC-1..EC-4 exception workflow, VR-1..VR-11, capacity-hold concurrency and corrected scoring (ADR-001); group accounting formulas, dual-validation detector and</w:t>
+      </w:r>
+      <w:r>
+        <w:t xml:space="preserve"> </w:t>
+      </w:r>
+      <w:r>
+        <w:rPr>
+          <w:rStyle w:val="VerbatimChar"/>
+        </w:rPr>
+        <w:t xml:space="preserve">groupType</w:t>
+      </w:r>
+      <w:r>
+        <w:t xml:space="preserve"> </w:t>
+      </w:r>
+      <w:r>
+        <w:t xml:space="preserve">FC-11 preview status (ADR-002); the full five-state engine state machine,</w:t>
+      </w:r>
+      <w:r>
+        <w:t xml:space="preserve"> </w:t>
+      </w:r>
+      <w:r>
+        <w:rPr>
+          <w:rStyle w:val="VerbatimChar"/>
+        </w:rPr>
+        <w:t xml:space="preserve">EngineModeState</w:t>
+      </w:r>
+      <w:r>
+        <w:t xml:space="preserve"> </w:t>
+      </w:r>
+      <w:r>
+        <w:t xml:space="preserve">entity and DR-activation semantics (ADR-003); and the 10-step steady-state lifecycle with auto-decrease exclusion (ADR-004).</w:t>
       </w:r>
     </w:p>
     <w:p>
@@ -509,7 +555,7 @@
       </w:r>
     </w:p>
     <w:bookmarkEnd w:id="20"/>
-    <w:bookmarkStart w:id="25" w:name="adr-001-region-selection"/>
+    <w:bookmarkStart w:id="32" w:name="adr-001-region-selection"/>
     <w:p>
       <w:pPr>
         <w:pStyle w:val="Heading2"/>
@@ -845,7 +891,7 @@
       </w:r>
     </w:p>
     <w:bookmarkEnd w:id="21"/>
-    <w:bookmarkStart w:id="22" w:name="decision"/>
+    <w:bookmarkStart w:id="29" w:name="decision"/>
     <w:p>
       <w:pPr>
         <w:pStyle w:val="Heading3"/>
@@ -1334,8 +1380,1484 @@
         <w:t xml:space="preserve">— it produces and logs the ranked recommendation but does not autonomously place. Autonomous placement is gated on POC validation of the scoring formulas.</w:t>
       </w:r>
     </w:p>
+    <w:bookmarkStart w:id="22" w:name="region-classification-model-normative"/>
+    <w:p>
+      <w:pPr>
+        <w:pStyle w:val="Heading4"/>
+      </w:pPr>
+      <w:r>
+        <w:t xml:space="preserve">Region Classification Model (normative)</w:t>
+      </w:r>
+    </w:p>
+    <w:p>
+      <w:pPr>
+        <w:pStyle w:val="FirstParagraph"/>
+      </w:pPr>
+      <w:r>
+        <w:t xml:space="preserve">Every Azure region carries exactly one classification tier, stored in</w:t>
+      </w:r>
+      <w:r>
+        <w:t xml:space="preserve"> </w:t>
+      </w:r>
+      <w:r>
+        <w:rPr>
+          <w:rStyle w:val="VerbatimChar"/>
+        </w:rPr>
+        <w:t xml:space="preserve">PlacementPolicy</w:t>
+      </w:r>
+      <w:r>
+        <w:t xml:space="preserve"> </w:t>
+      </w:r>
+      <w:r>
+        <w:t xml:space="preserve">as config-as-code (versioned, auditable, replayable) — classification is a</w:t>
+      </w:r>
+      <w:r>
+        <w:t xml:space="preserve"> </w:t>
+      </w:r>
+      <w:r>
+        <w:rPr>
+          <w:bCs/>
+          <w:b/>
+        </w:rPr>
+        <w:t xml:space="preserve">governance decision, not a live capability query</w:t>
+      </w:r>
+      <w:r>
+        <w:t xml:space="preserve">.</w:t>
+      </w:r>
+      <w:r>
+        <w:t xml:space="preserve"> </w:t>
+      </w:r>
+      <w:r>
+        <w:rPr>
+          <w:rStyle w:val="VerbatimChar"/>
+        </w:rPr>
+        <w:t xml:space="preserve">[Documented — §27]</w:t>
+      </w:r>
+    </w:p>
+    <w:tbl>
+      <w:tblPr>
+        <w:tblStyle w:val="Table"/>
+        <w:tblW w:type="pct" w:w="5000"/>
+        <w:tblLook w:firstRow="1" w:lastRow="0" w:firstColumn="0" w:lastColumn="0" w:noHBand="0" w:noVBand="0" w:val="0020"/>
+      </w:tblPr>
+      <w:tblGrid>
+        <w:gridCol w:w="2640"/>
+        <w:gridCol w:w="2640"/>
+        <w:gridCol w:w="2640"/>
+      </w:tblGrid>
+      <w:tr>
+        <w:trPr>
+          <w:tblHeader w:val="true"/>
+        </w:trPr>
+        <w:tc>
+          <w:tcPr/>
+          <w:p>
+            <w:pPr>
+              <w:pStyle w:val="Compact"/>
+              <w:jc w:val="left"/>
+            </w:pPr>
+            <w:r>
+              <w:t xml:space="preserve">Tier</w:t>
+            </w:r>
+          </w:p>
+        </w:tc>
+        <w:tc>
+          <w:tcPr/>
+          <w:p>
+            <w:pPr>
+              <w:pStyle w:val="Compact"/>
+              <w:jc w:val="left"/>
+            </w:pPr>
+            <w:r>
+              <w:t xml:space="preserve">Eligibility</w:t>
+            </w:r>
+          </w:p>
+        </w:tc>
+        <w:tc>
+          <w:tcPr/>
+          <w:p>
+            <w:pPr>
+              <w:pStyle w:val="Compact"/>
+              <w:jc w:val="left"/>
+            </w:pPr>
+            <w:r>
+              <w:t xml:space="preserve">Regions</w:t>
+            </w:r>
+          </w:p>
+        </w:tc>
+      </w:tr>
+      <w:tr>
+        <w:tc>
+          <w:tcPr/>
+          <w:p>
+            <w:pPr>
+              <w:pStyle w:val="Compact"/>
+              <w:jc w:val="left"/>
+            </w:pPr>
+            <w:r>
+              <w:rPr>
+                <w:bCs/>
+                <w:b/>
+              </w:rPr>
+              <w:t xml:space="preserve">Standard Capacity Region</w:t>
+            </w:r>
+          </w:p>
+        </w:tc>
+        <w:tc>
+          <w:tcPr/>
+          <w:p>
+            <w:pPr>
+              <w:pStyle w:val="Compact"/>
+              <w:jc w:val="left"/>
+            </w:pPr>
+            <w:r>
+              <w:t xml:space="preserve">Eligible for dynamic selection, scoring, and all env assignments (Prod/CVAL/DR) — the only regions that enter the pipeline</w:t>
+            </w:r>
+          </w:p>
+        </w:tc>
+        <w:tc>
+          <w:tcPr/>
+          <w:p>
+            <w:pPr>
+              <w:pStyle w:val="Compact"/>
+              <w:jc w:val="left"/>
+            </w:pPr>
+            <w:r>
+              <w:t xml:space="preserve">NA: West US 3, Central US, Canada Central · EU: Sweden Central, Belgium Central · ME: Saudi Arabia, UAE North · APAC: Japan East, Southeast Asia, Australia East</w:t>
+            </w:r>
+          </w:p>
+        </w:tc>
+      </w:tr>
+      <w:tr>
+        <w:tc>
+          <w:tcPr/>
+          <w:p>
+            <w:pPr>
+              <w:pStyle w:val="Compact"/>
+              <w:jc w:val="left"/>
+            </w:pPr>
+            <w:r>
+              <w:rPr>
+                <w:bCs/>
+                <w:b/>
+              </w:rPr>
+              <w:t xml:space="preserve">Restricted Capacity Region</w:t>
+            </w:r>
+          </w:p>
+        </w:tc>
+        <w:tc>
+          <w:tcPr/>
+          <w:p>
+            <w:pPr>
+              <w:pStyle w:val="Compact"/>
+              <w:jc w:val="left"/>
+            </w:pPr>
+            <w:r>
+              <w:t xml:space="preserve">Exception-only (Scenario 2 + Prod + approval); never scored, ranked, or recommended</w:t>
+            </w:r>
+          </w:p>
+        </w:tc>
+        <w:tc>
+          <w:tcPr/>
+          <w:p>
+            <w:pPr>
+              <w:pStyle w:val="Compact"/>
+              <w:jc w:val="left"/>
+            </w:pPr>
+            <w:r>
+              <w:t xml:space="preserve">East US 2, North Europe, West Europe, East Asia, Australia Southeast (all: Azure physical capacity constraint)</w:t>
+            </w:r>
+          </w:p>
+        </w:tc>
+      </w:tr>
+      <w:tr>
+        <w:tc>
+          <w:tcPr/>
+          <w:p>
+            <w:pPr>
+              <w:pStyle w:val="Compact"/>
+              <w:jc w:val="left"/>
+            </w:pPr>
+            <w:r>
+              <w:rPr>
+                <w:bCs/>
+                <w:b/>
+              </w:rPr>
+              <w:t xml:space="preserve">Cross-Geo Extension Region</w:t>
+            </w:r>
+          </w:p>
+        </w:tc>
+        <w:tc>
+          <w:tcPr/>
+          <w:p>
+            <w:pPr>
+              <w:pStyle w:val="Compact"/>
+              <w:jc w:val="left"/>
+            </w:pPr>
+            <w:r>
+              <w:t xml:space="preserve">DR-only, for geographies that cannot meet the 3-region minimum in-geo</w:t>
+            </w:r>
+          </w:p>
+        </w:tc>
+        <w:tc>
+          <w:tcPr/>
+          <w:p>
+            <w:pPr>
+              <w:pStyle w:val="Compact"/>
+              <w:jc w:val="left"/>
+            </w:pPr>
+            <w:r>
+              <w:t xml:space="preserve">Saudi Arabia → Belgium Central; UAE North → Belgium Central (Middle East only)</w:t>
+            </w:r>
+          </w:p>
+        </w:tc>
+      </w:tr>
+    </w:tbl>
+    <w:p>
+      <w:pPr>
+        <w:pStyle w:val="BodyText"/>
+      </w:pPr>
+      <w:r>
+        <w:t xml:space="preserve">Restricted regions are excluded by a</w:t>
+      </w:r>
+      <w:r>
+        <w:t xml:space="preserve"> </w:t>
+      </w:r>
+      <w:r>
+        <w:rPr>
+          <w:bCs/>
+          <w:b/>
+        </w:rPr>
+        <w:t xml:space="preserve">pre-filter ahead of all hard constraints</w:t>
+      </w:r>
+      <w:r>
+        <w:t xml:space="preserve"> </w:t>
+      </w:r>
+      <w:r>
+        <w:t xml:space="preserve">(HC-9), never as a scoring penalty.</w:t>
+      </w:r>
+    </w:p>
     <w:bookmarkEnd w:id="22"/>
-    <w:bookmarkStart w:id="23" w:name="consequences"/>
+    <w:bookmarkStart w:id="23" w:name="prod-region-input-modes"/>
+    <w:p>
+      <w:pPr>
+        <w:pStyle w:val="Heading4"/>
+      </w:pPr>
+      <w:r>
+        <w:t xml:space="preserve">Prod Region Input Modes</w:t>
+      </w:r>
+    </w:p>
+    <w:p>
+      <w:pPr>
+        <w:pStyle w:val="FirstParagraph"/>
+      </w:pPr>
+      <w:r>
+        <w:t xml:space="preserve">The Prod region is the anchor; CVAL and DR are selected sequentially from it. The customer supplies the anchor one of two ways, and both converge on a single validated Prod anchor:</w:t>
+      </w:r>
+      <w:r>
+        <w:t xml:space="preserve"> </w:t>
+      </w:r>
+      <w:r>
+        <w:rPr>
+          <w:rStyle w:val="VerbatimChar"/>
+        </w:rPr>
+        <w:t xml:space="preserve">[Documented — §27]</w:t>
+      </w:r>
+    </w:p>
+    <w:p>
+      <w:pPr>
+        <w:numPr>
+          <w:ilvl w:val="0"/>
+          <w:numId w:val="1005"/>
+        </w:numPr>
+        <w:pStyle w:val="Compact"/>
+      </w:pPr>
+      <w:r>
+        <w:rPr>
+          <w:bCs/>
+          <w:b/>
+        </w:rPr>
+        <w:t xml:space="preserve">Scenario 1 — geography supplied.</w:t>
+      </w:r>
+      <w:r>
+        <w:t xml:space="preserve"> </w:t>
+      </w:r>
+      <w:r>
+        <w:t xml:space="preserve">The engine derives Prod via</w:t>
+      </w:r>
+      <w:r>
+        <w:t xml:space="preserve"> </w:t>
+      </w:r>
+      <w:r>
+        <w:rPr>
+          <w:rStyle w:val="VerbatimChar"/>
+        </w:rPr>
+        <w:t xml:space="preserve">argmax(PS_Prod)</w:t>
+      </w:r>
+      <w:r>
+        <w:t xml:space="preserve"> </w:t>
+      </w:r>
+      <w:r>
+        <w:t xml:space="preserve">over Standard Capacity Regions</w:t>
+      </w:r>
+      <w:r>
+        <w:t xml:space="preserve"> </w:t>
+      </w:r>
+      <w:r>
+        <w:rPr>
+          <w:bCs/>
+          <w:b/>
+        </w:rPr>
+        <w:t xml:space="preserve">in that geography only</w:t>
+      </w:r>
+      <w:r>
+        <w:t xml:space="preserve">. Ties break deterministically by the Standard-region list order for the geography; the first-listed region is the deterministic cold-start default when no snapshot exists. Geography exhaustion → reject (never silently cross-geo or use a Restricted region).</w:t>
+      </w:r>
+    </w:p>
+    <w:p>
+      <w:pPr>
+        <w:numPr>
+          <w:ilvl w:val="0"/>
+          <w:numId w:val="1005"/>
+        </w:numPr>
+        <w:pStyle w:val="Compact"/>
+      </w:pPr>
+      <w:r>
+        <w:rPr>
+          <w:bCs/>
+          <w:b/>
+        </w:rPr>
+        <w:t xml:space="preserve">Scenario 2 — specific region supplied.</w:t>
+      </w:r>
+      <w:r>
+        <w:t xml:space="preserve"> </w:t>
+      </w:r>
+      <w:r>
+        <w:t xml:space="preserve">If Standard, validate against HC-1..HC-10 and adopt as the anchor (</w:t>
+      </w:r>
+      <w:r>
+        <w:rPr>
+          <w:rStyle w:val="VerbatimChar"/>
+        </w:rPr>
+        <w:t xml:space="preserve">PS_Prod</w:t>
+      </w:r>
+      <w:r>
+        <w:t xml:space="preserve"> </w:t>
+      </w:r>
+      <w:r>
+        <w:t xml:space="preserve">used only for post-selection validation). If Restricted, route to the Exception Deployment Workflow.</w:t>
+      </w:r>
+    </w:p>
+    <w:bookmarkEnd w:id="23"/>
+    <w:bookmarkStart w:id="24" w:name="X844b545e4620926cc70c9c09d323b98bfdbf572"/>
+    <w:p>
+      <w:pPr>
+        <w:pStyle w:val="Heading4"/>
+      </w:pPr>
+      <w:r>
+        <w:t xml:space="preserve">Exception Deployment Workflow (Scenario 2 — Restricted region)</w:t>
+      </w:r>
+    </w:p>
+    <w:p>
+      <w:pPr>
+        <w:pStyle w:val="FirstParagraph"/>
+      </w:pPr>
+      <w:r>
+        <w:t xml:space="preserve">A Restricted region is used only if</w:t>
+      </w:r>
+      <w:r>
+        <w:t xml:space="preserve"> </w:t>
+      </w:r>
+      <w:r>
+        <w:rPr>
+          <w:bCs/>
+          <w:b/>
+        </w:rPr>
+        <w:t xml:space="preserve">all four</w:t>
+      </w:r>
+      <w:r>
+        <w:t xml:space="preserve"> </w:t>
+      </w:r>
+      <w:r>
+        <w:t xml:space="preserve">conditions hold; failure rejects at the first failing gate:</w:t>
+      </w:r>
+      <w:r>
+        <w:t xml:space="preserve"> </w:t>
+      </w:r>
+      <w:r>
+        <w:rPr>
+          <w:rStyle w:val="VerbatimChar"/>
+        </w:rPr>
+        <w:t xml:space="preserve">[Documented — §27]</w:t>
+      </w:r>
+    </w:p>
+    <w:tbl>
+      <w:tblPr>
+        <w:tblStyle w:val="Table"/>
+        <w:tblW w:type="pct" w:w="5000"/>
+        <w:tblLook w:firstRow="1" w:lastRow="0" w:firstColumn="0" w:lastColumn="0" w:noHBand="0" w:noVBand="0" w:val="0020"/>
+      </w:tblPr>
+      <w:tblGrid>
+        <w:gridCol w:w="2640"/>
+        <w:gridCol w:w="2640"/>
+        <w:gridCol w:w="2640"/>
+      </w:tblGrid>
+      <w:tr>
+        <w:trPr>
+          <w:tblHeader w:val="true"/>
+        </w:trPr>
+        <w:tc>
+          <w:tcPr/>
+          <w:p>
+            <w:pPr>
+              <w:pStyle w:val="Compact"/>
+              <w:jc w:val="left"/>
+            </w:pPr>
+            <w:r>
+              <w:t xml:space="preserve">#</w:t>
+            </w:r>
+          </w:p>
+        </w:tc>
+        <w:tc>
+          <w:tcPr/>
+          <w:p>
+            <w:pPr>
+              <w:pStyle w:val="Compact"/>
+              <w:jc w:val="left"/>
+            </w:pPr>
+            <w:r>
+              <w:t xml:space="preserve">Condition</w:t>
+            </w:r>
+          </w:p>
+        </w:tc>
+        <w:tc>
+          <w:tcPr/>
+          <w:p>
+            <w:pPr>
+              <w:pStyle w:val="Compact"/>
+              <w:jc w:val="left"/>
+            </w:pPr>
+            <w:r>
+              <w:t xml:space="preserve">Check</w:t>
+            </w:r>
+          </w:p>
+        </w:tc>
+      </w:tr>
+      <w:tr>
+        <w:tc>
+          <w:tcPr/>
+          <w:p>
+            <w:pPr>
+              <w:pStyle w:val="Compact"/>
+              <w:jc w:val="left"/>
+            </w:pPr>
+            <w:r>
+              <w:rPr>
+                <w:bCs/>
+                <w:b/>
+              </w:rPr>
+              <w:t xml:space="preserve">EC-1</w:t>
+            </w:r>
+          </w:p>
+        </w:tc>
+        <w:tc>
+          <w:tcPr/>
+          <w:p>
+            <w:pPr>
+              <w:pStyle w:val="Compact"/>
+              <w:jc w:val="left"/>
+            </w:pPr>
+            <w:r>
+              <w:t xml:space="preserve">Explicit request</w:t>
+            </w:r>
+          </w:p>
+        </w:tc>
+        <w:tc>
+          <w:tcPr/>
+          <w:p>
+            <w:pPr>
+              <w:pStyle w:val="Compact"/>
+              <w:jc w:val="left"/>
+            </w:pPr>
+            <w:r>
+              <w:t xml:space="preserve">Customer named the region; engine never recommended it</w:t>
+            </w:r>
+          </w:p>
+        </w:tc>
+      </w:tr>
+      <w:tr>
+        <w:tc>
+          <w:tcPr/>
+          <w:p>
+            <w:pPr>
+              <w:pStyle w:val="Compact"/>
+              <w:jc w:val="left"/>
+            </w:pPr>
+            <w:r>
+              <w:rPr>
+                <w:bCs/>
+                <w:b/>
+              </w:rPr>
+              <w:t xml:space="preserve">EC-2</w:t>
+            </w:r>
+          </w:p>
+        </w:tc>
+        <w:tc>
+          <w:tcPr/>
+          <w:p>
+            <w:pPr>
+              <w:pStyle w:val="Compact"/>
+              <w:jc w:val="left"/>
+            </w:pPr>
+            <w:r>
+              <w:t xml:space="preserve">Production only</w:t>
+            </w:r>
+          </w:p>
+        </w:tc>
+        <w:tc>
+          <w:tcPr/>
+          <w:p>
+            <w:pPr>
+              <w:pStyle w:val="Compact"/>
+              <w:jc w:val="left"/>
+            </w:pPr>
+            <w:r>
+              <w:t xml:space="preserve">CVAL and DR may</w:t>
+            </w:r>
+            <w:r>
+              <w:t xml:space="preserve"> </w:t>
+            </w:r>
+            <w:r>
+              <w:rPr>
+                <w:bCs/>
+                <w:b/>
+              </w:rPr>
+              <w:t xml:space="preserve">never</w:t>
+            </w:r>
+            <w:r>
+              <w:t xml:space="preserve"> </w:t>
+            </w:r>
+            <w:r>
+              <w:t xml:space="preserve">use a Restricted region</w:t>
+            </w:r>
+          </w:p>
+        </w:tc>
+      </w:tr>
+      <w:tr>
+        <w:tc>
+          <w:tcPr/>
+          <w:p>
+            <w:pPr>
+              <w:pStyle w:val="Compact"/>
+              <w:jc w:val="left"/>
+            </w:pPr>
+            <w:r>
+              <w:rPr>
+                <w:bCs/>
+                <w:b/>
+              </w:rPr>
+              <w:t xml:space="preserve">EC-3</w:t>
+            </w:r>
+          </w:p>
+        </w:tc>
+        <w:tc>
+          <w:tcPr/>
+          <w:p>
+            <w:pPr>
+              <w:pStyle w:val="Compact"/>
+              <w:jc w:val="left"/>
+            </w:pPr>
+            <w:r>
+              <w:t xml:space="preserve">Exception approval</w:t>
+            </w:r>
+          </w:p>
+        </w:tc>
+        <w:tc>
+          <w:tcPr/>
+          <w:p>
+            <w:pPr>
+              <w:pStyle w:val="Compact"/>
+              <w:jc w:val="left"/>
+            </w:pPr>
+            <w:r>
+              <w:t xml:space="preserve">A named, revocable approval record exists for the customer–region pair</w:t>
+            </w:r>
+          </w:p>
+        </w:tc>
+      </w:tr>
+      <w:tr>
+        <w:tc>
+          <w:tcPr/>
+          <w:p>
+            <w:pPr>
+              <w:pStyle w:val="Compact"/>
+              <w:jc w:val="left"/>
+            </w:pPr>
+            <w:r>
+              <w:rPr>
+                <w:bCs/>
+                <w:b/>
+              </w:rPr>
+              <w:t xml:space="preserve">EC-4</w:t>
+            </w:r>
+          </w:p>
+        </w:tc>
+        <w:tc>
+          <w:tcPr/>
+          <w:p>
+            <w:pPr>
+              <w:pStyle w:val="Compact"/>
+              <w:jc w:val="left"/>
+            </w:pPr>
+            <w:r>
+              <w:t xml:space="preserve">Scenario 2 input</w:t>
+            </w:r>
+          </w:p>
+        </w:tc>
+        <w:tc>
+          <w:tcPr/>
+          <w:p>
+            <w:pPr>
+              <w:pStyle w:val="Compact"/>
+              <w:jc w:val="left"/>
+            </w:pPr>
+            <w:r>
+              <w:t xml:space="preserve">Restricted regions can never be engine-derived</w:t>
+            </w:r>
+          </w:p>
+        </w:tc>
+      </w:tr>
+    </w:tbl>
+    <w:p>
+      <w:pPr>
+        <w:pStyle w:val="BodyText"/>
+      </w:pPr>
+      <w:r>
+        <w:t xml:space="preserve">On success the region becomes the</w:t>
+      </w:r>
+      <w:r>
+        <w:t xml:space="preserve"> </w:t>
+      </w:r>
+      <w:r>
+        <w:rPr>
+          <w:bCs/>
+          <w:b/>
+        </w:rPr>
+        <w:t xml:space="preserve">Exception Prod Anchor</w:t>
+      </w:r>
+      <w:r>
+        <w:t xml:space="preserve">, the placement is marked an</w:t>
+      </w:r>
+      <w:r>
+        <w:t xml:space="preserve"> </w:t>
+      </w:r>
+      <w:r>
+        <w:rPr>
+          <w:bCs/>
+          <w:b/>
+        </w:rPr>
+        <w:t xml:space="preserve">Exception Deployment</w:t>
+      </w:r>
+      <w:r>
+        <w:t xml:space="preserve">, a capacity-constraint warning is emitted to the caller, and the approval ID + restriction status are mandatory</w:t>
+      </w:r>
+      <w:r>
+        <w:t xml:space="preserve"> </w:t>
+      </w:r>
+      <w:r>
+        <w:rPr>
+          <w:rStyle w:val="VerbatimChar"/>
+        </w:rPr>
+        <w:t xml:space="preserve">OperationRecord</w:t>
+      </w:r>
+      <w:r>
+        <w:t xml:space="preserve"> </w:t>
+      </w:r>
+      <w:r>
+        <w:t xml:space="preserve">fields (commit blocked if absent). CVAL/DR still select from Standard regions via normal scoring.</w:t>
+      </w:r>
+    </w:p>
+    <w:bookmarkEnd w:id="24"/>
+    <w:bookmarkStart w:id="25" w:name="validation-rule-framework-vr-1..vr-11"/>
+    <w:p>
+      <w:pPr>
+        <w:pStyle w:val="Heading4"/>
+      </w:pPr>
+      <w:r>
+        <w:t xml:space="preserve">Validation Rule Framework (VR-1..VR-11)</w:t>
+      </w:r>
+    </w:p>
+    <w:tbl>
+      <w:tblPr>
+        <w:tblStyle w:val="Table"/>
+        <w:tblW w:type="pct" w:w="5000"/>
+        <w:tblLook w:firstRow="1" w:lastRow="0" w:firstColumn="0" w:lastColumn="0" w:noHBand="0" w:noVBand="0" w:val="0020"/>
+      </w:tblPr>
+      <w:tblGrid>
+        <w:gridCol w:w="2640"/>
+        <w:gridCol w:w="2640"/>
+        <w:gridCol w:w="2640"/>
+      </w:tblGrid>
+      <w:tr>
+        <w:trPr>
+          <w:tblHeader w:val="true"/>
+        </w:trPr>
+        <w:tc>
+          <w:tcPr/>
+          <w:p>
+            <w:pPr>
+              <w:pStyle w:val="Compact"/>
+              <w:jc w:val="left"/>
+            </w:pPr>
+            <w:r>
+              <w:t xml:space="preserve">Rule</w:t>
+            </w:r>
+          </w:p>
+        </w:tc>
+        <w:tc>
+          <w:tcPr/>
+          <w:p>
+            <w:pPr>
+              <w:pStyle w:val="Compact"/>
+              <w:jc w:val="left"/>
+            </w:pPr>
+            <w:r>
+              <w:t xml:space="preserve">Check</w:t>
+            </w:r>
+          </w:p>
+        </w:tc>
+        <w:tc>
+          <w:tcPr/>
+          <w:p>
+            <w:pPr>
+              <w:pStyle w:val="Compact"/>
+              <w:jc w:val="left"/>
+            </w:pPr>
+            <w:r>
+              <w:t xml:space="preserve">Failure action</w:t>
+            </w:r>
+          </w:p>
+        </w:tc>
+      </w:tr>
+      <w:tr>
+        <w:tc>
+          <w:tcPr/>
+          <w:p>
+            <w:pPr>
+              <w:pStyle w:val="Compact"/>
+              <w:jc w:val="left"/>
+            </w:pPr>
+            <w:r>
+              <w:t xml:space="preserve">VR-1</w:t>
+            </w:r>
+          </w:p>
+        </w:tc>
+        <w:tc>
+          <w:tcPr/>
+          <w:p>
+            <w:pPr>
+              <w:pStyle w:val="Compact"/>
+              <w:jc w:val="left"/>
+            </w:pPr>
+            <w:r>
+              <w:t xml:space="preserve">Region exists in classification list</w:t>
+            </w:r>
+          </w:p>
+        </w:tc>
+        <w:tc>
+          <w:tcPr/>
+          <w:p>
+            <w:pPr>
+              <w:pStyle w:val="Compact"/>
+              <w:jc w:val="left"/>
+            </w:pPr>
+            <w:r>
+              <w:t xml:space="preserve">Reject if unknown</w:t>
+            </w:r>
+          </w:p>
+        </w:tc>
+      </w:tr>
+      <w:tr>
+        <w:tc>
+          <w:tcPr/>
+          <w:p>
+            <w:pPr>
+              <w:pStyle w:val="Compact"/>
+              <w:jc w:val="left"/>
+            </w:pPr>
+            <w:r>
+              <w:t xml:space="preserve">VR-2</w:t>
+            </w:r>
+          </w:p>
+        </w:tc>
+        <w:tc>
+          <w:tcPr/>
+          <w:p>
+            <w:pPr>
+              <w:pStyle w:val="Compact"/>
+              <w:jc w:val="left"/>
+            </w:pPr>
+            <w:r>
+              <w:t xml:space="preserve">Automated placement uses Standard only</w:t>
+            </w:r>
+          </w:p>
+        </w:tc>
+        <w:tc>
+          <w:tcPr/>
+          <w:p>
+            <w:pPr>
+              <w:pStyle w:val="Compact"/>
+              <w:jc w:val="left"/>
+            </w:pPr>
+            <w:r>
+              <w:t xml:space="preserve">Exclude before scoring if Restricted</w:t>
+            </w:r>
+          </w:p>
+        </w:tc>
+      </w:tr>
+      <w:tr>
+        <w:tc>
+          <w:tcPr/>
+          <w:p>
+            <w:pPr>
+              <w:pStyle w:val="Compact"/>
+              <w:jc w:val="left"/>
+            </w:pPr>
+            <w:r>
+              <w:t xml:space="preserve">VR-3</w:t>
+            </w:r>
+          </w:p>
+        </w:tc>
+        <w:tc>
+          <w:tcPr/>
+          <w:p>
+            <w:pPr>
+              <w:pStyle w:val="Compact"/>
+              <w:jc w:val="left"/>
+            </w:pPr>
+            <w:r>
+              <w:t xml:space="preserve">Scenario 2 Restricted: EC-1..EC-4 all met</w:t>
+            </w:r>
+          </w:p>
+        </w:tc>
+        <w:tc>
+          <w:tcPr/>
+          <w:p>
+            <w:pPr>
+              <w:pStyle w:val="Compact"/>
+              <w:jc w:val="left"/>
+            </w:pPr>
+            <w:r>
+              <w:t xml:space="preserve">Reject at first failing condition</w:t>
+            </w:r>
+          </w:p>
+        </w:tc>
+      </w:tr>
+      <w:tr>
+        <w:tc>
+          <w:tcPr/>
+          <w:p>
+            <w:pPr>
+              <w:pStyle w:val="Compact"/>
+              <w:jc w:val="left"/>
+            </w:pPr>
+            <w:r>
+              <w:t xml:space="preserve">VR-4</w:t>
+            </w:r>
+          </w:p>
+        </w:tc>
+        <w:tc>
+          <w:tcPr/>
+          <w:p>
+            <w:pPr>
+              <w:pStyle w:val="Compact"/>
+              <w:jc w:val="left"/>
+            </w:pPr>
+            <w:r>
+              <w:t xml:space="preserve">Scenario 1 derived Prod in-geo Standard</w:t>
+            </w:r>
+          </w:p>
+        </w:tc>
+        <w:tc>
+          <w:tcPr/>
+          <w:p>
+            <w:pPr>
+              <w:pStyle w:val="Compact"/>
+              <w:jc w:val="left"/>
+            </w:pPr>
+            <w:r>
+              <w:t xml:space="preserve">Geography-scoped exhaustion error</w:t>
+            </w:r>
+          </w:p>
+        </w:tc>
+      </w:tr>
+      <w:tr>
+        <w:tc>
+          <w:tcPr/>
+          <w:p>
+            <w:pPr>
+              <w:pStyle w:val="Compact"/>
+              <w:jc w:val="left"/>
+            </w:pPr>
+            <w:r>
+              <w:t xml:space="preserve">VR-5</w:t>
+            </w:r>
+          </w:p>
+        </w:tc>
+        <w:tc>
+          <w:tcPr/>
+          <w:p>
+            <w:pPr>
+              <w:pStyle w:val="Compact"/>
+              <w:jc w:val="left"/>
+            </w:pPr>
+            <w:r>
+              <w:t xml:space="preserve">Standard region passes HC-1..HC-10</w:t>
+            </w:r>
+          </w:p>
+        </w:tc>
+        <w:tc>
+          <w:tcPr/>
+          <w:p>
+            <w:pPr>
+              <w:pStyle w:val="Compact"/>
+              <w:jc w:val="left"/>
+            </w:pPr>
+            <w:r>
+              <w:t xml:space="preserve">Exclude; exhaustion error if all excluded</w:t>
+            </w:r>
+          </w:p>
+        </w:tc>
+      </w:tr>
+      <w:tr>
+        <w:tc>
+          <w:tcPr/>
+          <w:p>
+            <w:pPr>
+              <w:pStyle w:val="Compact"/>
+              <w:jc w:val="left"/>
+            </w:pPr>
+            <w:r>
+              <w:t xml:space="preserve">VR-6</w:t>
+            </w:r>
+          </w:p>
+        </w:tc>
+        <w:tc>
+          <w:tcPr/>
+          <w:p>
+            <w:pPr>
+              <w:pStyle w:val="Compact"/>
+              <w:jc w:val="left"/>
+            </w:pPr>
+            <w:r>
+              <w:t xml:space="preserve">Middle East DR = Belgium Central via approved path</w:t>
+            </w:r>
+          </w:p>
+        </w:tc>
+        <w:tc>
+          <w:tcPr/>
+          <w:p>
+            <w:pPr>
+              <w:pStyle w:val="Compact"/>
+              <w:jc w:val="left"/>
+            </w:pPr>
+            <w:r>
+              <w:t xml:space="preserve">Block with ops alert if Belgium Central fails HC-1..HC-10</w:t>
+            </w:r>
+          </w:p>
+        </w:tc>
+      </w:tr>
+      <w:tr>
+        <w:tc>
+          <w:tcPr/>
+          <w:p>
+            <w:pPr>
+              <w:pStyle w:val="Compact"/>
+              <w:jc w:val="left"/>
+            </w:pPr>
+            <w:r>
+              <w:t xml:space="preserve">VR-7</w:t>
+            </w:r>
+          </w:p>
+        </w:tc>
+        <w:tc>
+          <w:tcPr/>
+          <w:p>
+            <w:pPr>
+              <w:pStyle w:val="Compact"/>
+              <w:jc w:val="left"/>
+            </w:pPr>
+            <w:r>
+              <w:t xml:space="preserve">Exception approval ID persisted before commit</w:t>
+            </w:r>
+          </w:p>
+        </w:tc>
+        <w:tc>
+          <w:tcPr/>
+          <w:p>
+            <w:pPr>
+              <w:pStyle w:val="Compact"/>
+              <w:jc w:val="left"/>
+            </w:pPr>
+            <w:r>
+              <w:t xml:space="preserve">Block commit if absent</w:t>
+            </w:r>
+          </w:p>
+        </w:tc>
+      </w:tr>
+      <w:tr>
+        <w:tc>
+          <w:tcPr/>
+          <w:p>
+            <w:pPr>
+              <w:pStyle w:val="Compact"/>
+              <w:jc w:val="left"/>
+            </w:pPr>
+            <w:r>
+              <w:t xml:space="preserve">VR-8</w:t>
+            </w:r>
+          </w:p>
+        </w:tc>
+        <w:tc>
+          <w:tcPr/>
+          <w:p>
+            <w:pPr>
+              <w:pStyle w:val="Compact"/>
+              <w:jc w:val="left"/>
+            </w:pPr>
+            <w:r>
+              <w:t xml:space="preserve">Capacity-constraint warning emitted</w:t>
+            </w:r>
+          </w:p>
+        </w:tc>
+        <w:tc>
+          <w:tcPr/>
+          <w:p>
+            <w:pPr>
+              <w:pStyle w:val="Compact"/>
+              <w:jc w:val="left"/>
+            </w:pPr>
+            <w:r>
+              <w:t xml:space="preserve">Block commit if suppressed</w:t>
+            </w:r>
+          </w:p>
+        </w:tc>
+      </w:tr>
+      <w:tr>
+        <w:tc>
+          <w:tcPr/>
+          <w:p>
+            <w:pPr>
+              <w:pStyle w:val="Compact"/>
+              <w:jc w:val="left"/>
+            </w:pPr>
+            <w:r>
+              <w:t xml:space="preserve">VR-9</w:t>
+            </w:r>
+          </w:p>
+        </w:tc>
+        <w:tc>
+          <w:tcPr/>
+          <w:p>
+            <w:pPr>
+              <w:pStyle w:val="Compact"/>
+              <w:jc w:val="left"/>
+            </w:pPr>
+            <w:r>
+              <w:t xml:space="preserve">Snapshot age within policy limit</w:t>
+            </w:r>
+          </w:p>
+        </w:tc>
+        <w:tc>
+          <w:tcPr/>
+          <w:p>
+            <w:pPr>
+              <w:pStyle w:val="Compact"/>
+              <w:jc w:val="left"/>
+            </w:pPr>
+            <w:r>
+              <w:t xml:space="preserve">Trigger targeted ARM refresh</w:t>
+            </w:r>
+          </w:p>
+        </w:tc>
+      </w:tr>
+      <w:tr>
+        <w:tc>
+          <w:tcPr/>
+          <w:p>
+            <w:pPr>
+              <w:pStyle w:val="Compact"/>
+              <w:jc w:val="left"/>
+            </w:pPr>
+            <w:r>
+              <w:t xml:space="preserve">VR-10</w:t>
+            </w:r>
+          </w:p>
+        </w:tc>
+        <w:tc>
+          <w:tcPr/>
+          <w:p>
+            <w:pPr>
+              <w:pStyle w:val="Compact"/>
+              <w:jc w:val="left"/>
+            </w:pPr>
+            <w:r>
+              <w:t xml:space="preserve">Capacity hold acquired before commit</w:t>
+            </w:r>
+          </w:p>
+        </w:tc>
+        <w:tc>
+          <w:tcPr/>
+          <w:p>
+            <w:pPr>
+              <w:pStyle w:val="Compact"/>
+              <w:jc w:val="left"/>
+            </w:pPr>
+            <w:r>
+              <w:t xml:space="preserve">Block commit if hold absent</w:t>
+            </w:r>
+          </w:p>
+        </w:tc>
+      </w:tr>
+      <w:tr>
+        <w:tc>
+          <w:tcPr/>
+          <w:p>
+            <w:pPr>
+              <w:pStyle w:val="Compact"/>
+              <w:jc w:val="left"/>
+            </w:pPr>
+            <w:r>
+              <w:t xml:space="preserve">VR-11</w:t>
+            </w:r>
+          </w:p>
+        </w:tc>
+        <w:tc>
+          <w:tcPr/>
+          <w:p>
+            <w:pPr>
+              <w:pStyle w:val="Compact"/>
+              <w:jc w:val="left"/>
+            </w:pPr>
+            <w:r>
+              <w:t xml:space="preserve">Restricted regions absent from all recommendation outputs</w:t>
+            </w:r>
+          </w:p>
+        </w:tc>
+        <w:tc>
+          <w:tcPr/>
+          <w:p>
+            <w:pPr>
+              <w:pStyle w:val="Compact"/>
+              <w:jc w:val="left"/>
+            </w:pPr>
+            <w:r>
+              <w:t xml:space="preserve">Post-scoring filter (defence-in-depth)</w:t>
+            </w:r>
+          </w:p>
+        </w:tc>
+      </w:tr>
+    </w:tbl>
+    <w:bookmarkEnd w:id="25"/>
+    <w:bookmarkStart w:id="26" w:name="capacity-holds-concurrency"/>
+    <w:p>
+      <w:pPr>
+        <w:pStyle w:val="Heading4"/>
+      </w:pPr>
+      <w:r>
+        <w:t xml:space="preserve">Capacity Holds &amp; Concurrency</w:t>
+      </w:r>
+    </w:p>
+    <w:p>
+      <w:pPr>
+        <w:pStyle w:val="FirstParagraph"/>
+      </w:pPr>
+      <w:r>
+        <w:t xml:space="preserve">Before returning a committed assignment the engine creates a</w:t>
+      </w:r>
+      <w:r>
+        <w:t xml:space="preserve"> </w:t>
+      </w:r>
+      <w:r>
+        <w:rPr>
+          <w:bCs/>
+          <w:b/>
+        </w:rPr>
+        <w:t xml:space="preserve">capacity hold</w:t>
+      </w:r>
+      <w:r>
+        <w:t xml:space="preserve"> </w:t>
+      </w:r>
+      <w:r>
+        <w:t xml:space="preserve">keyed by region, SKU, zone, environment, and policy version, using</w:t>
+      </w:r>
+      <w:r>
+        <w:t xml:space="preserve"> </w:t>
+      </w:r>
+      <w:r>
+        <w:rPr>
+          <w:bCs/>
+          <w:b/>
+        </w:rPr>
+        <w:t xml:space="preserve">optimistic concurrency</w:t>
+      </w:r>
+      <w:r>
+        <w:t xml:space="preserve">; the hold expires if Azure provisioning does not begin. This closes the concurrent-placement race (B-7).</w:t>
+      </w:r>
+      <w:r>
+        <w:t xml:space="preserve"> </w:t>
+      </w:r>
+      <w:r>
+        <w:rPr>
+          <w:rStyle w:val="VerbatimChar"/>
+        </w:rPr>
+        <w:t xml:space="preserve">[Documented — §29]</w:t>
+      </w:r>
+    </w:p>
+    <w:bookmarkEnd w:id="26"/>
+    <w:bookmarkStart w:id="27" w:name="corrected-scoring-model-pilot"/>
+    <w:p>
+      <w:pPr>
+        <w:pStyle w:val="Heading4"/>
+      </w:pPr>
+      <w:r>
+        <w:t xml:space="preserve">Corrected Scoring Model (pilot)</w:t>
+      </w:r>
+    </w:p>
+    <w:p>
+      <w:pPr>
+        <w:numPr>
+          <w:ilvl w:val="0"/>
+          <w:numId w:val="1006"/>
+        </w:numPr>
+        <w:pStyle w:val="Compact"/>
+      </w:pPr>
+      <w:r>
+        <w:t xml:space="preserve">Default weights retained for pilot comparison:</w:t>
+      </w:r>
+      <w:r>
+        <w:t xml:space="preserve"> </w:t>
+      </w:r>
+      <w:r>
+        <w:rPr>
+          <w:rStyle w:val="VerbatimChar"/>
+        </w:rPr>
+        <w:t xml:space="preserve">α=0.30, β=0.20, γ=0.25, δ=0.15, ε=0.10</w:t>
+      </w:r>
+      <w:r>
+        <w:t xml:space="preserve">; every component is clamped</w:t>
+      </w:r>
+      <w:r>
+        <w:t xml:space="preserve"> </w:t>
+      </w:r>
+      <w:r>
+        <w:rPr>
+          <w:rStyle w:val="VerbatimChar"/>
+        </w:rPr>
+        <w:t xml:space="preserve">Clamp(x) = max(0, min(1, x))</w:t>
+      </w:r>
+      <w:r>
+        <w:t xml:space="preserve">.</w:t>
+      </w:r>
+      <w:r>
+        <w:t xml:space="preserve"> </w:t>
+      </w:r>
+      <w:r>
+        <w:rPr>
+          <w:rStyle w:val="VerbatimChar"/>
+        </w:rPr>
+        <w:t xml:space="preserve">[Assumed]</w:t>
+      </w:r>
+    </w:p>
+    <w:p>
+      <w:pPr>
+        <w:numPr>
+          <w:ilvl w:val="0"/>
+          <w:numId w:val="1006"/>
+        </w:numPr>
+        <w:pStyle w:val="Compact"/>
+      </w:pPr>
+      <w:r>
+        <w:t xml:space="preserve">To avoid double-counting the same signal under α and δ, the CVAL/NonProd formula is proposed as</w:t>
+      </w:r>
+      <w:r>
+        <w:t xml:space="preserve"> </w:t>
+      </w:r>
+      <w:r>
+        <w:rPr>
+          <w:rStyle w:val="VerbatimChar"/>
+        </w:rPr>
+        <w:t xml:space="preserve">PS_NonProd = 0.35·Capacity + 0.25·Quota + 0.25·Distribution + 0.05·DR_Overflow_Integrity + 0.10·Zones</w:t>
+      </w:r>
+      <w:r>
+        <w:t xml:space="preserve">.</w:t>
+      </w:r>
+      <w:r>
+        <w:t xml:space="preserve"> </w:t>
+      </w:r>
+      <w:r>
+        <w:rPr>
+          <w:rStyle w:val="VerbatimChar"/>
+        </w:rPr>
+        <w:t xml:space="preserve">[Undocumented — §28]</w:t>
+      </w:r>
+    </w:p>
+    <w:p>
+      <w:pPr>
+        <w:numPr>
+          <w:ilvl w:val="0"/>
+          <w:numId w:val="1006"/>
+        </w:numPr>
+        <w:pStyle w:val="Compact"/>
+      </w:pPr>
+      <w:r>
+        <w:t xml:space="preserve">Distribution uses</w:t>
+      </w:r>
+      <w:r>
+        <w:t xml:space="preserve"> </w:t>
+      </w:r>
+      <w:r>
+        <w:rPr>
+          <w:bCs/>
+          <w:b/>
+        </w:rPr>
+        <w:t xml:space="preserve">demand units, not customer count</w:t>
+      </w:r>
+      <w:r>
+        <w:t xml:space="preserve">:</w:t>
+      </w:r>
+      <w:r>
+        <w:t xml:space="preserve"> </w:t>
+      </w:r>
+      <w:r>
+        <w:rPr>
+          <w:rStyle w:val="VerbatimChar"/>
+        </w:rPr>
+        <w:t xml:space="preserve">Distribution = 1 − Region_Assigned_Demand / Total_Assigned_Demand</w:t>
+      </w:r>
+      <w:r>
+        <w:t xml:space="preserve">.</w:t>
+      </w:r>
+      <w:r>
+        <w:t xml:space="preserve"> </w:t>
+      </w:r>
+      <w:r>
+        <w:rPr>
+          <w:rStyle w:val="VerbatimChar"/>
+        </w:rPr>
+        <w:t xml:space="preserve">[Undocumented — §28]</w:t>
+      </w:r>
+    </w:p>
+    <w:p>
+      <w:pPr>
+        <w:numPr>
+          <w:ilvl w:val="0"/>
+          <w:numId w:val="1006"/>
+        </w:numPr>
+        <w:pStyle w:val="Compact"/>
+      </w:pPr>
+      <w:r>
+        <w:t xml:space="preserve">Revised weights are proposed, not empirically validated — advisory until pilot measurement.</w:t>
+      </w:r>
+    </w:p>
+    <w:bookmarkEnd w:id="27"/>
+    <w:bookmarkStart w:id="28" w:name="governance-compliance-controls"/>
+    <w:p>
+      <w:pPr>
+        <w:pStyle w:val="Heading4"/>
+      </w:pPr>
+      <w:r>
+        <w:t xml:space="preserve">Governance &amp; Compliance Controls</w:t>
+      </w:r>
+    </w:p>
+    <w:p>
+      <w:pPr>
+        <w:numPr>
+          <w:ilvl w:val="0"/>
+          <w:numId w:val="1007"/>
+        </w:numPr>
+        <w:pStyle w:val="Compact"/>
+      </w:pPr>
+      <w:r>
+        <w:t xml:space="preserve">The classification list lives in</w:t>
+      </w:r>
+      <w:r>
+        <w:t xml:space="preserve"> </w:t>
+      </w:r>
+      <w:r>
+        <w:rPr>
+          <w:rStyle w:val="VerbatimChar"/>
+        </w:rPr>
+        <w:t xml:space="preserve">PlacementPolicy</w:t>
+      </w:r>
+      <w:r>
+        <w:t xml:space="preserve">; any change requires a policy-version increment, a Decision Log entry, and</w:t>
+      </w:r>
+      <w:r>
+        <w:t xml:space="preserve"> </w:t>
+      </w:r>
+      <w:r>
+        <w:rPr>
+          <w:bCs/>
+          <w:b/>
+        </w:rPr>
+        <w:t xml:space="preserve">replay of the prior 30 days of placements</w:t>
+      </w:r>
+      <w:r>
+        <w:t xml:space="preserve"> </w:t>
+      </w:r>
+      <w:r>
+        <w:t xml:space="preserve">against the new classification before activation.</w:t>
+      </w:r>
+      <w:r>
+        <w:t xml:space="preserve"> </w:t>
+      </w:r>
+      <w:r>
+        <w:rPr>
+          <w:rStyle w:val="VerbatimChar"/>
+        </w:rPr>
+        <w:t xml:space="preserve">[Documented — §27]</w:t>
+      </w:r>
+    </w:p>
+    <w:p>
+      <w:pPr>
+        <w:numPr>
+          <w:ilvl w:val="0"/>
+          <w:numId w:val="1007"/>
+        </w:numPr>
+        <w:pStyle w:val="Compact"/>
+      </w:pPr>
+      <w:r>
+        <w:t xml:space="preserve">Exception approval records are revocable engine artefacts; a revoked approval blocks future exception deployments for the customer–region pair with no code change.</w:t>
+      </w:r>
+    </w:p>
+    <w:p>
+      <w:pPr>
+        <w:numPr>
+          <w:ilvl w:val="0"/>
+          <w:numId w:val="1007"/>
+        </w:numPr>
+        <w:pStyle w:val="Compact"/>
+      </w:pPr>
+      <w:r>
+        <w:t xml:space="preserve">Every classification change is audited with approver identity, timestamp, previous/new classification, and affected geography.</w:t>
+      </w:r>
+    </w:p>
+    <w:p>
+      <w:pPr>
+        <w:numPr>
+          <w:ilvl w:val="0"/>
+          <w:numId w:val="1007"/>
+        </w:numPr>
+        <w:pStyle w:val="Compact"/>
+      </w:pPr>
+      <w:r>
+        <w:t xml:space="preserve">Belgium Central’s regional capacity-planning targets must include potential Middle East DR demand on top of in-geo Europe demand.</w:t>
+      </w:r>
+    </w:p>
+    <w:bookmarkEnd w:id="28"/>
+    <w:bookmarkEnd w:id="29"/>
+    <w:bookmarkStart w:id="30" w:name="consequences"/>
     <w:p>
       <w:pPr>
         <w:pStyle w:val="Heading3"/>
@@ -1449,8 +2971,8 @@
         <w:t xml:space="preserve">- CRG_Score (RCW) is demoted from a primary scoring input to a monitoring-only signal (D9).</w:t>
       </w:r>
     </w:p>
-    <w:bookmarkEnd w:id="23"/>
-    <w:bookmarkStart w:id="24" w:name="alternatives-considered"/>
+    <w:bookmarkEnd w:id="30"/>
+    <w:bookmarkStart w:id="31" w:name="alternatives-considered"/>
     <w:p>
       <w:pPr>
         <w:pStyle w:val="Heading3"/>
@@ -1668,9 +3190,9 @@
         </w:pict>
       </w:r>
     </w:p>
-    <w:bookmarkEnd w:id="24"/>
-    <w:bookmarkEnd w:id="25"/>
-    <w:bookmarkStart w:id="30" w:name="adr-002-quota-and-capacity-management"/>
+    <w:bookmarkEnd w:id="31"/>
+    <w:bookmarkEnd w:id="32"/>
+    <w:bookmarkStart w:id="40" w:name="adr-002-quota-and-capacity-management"/>
     <w:p>
       <w:pPr>
         <w:pStyle w:val="Heading2"/>
@@ -1785,7 +3307,7 @@
         <w:t xml:space="preserve">QG-1..QG-12</w:t>
       </w:r>
     </w:p>
-    <w:bookmarkStart w:id="26" w:name="context-1"/>
+    <w:bookmarkStart w:id="33" w:name="context-1"/>
     <w:p>
       <w:pPr>
         <w:pStyle w:val="Heading3"/>
@@ -1806,7 +3328,7 @@
       <w:pPr>
         <w:numPr>
           <w:ilvl w:val="0"/>
-          <w:numId w:val="1005"/>
+          <w:numId w:val="1008"/>
         </w:numPr>
         <w:pStyle w:val="Compact"/>
       </w:pPr>
@@ -1818,7 +3340,7 @@
       <w:pPr>
         <w:numPr>
           <w:ilvl w:val="0"/>
-          <w:numId w:val="1005"/>
+          <w:numId w:val="1008"/>
         </w:numPr>
         <w:pStyle w:val="Compact"/>
       </w:pPr>
@@ -1846,7 +3368,7 @@
       <w:pPr>
         <w:numPr>
           <w:ilvl w:val="0"/>
-          <w:numId w:val="1005"/>
+          <w:numId w:val="1008"/>
         </w:numPr>
         <w:pStyle w:val="Compact"/>
       </w:pPr>
@@ -1858,7 +3380,7 @@
       <w:pPr>
         <w:numPr>
           <w:ilvl w:val="0"/>
-          <w:numId w:val="1005"/>
+          <w:numId w:val="1008"/>
         </w:numPr>
         <w:pStyle w:val="Compact"/>
       </w:pPr>
@@ -1906,8 +3428,8 @@
         <w:t xml:space="preserve">natively support intra-group sub-reservations — so any sub-partition of a group pool must be enforced by the engine.</w:t>
       </w:r>
     </w:p>
-    <w:bookmarkEnd w:id="26"/>
-    <w:bookmarkStart w:id="27" w:name="decision-1"/>
+    <w:bookmarkEnd w:id="33"/>
+    <w:bookmarkStart w:id="37" w:name="decision-1"/>
     <w:p>
       <w:pPr>
         <w:pStyle w:val="Heading3"/>
@@ -1941,7 +3463,7 @@
       <w:pPr>
         <w:numPr>
           <w:ilvl w:val="0"/>
-          <w:numId w:val="1006"/>
+          <w:numId w:val="1009"/>
         </w:numPr>
       </w:pPr>
       <w:r>
@@ -2027,7 +3549,7 @@
       <w:pPr>
         <w:numPr>
           <w:ilvl w:val="0"/>
-          <w:numId w:val="1006"/>
+          <w:numId w:val="1009"/>
         </w:numPr>
       </w:pPr>
       <w:r>
@@ -2132,7 +3654,7 @@
       <w:pPr>
         <w:numPr>
           <w:ilvl w:val="0"/>
-          <w:numId w:val="1006"/>
+          <w:numId w:val="1009"/>
         </w:numPr>
       </w:pPr>
       <w:r>
@@ -2147,7 +3669,7 @@
       <w:pPr>
         <w:numPr>
           <w:ilvl w:val="1"/>
-          <w:numId w:val="1007"/>
+          <w:numId w:val="1010"/>
         </w:numPr>
         <w:pStyle w:val="Compact"/>
       </w:pPr>
@@ -2181,7 +3703,7 @@
       <w:pPr>
         <w:numPr>
           <w:ilvl w:val="1"/>
-          <w:numId w:val="1007"/>
+          <w:numId w:val="1010"/>
         </w:numPr>
         <w:pStyle w:val="Compact"/>
       </w:pPr>
@@ -2239,7 +3761,7 @@
       <w:pPr>
         <w:numPr>
           <w:ilvl w:val="1"/>
-          <w:numId w:val="1007"/>
+          <w:numId w:val="1010"/>
         </w:numPr>
         <w:pStyle w:val="Compact"/>
       </w:pPr>
@@ -2301,7 +3823,7 @@
       <w:pPr>
         <w:numPr>
           <w:ilvl w:val="0"/>
-          <w:numId w:val="1006"/>
+          <w:numId w:val="1009"/>
         </w:numPr>
       </w:pPr>
       <w:r>
@@ -2331,7 +3853,7 @@
       <w:pPr>
         <w:numPr>
           <w:ilvl w:val="0"/>
-          <w:numId w:val="1006"/>
+          <w:numId w:val="1009"/>
         </w:numPr>
       </w:pPr>
       <w:r>
@@ -2378,8 +3900,437 @@
         <w:t xml:space="preserve">Prod group 128 vCPU; NonProd+DR group 80 vCPU; DR floor 32 vCPU → effective NonProd ceiling 48 vCPU.</w:t>
       </w:r>
     </w:p>
-    <w:bookmarkEnd w:id="27"/>
-    <w:bookmarkStart w:id="28" w:name="consequences-1"/>
+    <w:bookmarkStart w:id="34" w:name="group-accounting-formulas-normative"/>
+    <w:p>
+      <w:pPr>
+        <w:pStyle w:val="Heading4"/>
+      </w:pPr>
+      <w:r>
+        <w:t xml:space="preserve">Group Accounting Formulas (normative)</w:t>
+      </w:r>
+    </w:p>
+    <w:p>
+      <w:pPr>
+        <w:pStyle w:val="FirstParagraph"/>
+      </w:pPr>
+      <w:r>
+        <w:t xml:space="preserve">All four are</w:t>
+      </w:r>
+      <w:r>
+        <w:t xml:space="preserve"> </w:t>
+      </w:r>
+      <w:r>
+        <w:rPr>
+          <w:bCs/>
+          <w:b/>
+        </w:rPr>
+        <w:t xml:space="preserve">engine accounting controls</w:t>
+      </w:r>
+      <w:r>
+        <w:t xml:space="preserve"> </w:t>
+      </w:r>
+      <w:r>
+        <w:t xml:space="preserve">— they do not create a native Azure sub-reservation:</w:t>
+      </w:r>
+      <w:r>
+        <w:t xml:space="preserve"> </w:t>
+      </w:r>
+      <w:r>
+        <w:rPr>
+          <w:rStyle w:val="VerbatimChar"/>
+        </w:rPr>
+        <w:t xml:space="preserve">[Documented — §26]</w:t>
+      </w:r>
+    </w:p>
+    <w:p>
+      <w:pPr>
+        <w:pStyle w:val="SourceCode"/>
+      </w:pPr>
+      <w:r>
+        <w:rPr>
+          <w:rStyle w:val="VerbatimChar"/>
+        </w:rPr>
+        <w:t xml:space="preserve">DR_Floor_vCPU             = Potential_DR_Demand × vCPU_Per_Instance × DR_Ratio_Max</w:t>
+      </w:r>
+      <w:r>
+        <w:br/>
+      </w:r>
+      <w:r>
+        <w:rPr>
+          <w:rStyle w:val="VerbatimChar"/>
+        </w:rPr>
+        <w:t xml:space="preserve">Effective_NonProd_Ceiling = NonProd_DR_Group_Limit − DR_Floor_vCPU</w:t>
+      </w:r>
+      <w:r>
+        <w:br/>
+      </w:r>
+      <w:r>
+        <w:rPr>
+          <w:rStyle w:val="VerbatimChar"/>
+        </w:rPr>
+        <w:t xml:space="preserve">NonProd_Headroom          = Effective_NonProd_Ceiling − NonProd_Used_vCPU</w:t>
+      </w:r>
+      <w:r>
+        <w:br/>
+      </w:r>
+      <w:r>
+        <w:rPr>
+          <w:rStyle w:val="VerbatimChar"/>
+        </w:rPr>
+        <w:t xml:space="preserve">Group_Headroom            = Group_Limit − Group_Used</w:t>
+      </w:r>
+    </w:p>
+    <w:bookmarkEnd w:id="34"/>
+    <w:bookmarkStart w:id="35" w:name="exact-enforcement-controls"/>
+    <w:p>
+      <w:pPr>
+        <w:pStyle w:val="Heading4"/>
+      </w:pPr>
+      <w:r>
+        <w:t xml:space="preserve">Exact Enforcement Controls</w:t>
+      </w:r>
+    </w:p>
+    <w:p>
+      <w:pPr>
+        <w:numPr>
+          <w:ilvl w:val="0"/>
+          <w:numId w:val="1011"/>
+        </w:numPr>
+        <w:pStyle w:val="Compact"/>
+      </w:pPr>
+      <w:r>
+        <w:t xml:space="preserve">Every</w:t>
+      </w:r>
+      <w:r>
+        <w:t xml:space="preserve"> </w:t>
+      </w:r>
+      <w:r>
+        <w:rPr>
+          <w:bCs/>
+          <w:b/>
+        </w:rPr>
+        <w:t xml:space="preserve">NonProd</w:t>
+      </w:r>
+      <w:r>
+        <w:t xml:space="preserve"> </w:t>
+      </w:r>
+      <w:r>
+        <w:t xml:space="preserve">increase performs a group check</w:t>
+      </w:r>
+      <w:r>
+        <w:t xml:space="preserve"> </w:t>
+      </w:r>
+      <w:r>
+        <w:rPr>
+          <w:bCs/>
+          <w:b/>
+        </w:rPr>
+        <w:t xml:space="preserve">and</w:t>
+      </w:r>
+      <w:r>
+        <w:t xml:space="preserve"> </w:t>
+      </w:r>
+      <w:r>
+        <w:t xml:space="preserve">a subscription check.</w:t>
+      </w:r>
+      <w:r>
+        <w:t xml:space="preserve"> </w:t>
+      </w:r>
+      <w:r>
+        <w:rPr>
+          <w:rStyle w:val="VerbatimChar"/>
+        </w:rPr>
+        <w:t xml:space="preserve">[Documented — §26]</w:t>
+      </w:r>
+    </w:p>
+    <w:p>
+      <w:pPr>
+        <w:numPr>
+          <w:ilvl w:val="0"/>
+          <w:numId w:val="1011"/>
+        </w:numPr>
+        <w:pStyle w:val="Compact"/>
+      </w:pPr>
+      <w:r>
+        <w:t xml:space="preserve">Every</w:t>
+      </w:r>
+      <w:r>
+        <w:t xml:space="preserve"> </w:t>
+      </w:r>
+      <w:r>
+        <w:rPr>
+          <w:bCs/>
+          <w:b/>
+        </w:rPr>
+        <w:t xml:space="preserve">DR</w:t>
+      </w:r>
+      <w:r>
+        <w:t xml:space="preserve"> </w:t>
+      </w:r>
+      <w:r>
+        <w:t xml:space="preserve">increase performs a group check, subscription check, SKU check, capacity check,</w:t>
+      </w:r>
+      <w:r>
+        <w:t xml:space="preserve"> </w:t>
+      </w:r>
+      <w:r>
+        <w:rPr>
+          <w:bCs/>
+          <w:b/>
+        </w:rPr>
+        <w:t xml:space="preserve">and</w:t>
+      </w:r>
+      <w:r>
+        <w:t xml:space="preserve"> </w:t>
+      </w:r>
+      <w:r>
+        <w:t xml:space="preserve">active-incident check.</w:t>
+      </w:r>
+    </w:p>
+    <w:p>
+      <w:pPr>
+        <w:numPr>
+          <w:ilvl w:val="0"/>
+          <w:numId w:val="1011"/>
+        </w:numPr>
+        <w:pStyle w:val="Compact"/>
+      </w:pPr>
+      <w:r>
+        <w:t xml:space="preserve">A</w:t>
+      </w:r>
+      <w:r>
+        <w:t xml:space="preserve"> </w:t>
+      </w:r>
+      <w:r>
+        <w:rPr>
+          <w:bCs/>
+          <w:b/>
+        </w:rPr>
+        <w:t xml:space="preserve">separate detector</w:t>
+      </w:r>
+      <w:r>
+        <w:t xml:space="preserve"> </w:t>
+      </w:r>
+      <w:r>
+        <w:t xml:space="preserve">recalculates the DR floor from authoritative assignment/allocation data. Any disagreement between the command-time and detector calculations</w:t>
+      </w:r>
+      <w:r>
+        <w:t xml:space="preserve"> </w:t>
+      </w:r>
+      <w:r>
+        <w:rPr>
+          <w:bCs/>
+          <w:b/>
+        </w:rPr>
+        <w:t xml:space="preserve">disables automatic NonProd expansion</w:t>
+      </w:r>
+      <w:r>
+        <w:t xml:space="preserve"> </w:t>
+      </w:r>
+      <w:r>
+        <w:t xml:space="preserve">(fail-safe) and raises</w:t>
+      </w:r>
+      <w:r>
+        <w:t xml:space="preserve"> </w:t>
+      </w:r>
+      <w:r>
+        <w:rPr>
+          <w:rStyle w:val="VerbatimChar"/>
+        </w:rPr>
+        <w:t xml:space="preserve">DRFloorViolationDetected</w:t>
+      </w:r>
+      <w:r>
+        <w:t xml:space="preserve">.</w:t>
+      </w:r>
+    </w:p>
+    <w:p>
+      <w:pPr>
+        <w:numPr>
+          <w:ilvl w:val="0"/>
+          <w:numId w:val="1011"/>
+        </w:numPr>
+        <w:pStyle w:val="Compact"/>
+      </w:pPr>
+      <w:r>
+        <w:t xml:space="preserve">Group propagation is</w:t>
+      </w:r>
+      <w:r>
+        <w:t xml:space="preserve"> </w:t>
+      </w:r>
+      <w:r>
+        <w:rPr>
+          <w:bCs/>
+          <w:b/>
+        </w:rPr>
+        <w:t xml:space="preserve">polled</w:t>
+      </w:r>
+      <w:r>
+        <w:t xml:space="preserve"> </w:t>
+      </w:r>
+      <w:r>
+        <w:t xml:space="preserve">— no fixed propagation SLA is assumed.</w:t>
+      </w:r>
+    </w:p>
+    <w:bookmarkEnd w:id="35"/>
+    <w:bookmarkStart w:id="36" w:name="grouptype-preview-dependency-fc-11"/>
+    <w:p>
+      <w:pPr>
+        <w:pStyle w:val="Heading4"/>
+      </w:pPr>
+      <w:r>
+        <w:rPr>
+          <w:rStyle w:val="VerbatimChar"/>
+        </w:rPr>
+        <w:t xml:space="preserve">groupType</w:t>
+      </w:r>
+      <w:r>
+        <w:t xml:space="preserve"> </w:t>
+      </w:r>
+      <w:r>
+        <w:t xml:space="preserve">Preview Dependency (FC-11)</w:t>
+      </w:r>
+    </w:p>
+    <w:p>
+      <w:pPr>
+        <w:pStyle w:val="FirstParagraph"/>
+      </w:pPr>
+      <w:r>
+        <w:t xml:space="preserve">The Quota-Group</w:t>
+      </w:r>
+      <w:r>
+        <w:t xml:space="preserve"> </w:t>
+      </w:r>
+      <w:r>
+        <w:rPr>
+          <w:rStyle w:val="VerbatimChar"/>
+        </w:rPr>
+        <w:t xml:space="preserve">groupType</w:t>
+      </w:r>
+      <w:r>
+        <w:t xml:space="preserve"> </w:t>
+      </w:r>
+      <w:r>
+        <w:t xml:space="preserve">property (</w:t>
+      </w:r>
+      <w:r>
+        <w:rPr>
+          <w:rStyle w:val="VerbatimChar"/>
+        </w:rPr>
+        <w:t xml:space="preserve">AllocationGroup</w:t>
+      </w:r>
+      <w:r>
+        <w:t xml:space="preserve"> </w:t>
+      </w:r>
+      <w:r>
+        <w:t xml:space="preserve">= advisory vs</w:t>
+      </w:r>
+      <w:r>
+        <w:t xml:space="preserve"> </w:t>
+      </w:r>
+      <w:r>
+        <w:rPr>
+          <w:rStyle w:val="VerbatimChar"/>
+        </w:rPr>
+        <w:t xml:space="preserve">EnforcedGroup</w:t>
+      </w:r>
+      <w:r>
+        <w:t xml:space="preserve"> </w:t>
+      </w:r>
+      <w:r>
+        <w:t xml:space="preserve">= enforced) is</w:t>
+      </w:r>
+      <w:r>
+        <w:t xml:space="preserve"> </w:t>
+      </w:r>
+      <w:r>
+        <w:rPr>
+          <w:bCs/>
+          <w:b/>
+        </w:rPr>
+        <w:t xml:space="preserve">preview-only</w:t>
+      </w:r>
+      <w:r>
+        <w:t xml:space="preserve"> </w:t>
+      </w:r>
+      <w:r>
+        <w:t xml:space="preserve">in the Azure Quota REST API and is not GA.</w:t>
+      </w:r>
+      <w:r>
+        <w:t xml:space="preserve"> </w:t>
+      </w:r>
+      <w:r>
+        <w:rPr>
+          <w:rStyle w:val="VerbatimChar"/>
+        </w:rPr>
+        <w:t xml:space="preserve">[Documented — Azure Quota REST API reference]</w:t>
+      </w:r>
+      <w:r>
+        <w:t xml:space="preserve"> </w:t>
+      </w:r>
+      <w:r>
+        <w:t xml:space="preserve">The engine’s accounting controls are deliberately</w:t>
+      </w:r>
+      <w:r>
+        <w:t xml:space="preserve"> </w:t>
+      </w:r>
+      <w:r>
+        <w:rPr>
+          <w:bCs/>
+          <w:b/>
+        </w:rPr>
+        <w:t xml:space="preserve">engine-level and do not depend on</w:t>
+      </w:r>
+      <w:r>
+        <w:rPr>
+          <w:bCs/>
+          <w:b/>
+        </w:rPr>
+        <w:t xml:space="preserve"> </w:t>
+      </w:r>
+      <w:r>
+        <w:rPr>
+          <w:rStyle w:val="VerbatimChar"/>
+          <w:bCs/>
+          <w:b/>
+        </w:rPr>
+        <w:t xml:space="preserve">groupType</w:t>
+      </w:r>
+      <w:r>
+        <w:rPr>
+          <w:bCs/>
+          <w:b/>
+        </w:rPr>
+        <w:t xml:space="preserve"> </w:t>
+      </w:r>
+      <w:r>
+        <w:rPr>
+          <w:bCs/>
+          <w:b/>
+        </w:rPr>
+        <w:t xml:space="preserve">enforcement</w:t>
+      </w:r>
+      <w:r>
+        <w:t xml:space="preserve">. If</w:t>
+      </w:r>
+      <w:r>
+        <w:t xml:space="preserve"> </w:t>
+      </w:r>
+      <w:r>
+        <w:rPr>
+          <w:rStyle w:val="VerbatimChar"/>
+        </w:rPr>
+        <w:t xml:space="preserve">EnforcedGroup</w:t>
+      </w:r>
+      <w:r>
+        <w:t xml:space="preserve"> </w:t>
+      </w:r>
+      <w:r>
+        <w:t xml:space="preserve">is ever relied upon to drop the engine’s own subscription-level check, that dependency must pass the preview-acceptance gate (POC-30) and a Decision Log entry first. Engineering constraint: pin the exact preview API version in all quota-group calls and add version-drift detection to the platform health check.</w:t>
+      </w:r>
+    </w:p>
+    <w:bookmarkEnd w:id="36"/>
+    <w:bookmarkEnd w:id="37"/>
+    <w:bookmarkStart w:id="38" w:name="consequences-1"/>
     <w:p>
       <w:pPr>
         <w:pStyle w:val="Heading3"/>
@@ -2586,8 +4537,8 @@
         <w:t xml:space="preserve">returns 404 in the target tenant/region, escalate to Azure Support.</w:t>
       </w:r>
     </w:p>
-    <w:bookmarkEnd w:id="28"/>
-    <w:bookmarkStart w:id="29" w:name="alternatives-considered-1"/>
+    <w:bookmarkEnd w:id="38"/>
+    <w:bookmarkStart w:id="39" w:name="alternatives-considered-1"/>
     <w:p>
       <w:pPr>
         <w:pStyle w:val="Heading3"/>
@@ -2817,9 +4768,9 @@
         </w:pict>
       </w:r>
     </w:p>
-    <w:bookmarkEnd w:id="29"/>
-    <w:bookmarkEnd w:id="30"/>
-    <w:bookmarkStart w:id="35" w:name="Xb03910cb3c9a0c0ecb9b813c5fa342521392efc"/>
+    <w:bookmarkEnd w:id="39"/>
+    <w:bookmarkEnd w:id="40"/>
+    <w:bookmarkStart w:id="48" w:name="Xb03910cb3c9a0c0ecb9b813c5fa342521392efc"/>
     <w:p>
       <w:pPr>
         <w:pStyle w:val="Heading2"/>
@@ -2934,7 +4885,7 @@
         <w:t xml:space="preserve">§29</w:t>
       </w:r>
     </w:p>
-    <w:bookmarkStart w:id="31" w:name="context-2"/>
+    <w:bookmarkStart w:id="41" w:name="context-2"/>
     <w:p>
       <w:pPr>
         <w:pStyle w:val="Heading3"/>
@@ -3003,8 +4954,8 @@
         <w:t xml:space="preserve">- A safe, tiered escalation model for expanding DR capacity during a declared event.</w:t>
       </w:r>
     </w:p>
-    <w:bookmarkEnd w:id="31"/>
-    <w:bookmarkStart w:id="32" w:name="decision-2"/>
+    <w:bookmarkEnd w:id="41"/>
+    <w:bookmarkStart w:id="45" w:name="decision-2"/>
     <w:p>
       <w:pPr>
         <w:pStyle w:val="Heading3"/>
@@ -3064,7 +5015,7 @@
       <w:pPr>
         <w:numPr>
           <w:ilvl w:val="0"/>
-          <w:numId w:val="1008"/>
+          <w:numId w:val="1012"/>
         </w:numPr>
       </w:pPr>
       <w:r>
@@ -3121,7 +5072,7 @@
       <w:pPr>
         <w:numPr>
           <w:ilvl w:val="1"/>
-          <w:numId w:val="1009"/>
+          <w:numId w:val="1013"/>
         </w:numPr>
       </w:pPr>
       <w:r>
@@ -3157,7 +5108,7 @@
       <w:pPr>
         <w:numPr>
           <w:ilvl w:val="1"/>
-          <w:numId w:val="1009"/>
+          <w:numId w:val="1013"/>
         </w:numPr>
       </w:pPr>
       <w:r>
@@ -3178,7 +5129,7 @@
       <w:pPr>
         <w:numPr>
           <w:ilvl w:val="0"/>
-          <w:numId w:val="1008"/>
+          <w:numId w:val="1012"/>
         </w:numPr>
       </w:pPr>
       <w:r>
@@ -3224,7 +5175,7 @@
       <w:pPr>
         <w:numPr>
           <w:ilvl w:val="1"/>
-          <w:numId w:val="1010"/>
+          <w:numId w:val="1014"/>
         </w:numPr>
         <w:pStyle w:val="Compact"/>
       </w:pPr>
@@ -3278,7 +5229,7 @@
       <w:pPr>
         <w:numPr>
           <w:ilvl w:val="1"/>
-          <w:numId w:val="1010"/>
+          <w:numId w:val="1014"/>
         </w:numPr>
         <w:pStyle w:val="Compact"/>
       </w:pPr>
@@ -3338,7 +5289,7 @@
       <w:pPr>
         <w:numPr>
           <w:ilvl w:val="0"/>
-          <w:numId w:val="1008"/>
+          <w:numId w:val="1012"/>
         </w:numPr>
       </w:pPr>
       <w:r>
@@ -3362,7 +5313,7 @@
       <w:pPr>
         <w:numPr>
           <w:ilvl w:val="1"/>
-          <w:numId w:val="1011"/>
+          <w:numId w:val="1015"/>
         </w:numPr>
         <w:pStyle w:val="Compact"/>
       </w:pPr>
@@ -3384,7 +5335,7 @@
       <w:pPr>
         <w:numPr>
           <w:ilvl w:val="1"/>
-          <w:numId w:val="1011"/>
+          <w:numId w:val="1015"/>
         </w:numPr>
         <w:pStyle w:val="Compact"/>
       </w:pPr>
@@ -3438,7 +5389,7 @@
       <w:pPr>
         <w:numPr>
           <w:ilvl w:val="1"/>
-          <w:numId w:val="1011"/>
+          <w:numId w:val="1015"/>
         </w:numPr>
         <w:pStyle w:val="Compact"/>
       </w:pPr>
@@ -3475,7 +5426,7 @@
       <w:pPr>
         <w:numPr>
           <w:ilvl w:val="0"/>
-          <w:numId w:val="1008"/>
+          <w:numId w:val="1012"/>
         </w:numPr>
       </w:pPr>
       <w:r>
@@ -3523,7 +5474,7 @@
       <w:pPr>
         <w:numPr>
           <w:ilvl w:val="0"/>
-          <w:numId w:val="1008"/>
+          <w:numId w:val="1012"/>
         </w:numPr>
       </w:pPr>
       <w:r>
@@ -3607,7 +5558,7 @@
       <w:pPr>
         <w:numPr>
           <w:ilvl w:val="0"/>
-          <w:numId w:val="1008"/>
+          <w:numId w:val="1012"/>
         </w:numPr>
       </w:pPr>
       <w:r>
@@ -3640,8 +5591,451 @@
         <w:t xml:space="preserve">pending the G-14 consumer-credential model and G-15 engine-mode state machine. No invented SLA — propagation/approval times are measured and reported as unknown until observed.</w:t>
       </w:r>
     </w:p>
-    <w:bookmarkEnd w:id="32"/>
-    <w:bookmarkStart w:id="33" w:name="consequences-2"/>
+    <w:bookmarkStart w:id="42" w:name="full-engine-state-machine-normative"/>
+    <w:p>
+      <w:pPr>
+        <w:pStyle w:val="Heading4"/>
+      </w:pPr>
+      <w:r>
+        <w:t xml:space="preserve">Full Engine State Machine (normative)</w:t>
+      </w:r>
+    </w:p>
+    <w:p>
+      <w:pPr>
+        <w:pStyle w:val="FirstParagraph"/>
+      </w:pPr>
+      <w:r>
+        <w:rPr>
+          <w:rStyle w:val="VerbatimChar"/>
+        </w:rPr>
+        <w:t xml:space="preserve">engine_mode</w:t>
+      </w:r>
+      <w:r>
+        <w:t xml:space="preserve"> </w:t>
+      </w:r>
+      <w:r>
+        <w:t xml:space="preserve">is not a two-value flag but a</w:t>
+      </w:r>
+      <w:r>
+        <w:t xml:space="preserve"> </w:t>
+      </w:r>
+      <w:r>
+        <w:rPr>
+          <w:bCs/>
+          <w:b/>
+        </w:rPr>
+        <w:t xml:space="preserve">five-state machine</w:t>
+      </w:r>
+      <w:r>
+        <w:t xml:space="preserve"> </w:t>
+      </w:r>
+      <w:r>
+        <w:t xml:space="preserve">persisted in Cosmos DB with conditional writes, transition guards, and recovery tests — a production blocker until implemented (G-15):</w:t>
+      </w:r>
+      <w:r>
+        <w:t xml:space="preserve"> </w:t>
+      </w:r>
+      <w:r>
+        <w:rPr>
+          <w:rStyle w:val="VerbatimChar"/>
+        </w:rPr>
+        <w:t xml:space="preserve">[Documented — §29]</w:t>
+      </w:r>
+    </w:p>
+    <w:tbl>
+      <w:tblPr>
+        <w:tblStyle w:val="Table"/>
+        <w:tblW w:type="pct" w:w="5000"/>
+        <w:tblLook w:firstRow="1" w:lastRow="0" w:firstColumn="0" w:lastColumn="0" w:noHBand="0" w:noVBand="0" w:val="0020"/>
+      </w:tblPr>
+      <w:tblGrid>
+        <w:gridCol w:w="2640"/>
+        <w:gridCol w:w="2640"/>
+        <w:gridCol w:w="2640"/>
+      </w:tblGrid>
+      <w:tr>
+        <w:trPr>
+          <w:tblHeader w:val="true"/>
+        </w:trPr>
+        <w:tc>
+          <w:tcPr/>
+          <w:p>
+            <w:pPr>
+              <w:pStyle w:val="Compact"/>
+              <w:jc w:val="left"/>
+            </w:pPr>
+            <w:r>
+              <w:t xml:space="preserve">State</w:t>
+            </w:r>
+          </w:p>
+        </w:tc>
+        <w:tc>
+          <w:tcPr/>
+          <w:p>
+            <w:pPr>
+              <w:pStyle w:val="Compact"/>
+              <w:jc w:val="left"/>
+            </w:pPr>
+            <w:r>
+              <w:t xml:space="preserve">Meaning</w:t>
+            </w:r>
+          </w:p>
+        </w:tc>
+        <w:tc>
+          <w:tcPr/>
+          <w:p>
+            <w:pPr>
+              <w:pStyle w:val="Compact"/>
+              <w:jc w:val="left"/>
+            </w:pPr>
+            <w:r>
+              <w:t xml:space="preserve">Permitted transitions</w:t>
+            </w:r>
+          </w:p>
+        </w:tc>
+      </w:tr>
+      <w:tr>
+        <w:tc>
+          <w:tcPr/>
+          <w:p>
+            <w:pPr>
+              <w:pStyle w:val="Compact"/>
+              <w:jc w:val="left"/>
+            </w:pPr>
+            <w:r>
+              <w:rPr>
+                <w:bCs/>
+                <w:b/>
+              </w:rPr>
+              <w:t xml:space="preserve">STEADY_STATE</w:t>
+            </w:r>
+          </w:p>
+        </w:tc>
+        <w:tc>
+          <w:tcPr/>
+          <w:p>
+            <w:pPr>
+              <w:pStyle w:val="Compact"/>
+              <w:jc w:val="left"/>
+            </w:pPr>
+            <w:r>
+              <w:t xml:space="preserve">Organic growth only; Emergency Transfer rejected</w:t>
+            </w:r>
+          </w:p>
+        </w:tc>
+        <w:tc>
+          <w:tcPr/>
+          <w:p>
+            <w:pPr>
+              <w:pStyle w:val="Compact"/>
+              <w:jc w:val="left"/>
+            </w:pPr>
+            <w:r>
+              <w:t xml:space="preserve">→ DR_DECLARATION_PENDING</w:t>
+            </w:r>
+          </w:p>
+        </w:tc>
+      </w:tr>
+      <w:tr>
+        <w:tc>
+          <w:tcPr/>
+          <w:p>
+            <w:pPr>
+              <w:pStyle w:val="Compact"/>
+              <w:jc w:val="left"/>
+            </w:pPr>
+            <w:r>
+              <w:rPr>
+                <w:bCs/>
+                <w:b/>
+              </w:rPr>
+              <w:t xml:space="preserve">DR_DECLARATION_PENDING</w:t>
+            </w:r>
+          </w:p>
+        </w:tc>
+        <w:tc>
+          <w:tcPr/>
+          <w:p>
+            <w:pPr>
+              <w:pStyle w:val="Compact"/>
+              <w:jc w:val="left"/>
+            </w:pPr>
+            <w:r>
+              <w:t xml:space="preserve">DR requested, awaiting dual approval + validation</w:t>
+            </w:r>
+          </w:p>
+        </w:tc>
+        <w:tc>
+          <w:tcPr/>
+          <w:p>
+            <w:pPr>
+              <w:pStyle w:val="Compact"/>
+              <w:jc w:val="left"/>
+            </w:pPr>
+            <w:r>
+              <w:t xml:space="preserve">→ DR_EVENT_ACTIVE (approved) · → STEADY_STATE (rejected/expired)</w:t>
+            </w:r>
+          </w:p>
+        </w:tc>
+      </w:tr>
+      <w:tr>
+        <w:tc>
+          <w:tcPr/>
+          <w:p>
+            <w:pPr>
+              <w:pStyle w:val="Compact"/>
+              <w:jc w:val="left"/>
+            </w:pPr>
+            <w:r>
+              <w:rPr>
+                <w:bCs/>
+                <w:b/>
+              </w:rPr>
+              <w:t xml:space="preserve">DR_EVENT_ACTIVE</w:t>
+            </w:r>
+          </w:p>
+        </w:tc>
+        <w:tc>
+          <w:tcPr/>
+          <w:p>
+            <w:pPr>
+              <w:pStyle w:val="Compact"/>
+              <w:jc w:val="left"/>
+            </w:pPr>
+            <w:r>
+              <w:t xml:space="preserve">Crisis operations only; auto-increase suppressed</w:t>
+            </w:r>
+          </w:p>
+        </w:tc>
+        <w:tc>
+          <w:tcPr/>
+          <w:p>
+            <w:pPr>
+              <w:pStyle w:val="Compact"/>
+              <w:jc w:val="left"/>
+            </w:pPr>
+            <w:r>
+              <w:t xml:space="preserve">→ FAILBACK_PENDING · → INCIDENT_HOLD</w:t>
+            </w:r>
+          </w:p>
+        </w:tc>
+      </w:tr>
+      <w:tr>
+        <w:tc>
+          <w:tcPr/>
+          <w:p>
+            <w:pPr>
+              <w:pStyle w:val="Compact"/>
+              <w:jc w:val="left"/>
+            </w:pPr>
+            <w:r>
+              <w:rPr>
+                <w:bCs/>
+                <w:b/>
+              </w:rPr>
+              <w:t xml:space="preserve">FAILBACK_PENDING</w:t>
+            </w:r>
+          </w:p>
+        </w:tc>
+        <w:tc>
+          <w:tcPr/>
+          <w:p>
+            <w:pPr>
+              <w:pStyle w:val="Compact"/>
+              <w:jc w:val="left"/>
+            </w:pPr>
+            <w:r>
+              <w:t xml:space="preserve">Failback requested, being validated</w:t>
+            </w:r>
+          </w:p>
+        </w:tc>
+        <w:tc>
+          <w:tcPr/>
+          <w:p>
+            <w:pPr>
+              <w:pStyle w:val="Compact"/>
+              <w:jc w:val="left"/>
+            </w:pPr>
+            <w:r>
+              <w:t xml:space="preserve">→ STEADY_STATE (completed) · → DR_EVENT_ACTIVE (validation failed) · → INCIDENT_HOLD</w:t>
+            </w:r>
+          </w:p>
+        </w:tc>
+      </w:tr>
+      <w:tr>
+        <w:tc>
+          <w:tcPr/>
+          <w:p>
+            <w:pPr>
+              <w:pStyle w:val="Compact"/>
+              <w:jc w:val="left"/>
+            </w:pPr>
+            <w:r>
+              <w:rPr>
+                <w:bCs/>
+                <w:b/>
+              </w:rPr>
+              <w:t xml:space="preserve">INCIDENT_HOLD</w:t>
+            </w:r>
+          </w:p>
+        </w:tc>
+        <w:tc>
+          <w:tcPr/>
+          <w:p>
+            <w:pPr>
+              <w:pStyle w:val="Compact"/>
+              <w:jc w:val="left"/>
+            </w:pPr>
+            <w:r>
+              <w:t xml:space="preserve">State conflict / critical failure — safe hold</w:t>
+            </w:r>
+          </w:p>
+        </w:tc>
+        <w:tc>
+          <w:tcPr/>
+          <w:p>
+            <w:pPr>
+              <w:pStyle w:val="Compact"/>
+              <w:jc w:val="left"/>
+            </w:pPr>
+            <w:r>
+              <w:t xml:space="preserve">→ DR_EVENT_ACTIVE · → FAILBACK_PENDING (on recovery approval)</w:t>
+            </w:r>
+          </w:p>
+        </w:tc>
+      </w:tr>
+    </w:tbl>
+    <w:p>
+      <w:pPr>
+        <w:pStyle w:val="BodyText"/>
+      </w:pPr>
+      <w:r>
+        <w:t xml:space="preserve">All transitions are</w:t>
+      </w:r>
+      <w:r>
+        <w:t xml:space="preserve"> </w:t>
+      </w:r>
+      <w:r>
+        <w:rPr>
+          <w:bCs/>
+          <w:b/>
+        </w:rPr>
+        <w:t xml:space="preserve">operator-gated with dual approval</w:t>
+      </w:r>
+      <w:r>
+        <w:t xml:space="preserve"> </w:t>
+      </w:r>
+      <w:r>
+        <w:t xml:space="preserve">— never automatic.</w:t>
+      </w:r>
+    </w:p>
+    <w:bookmarkEnd w:id="42"/>
+    <w:bookmarkStart w:id="43" w:name="enginemodestate-entity"/>
+    <w:p>
+      <w:pPr>
+        <w:pStyle w:val="Heading4"/>
+      </w:pPr>
+      <w:r>
+        <w:rPr>
+          <w:rStyle w:val="VerbatimChar"/>
+        </w:rPr>
+        <w:t xml:space="preserve">EngineModeState</w:t>
+      </w:r>
+      <w:r>
+        <w:t xml:space="preserve"> </w:t>
+      </w:r>
+      <w:r>
+        <w:t xml:space="preserve">Entity</w:t>
+      </w:r>
+    </w:p>
+    <w:p>
+      <w:pPr>
+        <w:pStyle w:val="FirstParagraph"/>
+      </w:pPr>
+      <w:r>
+        <w:t xml:space="preserve">Must carry: environment/control-plane scope · current mode · state version · incident ID · requested-by · approved-by · transition timestamp · transition reason · active operation IDs · lease owner + expiry · recovery checkpoint.</w:t>
+      </w:r>
+      <w:r>
+        <w:t xml:space="preserve"> </w:t>
+      </w:r>
+      <w:r>
+        <w:rPr>
+          <w:rStyle w:val="VerbatimChar"/>
+        </w:rPr>
+        <w:t xml:space="preserve">[Documented — §29]</w:t>
+      </w:r>
+    </w:p>
+    <w:bookmarkEnd w:id="43"/>
+    <w:bookmarkStart w:id="44" w:name="dr-activation-semantics"/>
+    <w:p>
+      <w:pPr>
+        <w:pStyle w:val="Heading4"/>
+      </w:pPr>
+      <w:r>
+        <w:t xml:space="preserve">DR Activation Semantics</w:t>
+      </w:r>
+    </w:p>
+    <w:p>
+      <w:pPr>
+        <w:pStyle w:val="FirstParagraph"/>
+      </w:pPr>
+      <w:r>
+        <w:t xml:space="preserve">Entering</w:t>
+      </w:r>
+      <w:r>
+        <w:t xml:space="preserve"> </w:t>
+      </w:r>
+      <w:r>
+        <w:rPr>
+          <w:rStyle w:val="VerbatimChar"/>
+        </w:rPr>
+        <w:t xml:space="preserve">DR_EVENT_ACTIVE</w:t>
+      </w:r>
+      <w:r>
+        <w:t xml:space="preserve"> </w:t>
+      </w:r>
+      <w:r>
+        <w:rPr>
+          <w:bCs/>
+          <w:b/>
+        </w:rPr>
+        <w:t xml:space="preserve">only establishes the operating mode</w:t>
+      </w:r>
+      <w:r>
+        <w:t xml:space="preserve"> </w:t>
+      </w:r>
+      <w:r>
+        <w:t xml:space="preserve">in which separately-governed emergency operations may be evaluated — it does</w:t>
+      </w:r>
+      <w:r>
+        <w:t xml:space="preserve"> </w:t>
+      </w:r>
+      <w:r>
+        <w:rPr>
+          <w:bCs/>
+          <w:b/>
+        </w:rPr>
+        <w:t xml:space="preserve">not</w:t>
+      </w:r>
+      <w:r>
+        <w:t xml:space="preserve"> </w:t>
+      </w:r>
+      <w:r>
+        <w:t xml:space="preserve">automatically authorize Tier 2 or Tier 3. Each tier is independently gated. The DR orchestrator validates group+subscription quota and CR/sharing state before starting any approved failover deployment, and records active-or-incident-hold state back to the state service.</w:t>
+      </w:r>
+      <w:r>
+        <w:t xml:space="preserve"> </w:t>
+      </w:r>
+      <w:r>
+        <w:rPr>
+          <w:rStyle w:val="VerbatimChar"/>
+        </w:rPr>
+        <w:t xml:space="preserve">[Documented — §31]</w:t>
+      </w:r>
+    </w:p>
+    <w:bookmarkEnd w:id="44"/>
+    <w:bookmarkEnd w:id="45"/>
+    <w:bookmarkStart w:id="46" w:name="consequences-2"/>
     <w:p>
       <w:pPr>
         <w:pStyle w:val="Heading3"/>
@@ -3826,8 +6220,8 @@
         <w:t xml:space="preserve">fields to evaluate HC-6.</w:t>
       </w:r>
     </w:p>
-    <w:bookmarkEnd w:id="33"/>
-    <w:bookmarkStart w:id="34" w:name="alternatives-considered-2"/>
+    <w:bookmarkEnd w:id="46"/>
+    <w:bookmarkStart w:id="47" w:name="alternatives-considered-2"/>
     <w:p>
       <w:pPr>
         <w:pStyle w:val="Heading3"/>
@@ -4117,9 +6511,9 @@
         </w:pict>
       </w:r>
     </w:p>
-    <w:bookmarkEnd w:id="34"/>
-    <w:bookmarkEnd w:id="35"/>
-    <w:bookmarkStart w:id="40" w:name="X26bb2dd1e6ed50cfaa8bfd7d8d9521ec21700a3"/>
+    <w:bookmarkEnd w:id="47"/>
+    <w:bookmarkEnd w:id="48"/>
+    <w:bookmarkStart w:id="56" w:name="X26bb2dd1e6ed50cfaa8bfd7d8d9521ec21700a3"/>
     <w:p>
       <w:pPr>
         <w:pStyle w:val="Heading2"/>
@@ -4234,7 +6628,7 @@
         <w:t xml:space="preserve">§Forecast/§30</w:t>
       </w:r>
     </w:p>
-    <w:bookmarkStart w:id="36" w:name="context-3"/>
+    <w:bookmarkStart w:id="49" w:name="context-3"/>
     <w:p>
       <w:pPr>
         <w:pStyle w:val="Heading3"/>
@@ -4267,8 +6661,8 @@
         <w:t xml:space="preserve">ever autonomously performing material or destructive changes in Phase 1. This growth path must be architecturally distinct from crisis operations (ADR-003).</w:t>
       </w:r>
     </w:p>
-    <w:bookmarkEnd w:id="36"/>
-    <w:bookmarkStart w:id="37" w:name="decision-3"/>
+    <w:bookmarkEnd w:id="49"/>
+    <w:bookmarkStart w:id="53" w:name="decision-3"/>
     <w:p>
       <w:pPr>
         <w:pStyle w:val="Heading3"/>
@@ -4317,7 +6711,7 @@
       <w:pPr>
         <w:numPr>
           <w:ilvl w:val="0"/>
-          <w:numId w:val="1012"/>
+          <w:numId w:val="1016"/>
         </w:numPr>
       </w:pPr>
       <w:r>
@@ -4347,7 +6741,7 @@
       <w:pPr>
         <w:numPr>
           <w:ilvl w:val="0"/>
-          <w:numId w:val="1012"/>
+          <w:numId w:val="1016"/>
         </w:numPr>
       </w:pPr>
       <w:r>
@@ -4397,7 +6791,7 @@
       <w:pPr>
         <w:numPr>
           <w:ilvl w:val="0"/>
-          <w:numId w:val="1012"/>
+          <w:numId w:val="1016"/>
         </w:numPr>
       </w:pPr>
       <w:r>
@@ -4471,7 +6865,7 @@
       <w:pPr>
         <w:numPr>
           <w:ilvl w:val="0"/>
-          <w:numId w:val="1012"/>
+          <w:numId w:val="1016"/>
         </w:numPr>
       </w:pPr>
       <w:r>
@@ -4548,7 +6942,7 @@
       <w:pPr>
         <w:numPr>
           <w:ilvl w:val="0"/>
-          <w:numId w:val="1012"/>
+          <w:numId w:val="1016"/>
         </w:numPr>
       </w:pPr>
       <w:r>
@@ -4587,7 +6981,7 @@
       <w:pPr>
         <w:numPr>
           <w:ilvl w:val="0"/>
-          <w:numId w:val="1012"/>
+          <w:numId w:val="1016"/>
         </w:numPr>
       </w:pPr>
       <w:r>
@@ -4676,7 +7070,7 @@
       <w:pPr>
         <w:numPr>
           <w:ilvl w:val="0"/>
-          <w:numId w:val="1012"/>
+          <w:numId w:val="1016"/>
         </w:numPr>
       </w:pPr>
       <w:r>
@@ -4693,8 +7087,313 @@
         <w:t xml:space="preserve">Increases only ever raise CR quantity or request more quota; guarded reduction (right-sizing) never drops a CR below its allocated count (platform floor, FR-1.6) and is itself approval-gated.</w:t>
       </w:r>
     </w:p>
-    <w:bookmarkEnd w:id="37"/>
-    <w:bookmarkStart w:id="38" w:name="consequences-3"/>
+    <w:bookmarkStart w:id="50" w:name="Xf1426b79a09c525d9ee2bfb22640520d79a16bd"/>
+    <w:p>
+      <w:pPr>
+        <w:pStyle w:val="Heading4"/>
+      </w:pPr>
+      <w:r>
+        <w:t xml:space="preserve">Steady-State Capacity Lifecycle (normative 10-step policy)</w:t>
+      </w:r>
+    </w:p>
+    <w:p>
+      <w:pPr>
+        <w:pStyle w:val="FirstParagraph"/>
+      </w:pPr>
+      <w:r>
+        <w:t xml:space="preserve">The steady-state increase runs strictly separate from DR crisis operations and follows a fixed sequence, with</w:t>
+      </w:r>
+      <w:r>
+        <w:t xml:space="preserve"> </w:t>
+      </w:r>
+      <w:r>
+        <w:rPr>
+          <w:bCs/>
+          <w:b/>
+        </w:rPr>
+        <w:t xml:space="preserve">no assumed quota-propagation SLA</w:t>
+      </w:r>
+      <w:r>
+        <w:t xml:space="preserve">:</w:t>
+      </w:r>
+      <w:r>
+        <w:t xml:space="preserve"> </w:t>
+      </w:r>
+      <w:r>
+        <w:rPr>
+          <w:rStyle w:val="VerbatimChar"/>
+        </w:rPr>
+        <w:t xml:space="preserve">[Documented — §30]</w:t>
+      </w:r>
+    </w:p>
+    <w:p>
+      <w:pPr>
+        <w:numPr>
+          <w:ilvl w:val="0"/>
+          <w:numId w:val="1017"/>
+        </w:numPr>
+        <w:pStyle w:val="Compact"/>
+      </w:pPr>
+      <w:r>
+        <w:t xml:space="preserve">Detect threshold crossing.</w:t>
+      </w:r>
+    </w:p>
+    <w:p>
+      <w:pPr>
+        <w:numPr>
+          <w:ilvl w:val="0"/>
+          <w:numId w:val="1017"/>
+        </w:numPr>
+        <w:pStyle w:val="Compact"/>
+      </w:pPr>
+      <w:r>
+        <w:t xml:space="preserve">Re-read current CR, quota, sharing, and assignment state.</w:t>
+      </w:r>
+    </w:p>
+    <w:p>
+      <w:pPr>
+        <w:numPr>
+          <w:ilvl w:val="0"/>
+          <w:numId w:val="1017"/>
+        </w:numPr>
+        <w:pStyle w:val="Compact"/>
+      </w:pPr>
+      <w:r>
+        <w:t xml:space="preserve">Create</w:t>
+      </w:r>
+      <w:r>
+        <w:t xml:space="preserve"> </w:t>
+      </w:r>
+      <w:r>
+        <w:rPr>
+          <w:rStyle w:val="VerbatimChar"/>
+        </w:rPr>
+        <w:t xml:space="preserve">CapacityIncreaseRequest</w:t>
+      </w:r>
+      <w:r>
+        <w:t xml:space="preserve">.</w:t>
+      </w:r>
+    </w:p>
+    <w:p>
+      <w:pPr>
+        <w:numPr>
+          <w:ilvl w:val="0"/>
+          <w:numId w:val="1017"/>
+        </w:numPr>
+        <w:pStyle w:val="Compact"/>
+      </w:pPr>
+      <w:r>
+        <w:t xml:space="preserve">Calculate target quantity (</w:t>
+      </w:r>
+      <w:r>
+        <w:rPr>
+          <w:rStyle w:val="VerbatimChar"/>
+        </w:rPr>
+        <w:t xml:space="preserve">Forecast_Quantity</w:t>
+      </w:r>
+      <w:r>
+        <w:t xml:space="preserve"> </w:t>
+      </w:r>
+      <w:r>
+        <w:t xml:space="preserve">formula above).</w:t>
+      </w:r>
+    </w:p>
+    <w:p>
+      <w:pPr>
+        <w:numPr>
+          <w:ilvl w:val="0"/>
+          <w:numId w:val="1017"/>
+        </w:numPr>
+        <w:pStyle w:val="Compact"/>
+      </w:pPr>
+      <w:r>
+        <w:rPr>
+          <w:bCs/>
+          <w:b/>
+        </w:rPr>
+        <w:t xml:space="preserve">Require operator approval (Phase 1).</w:t>
+      </w:r>
+    </w:p>
+    <w:p>
+      <w:pPr>
+        <w:numPr>
+          <w:ilvl w:val="0"/>
+          <w:numId w:val="1017"/>
+        </w:numPr>
+        <w:pStyle w:val="Compact"/>
+      </w:pPr>
+      <w:r>
+        <w:t xml:space="preserve">Submit the quota action only if validated as required.</w:t>
+      </w:r>
+    </w:p>
+    <w:p>
+      <w:pPr>
+        <w:numPr>
+          <w:ilvl w:val="0"/>
+          <w:numId w:val="1017"/>
+        </w:numPr>
+        <w:pStyle w:val="Compact"/>
+      </w:pPr>
+      <w:r>
+        <w:t xml:space="preserve">Wait for confirmed quota state</w:t>
+      </w:r>
+      <w:r>
+        <w:t xml:space="preserve"> </w:t>
+      </w:r>
+      <w:r>
+        <w:rPr>
+          <w:bCs/>
+          <w:b/>
+        </w:rPr>
+        <w:t xml:space="preserve">without assuming a propagation SLA</w:t>
+      </w:r>
+      <w:r>
+        <w:t xml:space="preserve">.</w:t>
+      </w:r>
+    </w:p>
+    <w:p>
+      <w:pPr>
+        <w:numPr>
+          <w:ilvl w:val="0"/>
+          <w:numId w:val="1017"/>
+        </w:numPr>
+        <w:pStyle w:val="Compact"/>
+      </w:pPr>
+      <w:r>
+        <w:t xml:space="preserve">Update CR quantity.</w:t>
+      </w:r>
+    </w:p>
+    <w:p>
+      <w:pPr>
+        <w:numPr>
+          <w:ilvl w:val="0"/>
+          <w:numId w:val="1017"/>
+        </w:numPr>
+        <w:pStyle w:val="Compact"/>
+      </w:pPr>
+      <w:r>
+        <w:t xml:space="preserve">Confirm the actual quantity.</w:t>
+      </w:r>
+    </w:p>
+    <w:p>
+      <w:pPr>
+        <w:numPr>
+          <w:ilvl w:val="0"/>
+          <w:numId w:val="1017"/>
+        </w:numPr>
+        <w:pStyle w:val="Compact"/>
+      </w:pPr>
+      <w:r>
+        <w:t xml:space="preserve">Refresh the snapshot and close the request.</w:t>
+      </w:r>
+    </w:p>
+    <w:bookmarkEnd w:id="50"/>
+    <w:bookmarkStart w:id="51" w:name="auto-decrease-exclusion"/>
+    <w:p>
+      <w:pPr>
+        <w:pStyle w:val="Heading4"/>
+      </w:pPr>
+      <w:r>
+        <w:t xml:space="preserve">Auto-Decrease Exclusion</w:t>
+      </w:r>
+    </w:p>
+    <w:p>
+      <w:pPr>
+        <w:pStyle w:val="FirstParagraph"/>
+      </w:pPr>
+      <w:r>
+        <w:t xml:space="preserve">Auto-decrease is</w:t>
+      </w:r>
+      <w:r>
+        <w:t xml:space="preserve"> </w:t>
+      </w:r>
+      <w:r>
+        <w:rPr>
+          <w:bCs/>
+          <w:b/>
+        </w:rPr>
+        <w:t xml:space="preserve">excluded from Phase 1</w:t>
+      </w:r>
+      <w:r>
+        <w:t xml:space="preserve">: it can remove future capacity and interact with running VMs. Right-sizing down remains operator-driven and guarded by the platform floor (never below allocated count).</w:t>
+      </w:r>
+      <w:r>
+        <w:t xml:space="preserve"> </w:t>
+      </w:r>
+      <w:r>
+        <w:rPr>
+          <w:rStyle w:val="VerbatimChar"/>
+        </w:rPr>
+        <w:t xml:space="preserve">[Documented — §30]</w:t>
+      </w:r>
+    </w:p>
+    <w:bookmarkEnd w:id="51"/>
+    <w:bookmarkStart w:id="52" w:name="forecast-advisory-posture"/>
+    <w:p>
+      <w:pPr>
+        <w:pStyle w:val="Heading4"/>
+      </w:pPr>
+      <w:r>
+        <w:t xml:space="preserve">Forecast Advisory Posture</w:t>
+      </w:r>
+    </w:p>
+    <w:p>
+      <w:pPr>
+        <w:pStyle w:val="FirstParagraph"/>
+      </w:pPr>
+      <w:r>
+        <w:t xml:space="preserve">Forecast recommendations stay</w:t>
+      </w:r>
+      <w:r>
+        <w:t xml:space="preserve"> </w:t>
+      </w:r>
+      <w:r>
+        <w:rPr>
+          <w:bCs/>
+          <w:b/>
+        </w:rPr>
+        <w:t xml:space="preserve">advisory until model accuracy and false-positive rates are measured</w:t>
+      </w:r>
+      <w:r>
+        <w:t xml:space="preserve">; the horizon is 30/60/90 days and</w:t>
+      </w:r>
+      <w:r>
+        <w:t xml:space="preserve"> </w:t>
+      </w:r>
+      <w:r>
+        <w:rPr>
+          <w:rStyle w:val="VerbatimChar"/>
+        </w:rPr>
+        <w:t xml:space="preserve">Growth_Buffer</w:t>
+      </w:r>
+      <w:r>
+        <w:t xml:space="preserve">/</w:t>
+      </w:r>
+      <w:r>
+        <w:rPr>
+          <w:rStyle w:val="VerbatimChar"/>
+        </w:rPr>
+        <w:t xml:space="preserve">DR_Buffer</w:t>
+      </w:r>
+      <w:r>
+        <w:t xml:space="preserve"> </w:t>
+      </w:r>
+      <w:r>
+        <w:t xml:space="preserve">are policy percentages, not fixed constants.</w:t>
+      </w:r>
+      <w:r>
+        <w:t xml:space="preserve"> </w:t>
+      </w:r>
+      <w:r>
+        <w:rPr>
+          <w:rStyle w:val="VerbatimChar"/>
+        </w:rPr>
+        <w:t xml:space="preserve">[Documented — §28]</w:t>
+      </w:r>
+    </w:p>
+    <w:bookmarkEnd w:id="52"/>
+    <w:bookmarkEnd w:id="53"/>
+    <w:bookmarkStart w:id="54" w:name="consequences-3"/>
     <w:p>
       <w:pPr>
         <w:pStyle w:val="Heading3"/>
@@ -4805,8 +7504,8 @@
         <w:t xml:space="preserve">lifecycle (entity, approval, retry, cancellation) is still a backlog item (G-24) requiring an end-to-end approved-increase test.</w:t>
       </w:r>
     </w:p>
-    <w:bookmarkEnd w:id="38"/>
-    <w:bookmarkStart w:id="39" w:name="alternatives-considered-3"/>
+    <w:bookmarkEnd w:id="54"/>
+    <w:bookmarkStart w:id="55" w:name="alternatives-considered-3"/>
     <w:p>
       <w:pPr>
         <w:pStyle w:val="Heading3"/>
@@ -5072,9 +7771,9 @@
         </w:pict>
       </w:r>
     </w:p>
-    <w:bookmarkEnd w:id="39"/>
-    <w:bookmarkEnd w:id="40"/>
-    <w:bookmarkStart w:id="41" w:name="appendix-a-decision-log-cross-reference"/>
+    <w:bookmarkEnd w:id="55"/>
+    <w:bookmarkEnd w:id="56"/>
+    <w:bookmarkStart w:id="57" w:name="appendix-a-decision-log-cross-reference"/>
     <w:p>
       <w:pPr>
         <w:pStyle w:val="Heading2"/>
@@ -5349,8 +8048,8 @@
         </w:tc>
       </w:tr>
     </w:tbl>
-    <w:bookmarkEnd w:id="41"/>
-    <w:bookmarkStart w:id="42" w:name="appendix-b-status-legend"/>
+    <w:bookmarkEnd w:id="57"/>
+    <w:bookmarkStart w:id="58" w:name="appendix-b-status-legend"/>
     <w:p>
       <w:pPr>
         <w:pStyle w:val="Heading2"/>
@@ -5519,8 +8218,8 @@
         </w:tc>
       </w:tr>
     </w:tbl>
-    <w:bookmarkEnd w:id="42"/>
-    <w:bookmarkStart w:id="43" w:name="appendix-c-evidence-tag-taxonomy"/>
+    <w:bookmarkEnd w:id="58"/>
+    <w:bookmarkStart w:id="59" w:name="appendix-c-evidence-tag-taxonomy"/>
     <w:p>
       <w:pPr>
         <w:pStyle w:val="Heading2"/>
@@ -5726,8 +8425,8 @@
         <w:t xml:space="preserve">After POC-30 (Quota Groups GA) and POC-31 (quota release latency), and on resolution of G-14 / G-15.</w:t>
       </w:r>
     </w:p>
-    <w:bookmarkEnd w:id="43"/>
-    <w:bookmarkEnd w:id="44"/>
+    <w:bookmarkEnd w:id="59"/>
+    <w:bookmarkEnd w:id="60"/>
     <w:sectPr/>
   </w:body>
 </w:document>
@@ -6041,6 +8740,15 @@
     <w:abstractNumId w:val="991"/>
   </w:num>
   <w:num w:numId="1006">
+    <w:abstractNumId w:val="991"/>
+  </w:num>
+  <w:num w:numId="1007">
+    <w:abstractNumId w:val="991"/>
+  </w:num>
+  <w:num w:numId="1008">
+    <w:abstractNumId w:val="991"/>
+  </w:num>
+  <w:num w:numId="1009">
     <w:abstractNumId w:val="99411"/>
     <w:lvlOverride w:ilvl="0">
       <w:startOverride w:val="1"/>
@@ -6070,10 +8778,13 @@
       <w:startOverride w:val="1"/>
     </w:lvlOverride>
   </w:num>
-  <w:num w:numId="1007">
+  <w:num w:numId="1010">
     <w:abstractNumId w:val="991"/>
   </w:num>
-  <w:num w:numId="1008">
+  <w:num w:numId="1011">
+    <w:abstractNumId w:val="991"/>
+  </w:num>
+  <w:num w:numId="1012">
     <w:abstractNumId w:val="99411"/>
     <w:lvlOverride w:ilvl="0">
       <w:startOverride w:val="1"/>
@@ -6103,16 +8814,46 @@
       <w:startOverride w:val="1"/>
     </w:lvlOverride>
   </w:num>
-  <w:num w:numId="1009">
+  <w:num w:numId="1013">
     <w:abstractNumId w:val="991"/>
   </w:num>
-  <w:num w:numId="1010">
+  <w:num w:numId="1014">
     <w:abstractNumId w:val="991"/>
   </w:num>
-  <w:num w:numId="1011">
+  <w:num w:numId="1015">
     <w:abstractNumId w:val="991"/>
   </w:num>
-  <w:num w:numId="1012">
+  <w:num w:numId="1016">
+    <w:abstractNumId w:val="99411"/>
+    <w:lvlOverride w:ilvl="0">
+      <w:startOverride w:val="1"/>
+    </w:lvlOverride>
+    <w:lvlOverride w:ilvl="1">
+      <w:startOverride w:val="1"/>
+    </w:lvlOverride>
+    <w:lvlOverride w:ilvl="2">
+      <w:startOverride w:val="1"/>
+    </w:lvlOverride>
+    <w:lvlOverride w:ilvl="3">
+      <w:startOverride w:val="1"/>
+    </w:lvlOverride>
+    <w:lvlOverride w:ilvl="4">
+      <w:startOverride w:val="1"/>
+    </w:lvlOverride>
+    <w:lvlOverride w:ilvl="5">
+      <w:startOverride w:val="1"/>
+    </w:lvlOverride>
+    <w:lvlOverride w:ilvl="6">
+      <w:startOverride w:val="1"/>
+    </w:lvlOverride>
+    <w:lvlOverride w:ilvl="7">
+      <w:startOverride w:val="1"/>
+    </w:lvlOverride>
+    <w:lvlOverride w:ilvl="8">
+      <w:startOverride w:val="1"/>
+    </w:lvlOverride>
+  </w:num>
+  <w:num w:numId="1017">
     <w:abstractNumId w:val="99411"/>
     <w:lvlOverride w:ilvl="0">
       <w:startOverride w:val="1"/>

</xml_diff>

<commit_message>
Make ADRs self-contained/reference-free and add rendered architecture diagrams
- Strip all external-document pointers (section refs, requirement/constraint
  codes, source lines) from consolidated and split ADRs; inline all normative
  detail so each record reads standalone.
- Normalise evidence tags to four bare categories (Documented/Decided/Derived/
  Assumed); self-contained appendices (ADR Summary, Status Legend, Evidence
  Taxonomy).
- Add 6 rendered diagrams (pipeline, input modes, quota groups, transfer tiers,
  five-state engine machine, capacity lifecycle) with .mmd sources.
- Splitter renumbers figures per-document from 1 and rewrites diagram paths.
- Rebuild all md/pdf/docx with DejaVu fonts; refresh README catalog entry.
</commit_message>
<xml_diff>
--- a/docs/acrme_architecture_decision_records.docx
+++ b/docs/acrme_architecture_decision_records.docx
@@ -2,7 +2,7 @@
 <file path=word/document.xml><?xml version="1.0" encoding="utf-8"?>
 <w:document xmlns:w="http://schemas.openxmlformats.org/wordprocessingml/2006/main" xmlns:m="http://schemas.openxmlformats.org/officeDocument/2006/math" xmlns:r="http://schemas.openxmlformats.org/officeDocument/2006/relationships" xmlns:o="urn:schemas-microsoft-com:office:office" xmlns:v="urn:schemas-microsoft-com:vml" xmlns:w10="urn:schemas-microsoft-com:office:word" xmlns:a="http://schemas.openxmlformats.org/drawingml/2006/main" xmlns:pic="http://schemas.openxmlformats.org/drawingml/2006/picture" xmlns:wp="http://schemas.openxmlformats.org/drawingml/2006/wordprocessingDrawing">
   <w:body>
-    <w:bookmarkStart w:id="60" w:name="acrme-architecture-decision-records-adrs"/>
+    <w:bookmarkStart w:id="78" w:name="acrme-architecture-decision-records-adrs"/>
     <w:p>
       <w:pPr>
         <w:pStyle w:val="Heading1"/>
@@ -58,7 +58,7 @@
         <w:t xml:space="preserve"> </w:t>
       </w:r>
       <w:r>
-        <w:t xml:space="preserve">1.1</w:t>
+        <w:t xml:space="preserve">1.2</w:t>
       </w:r>
       <w:r>
         <w:br/>
@@ -100,13 +100,29 @@
           <w:bCs/>
           <w:b/>
         </w:rPr>
-        <w:t xml:space="preserve">Change note (v1.1):</w:t>
-      </w:r>
-      <w:r>
-        <w:t xml:space="preserve"> </w:t>
-      </w:r>
-      <w:r>
-        <w:t xml:space="preserve">Aligned each ADR with the Production-Readiness Review &amp; Architecture (§26–§32) — added the normative region-classification model, Scenario 1/2 input modes, EC-1..EC-4 exception workflow, VR-1..VR-11, capacity-hold concurrency and corrected scoring (ADR-001); group accounting formulas, dual-validation detector and</w:t>
+        <w:t xml:space="preserve">Change note (v1.2):</w:t>
+      </w:r>
+      <w:r>
+        <w:t xml:space="preserve"> </w:t>
+      </w:r>
+      <w:r>
+        <w:t xml:space="preserve">Made this a self-contained, reference-free document — removed external document and section citations so it can be read without any companion document — and added rendered architecture diagrams (placement pipeline, input modes, quota-group model, engine state machine, emergency-transfer tiers, capacity-increase lifecycle).</w:t>
+      </w:r>
+      <w:r>
+        <w:t xml:space="preserve"> </w:t>
+      </w:r>
+      <w:r>
+        <w:rPr>
+          <w:bCs/>
+          <w:b/>
+        </w:rPr>
+        <w:t xml:space="preserve">(v1.1):</w:t>
+      </w:r>
+      <w:r>
+        <w:t xml:space="preserve"> </w:t>
+      </w:r>
+      <w:r>
+        <w:t xml:space="preserve">Added the region-classification model, Scenario 1/2 input modes, the exception workflow, the validation-rule framework, capacity-hold concurrency and corrected scoring (ADR-001); group accounting formulas, the dual-validation detector and</w:t>
       </w:r>
       <w:r>
         <w:t xml:space="preserve"> </w:t>
@@ -121,7 +137,7 @@
         <w:t xml:space="preserve"> </w:t>
       </w:r>
       <w:r>
-        <w:t xml:space="preserve">FC-11 preview status (ADR-002); the full five-state engine state machine,</w:t>
+        <w:t xml:space="preserve">preview status (ADR-002); the five-state engine state machine, the</w:t>
       </w:r>
       <w:r>
         <w:t xml:space="preserve"> </w:t>
@@ -136,7 +152,7 @@
         <w:t xml:space="preserve"> </w:t>
       </w:r>
       <w:r>
-        <w:t xml:space="preserve">entity and DR-activation semantics (ADR-003); and the 10-step steady-state lifecycle with auto-decrease exclusion (ADR-004).</w:t>
+        <w:t xml:space="preserve">entity and DR-activation semantics (ADR-003); and the 10-step steady-state lifecycle with the auto-decrease exclusion (ADR-004).</w:t>
       </w:r>
     </w:p>
     <w:p>
@@ -499,7 +515,7 @@
         <w:t xml:space="preserve"> </w:t>
       </w:r>
       <w:r>
-        <w:t xml:space="preserve">(Azure platform docs),</w:t>
+        <w:t xml:space="preserve">(traceable to Azure platform behaviour or documentation),</w:t>
       </w:r>
       <w:r>
         <w:t xml:space="preserve"> </w:t>
@@ -514,7 +530,7 @@
         <w:t xml:space="preserve"> </w:t>
       </w:r>
       <w:r>
-        <w:t xml:space="preserve">(Decision Log D1–D11),</w:t>
+        <w:t xml:space="preserve">(an explicit ACRME design choice recorded in this ADR set),</w:t>
       </w:r>
       <w:r>
         <w:t xml:space="preserve"> </w:t>
@@ -529,7 +545,7 @@
         <w:t xml:space="preserve"> </w:t>
       </w:r>
       <w:r>
-        <w:t xml:space="preserve">(logical consequence),</w:t>
+        <w:t xml:space="preserve">(a logical consequence of a documented constraint or decision),</w:t>
       </w:r>
       <w:r>
         <w:t xml:space="preserve"> </w:t>
@@ -544,7 +560,7 @@
         <w:t xml:space="preserve"> </w:t>
       </w:r>
       <w:r>
-        <w:t xml:space="preserve">(architectural judgement pending validation).</w:t>
+        <w:t xml:space="preserve">(architectural judgement pending proof-of-concept validation).</w:t>
       </w:r>
     </w:p>
     <w:p>
@@ -555,7 +571,7 @@
       </w:r>
     </w:p>
     <w:bookmarkEnd w:id="20"/>
-    <w:bookmarkStart w:id="32" w:name="adr-001-region-selection"/>
+    <w:bookmarkStart w:id="38" w:name="adr-001-region-selection"/>
     <w:p>
       <w:pPr>
         <w:pStyle w:val="Heading2"/>
@@ -621,53 +637,13 @@
           <w:bCs/>
           <w:b/>
         </w:rPr>
-        <w:t xml:space="preserve">Related decisions:</w:t>
-      </w:r>
-      <w:r>
-        <w:t xml:space="preserve"> </w:t>
-      </w:r>
-      <w:r>
-        <w:t xml:space="preserve">D1, D4, D5, D8, D9; HC-1..HC-10; VR-1..VR-11</w:t>
-      </w:r>
-      <w:r>
-        <w:br/>
-      </w:r>
-      <w:r>
-        <w:rPr>
-          <w:bCs/>
-          <w:b/>
-        </w:rPr>
-        <w:t xml:space="preserve">Source:</w:t>
-      </w:r>
-      <w:r>
-        <w:t xml:space="preserve"> </w:t>
-      </w:r>
-      <w:r>
-        <w:rPr>
-          <w:rStyle w:val="VerbatimChar"/>
-        </w:rPr>
-        <w:t xml:space="preserve">multi_region_placement_design.md</w:t>
-      </w:r>
-      <w:r>
-        <w:t xml:space="preserve"> </w:t>
-      </w:r>
-      <w:r>
-        <w:t xml:space="preserve">§27–28;</w:t>
-      </w:r>
-      <w:r>
-        <w:t xml:space="preserve"> </w:t>
-      </w:r>
-      <w:r>
-        <w:rPr>
-          <w:rStyle w:val="VerbatimChar"/>
-        </w:rPr>
-        <w:t xml:space="preserve">acrme_production_readiness_review_and_architecture.md</w:t>
-      </w:r>
-      <w:r>
-        <w:t xml:space="preserve"> </w:t>
-      </w:r>
-      <w:r>
-        <w:t xml:space="preserve">§27</w:t>
+        <w:t xml:space="preserve">Related constraints:</w:t>
+      </w:r>
+      <w:r>
+        <w:t xml:space="preserve"> </w:t>
+      </w:r>
+      <w:r>
+        <w:t xml:space="preserve">HC-1..HC-10 (hard constraints); VR-1..VR-11 (validation rules)</w:t>
       </w:r>
     </w:p>
     <w:bookmarkStart w:id="21" w:name="context"/>
@@ -891,7 +867,7 @@
       </w:r>
     </w:p>
     <w:bookmarkEnd w:id="21"/>
-    <w:bookmarkStart w:id="29" w:name="decision"/>
+    <w:bookmarkStart w:id="35" w:name="decision"/>
     <w:p>
       <w:pPr>
         <w:pStyle w:val="Heading3"/>
@@ -973,7 +949,7 @@
         <w:rPr>
           <w:rStyle w:val="VerbatimChar"/>
         </w:rPr>
-        <w:t xml:space="preserve">[Decided — D9]</w:t>
+        <w:t xml:space="preserve">[Decided]</w:t>
       </w:r>
     </w:p>
     <w:p>
@@ -1050,7 +1026,7 @@
         <w:rPr>
           <w:rStyle w:val="VerbatimChar"/>
         </w:rPr>
-        <w:t xml:space="preserve">[Decided — D4]</w:t>
+        <w:t xml:space="preserve">[Decided]</w:t>
       </w:r>
     </w:p>
     <w:p>
@@ -1080,7 +1056,7 @@
         <w:rPr>
           <w:rStyle w:val="VerbatimChar"/>
         </w:rPr>
-        <w:t xml:space="preserve">[Decided — D9]</w:t>
+        <w:t xml:space="preserve">[Decided]</w:t>
       </w:r>
     </w:p>
     <w:p>
@@ -1189,7 +1165,7 @@
         <w:t xml:space="preserve"> </w:t>
       </w:r>
       <w:r>
-        <w:t xml:space="preserve">share with NonProd per D8).</w:t>
+        <w:t xml:space="preserve">share with NonProd).</w:t>
       </w:r>
     </w:p>
     <w:p>
@@ -1219,7 +1195,7 @@
         <w:rPr>
           <w:rStyle w:val="VerbatimChar"/>
         </w:rPr>
-        <w:t xml:space="preserve">[Decided — D1]</w:t>
+        <w:t xml:space="preserve">[Decided]</w:t>
       </w:r>
     </w:p>
     <w:p>
@@ -1280,7 +1256,7 @@
         <w:rPr>
           <w:rStyle w:val="VerbatimChar"/>
         </w:rPr>
-        <w:t xml:space="preserve">[Decided — D8; Documented — §27]</w:t>
+        <w:t xml:space="preserve">[Decided]</w:t>
       </w:r>
     </w:p>
     <w:p>
@@ -1340,7 +1316,7 @@
         <w:rPr>
           <w:rStyle w:val="VerbatimChar"/>
         </w:rPr>
-        <w:t xml:space="preserve">[Decided — D5]</w:t>
+        <w:t xml:space="preserve">[Decided]</w:t>
       </w:r>
     </w:p>
     <w:p>
@@ -1380,7 +1356,72 @@
         <w:t xml:space="preserve">— it produces and logs the ranked recommendation but does not autonomously place. Autonomous placement is gated on POC validation of the scoring formulas.</w:t>
       </w:r>
     </w:p>
-    <w:bookmarkStart w:id="22" w:name="region-classification-model-normative"/>
+    <w:p>
+      <w:pPr>
+        <w:pStyle w:val="CaptionedFigure"/>
+      </w:pPr>
+      <w:r>
+        <w:drawing>
+          <wp:inline>
+            <wp:extent cx="5334000" cy="5442857"/>
+            <wp:effectExtent b="0" l="0" r="0" t="0"/>
+            <wp:docPr descr="Figure 1. ACRME staged placement pipeline — Stage 1 eligibility pre-filter, Stage 2 hard-constraint gate, Stage 3 environment-type-specific scoring, then sequential Prod → NonProd → DR selection." title="" id="23" name="Picture"/>
+            <a:graphic>
+              <a:graphicData uri="http://schemas.openxmlformats.org/drawingml/2006/picture">
+                <pic:pic>
+                  <pic:nvPicPr>
+                    <pic:cNvPr descr="adr/diagrams/adr001_pipeline.png" id="24" name="Picture"/>
+                    <pic:cNvPicPr>
+                      <a:picLocks noChangeArrowheads="1" noChangeAspect="1"/>
+                    </pic:cNvPicPr>
+                  </pic:nvPicPr>
+                  <pic:blipFill>
+                    <a:blip r:embed="rId22"/>
+                    <a:stretch>
+                      <a:fillRect/>
+                    </a:stretch>
+                  </pic:blipFill>
+                  <pic:spPr bwMode="auto">
+                    <a:xfrm>
+                      <a:off x="0" y="0"/>
+                      <a:ext cx="5334000" cy="5442857"/>
+                    </a:xfrm>
+                    <a:prstGeom prst="rect">
+                      <a:avLst/>
+                    </a:prstGeom>
+                    <a:noFill/>
+                    <a:ln w="9525">
+                      <a:noFill/>
+                      <a:headEnd/>
+                      <a:tailEnd/>
+                    </a:ln>
+                  </pic:spPr>
+                </pic:pic>
+              </a:graphicData>
+            </a:graphic>
+          </wp:inline>
+        </w:drawing>
+      </w:r>
+    </w:p>
+    <w:p>
+      <w:pPr>
+        <w:pStyle w:val="ImageCaption"/>
+      </w:pPr>
+      <w:r>
+        <w:rPr>
+          <w:bCs/>
+          <w:b/>
+        </w:rPr>
+        <w:t xml:space="preserve">Figure 1.</w:t>
+      </w:r>
+      <w:r>
+        <w:t xml:space="preserve"> </w:t>
+      </w:r>
+      <w:r>
+        <w:t xml:space="preserve">ACRME staged placement pipeline — Stage 1 eligibility pre-filter, Stage 2 hard-constraint gate, Stage 3 environment-type-specific scoring, then sequential Prod → NonProd → DR selection.</w:t>
+      </w:r>
+    </w:p>
+    <w:bookmarkStart w:id="25" w:name="region-classification-model-normative"/>
     <w:p>
       <w:pPr>
         <w:pStyle w:val="Heading4"/>
@@ -1431,7 +1472,7 @@
         <w:rPr>
           <w:rStyle w:val="VerbatimChar"/>
         </w:rPr>
-        <w:t xml:space="preserve">[Documented — §27]</w:t>
+        <w:t xml:space="preserve">[Documented]</w:t>
       </w:r>
     </w:p>
     <w:tbl>
@@ -1637,8 +1678,8 @@
         <w:t xml:space="preserve">(HC-9), never as a scoring penalty.</w:t>
       </w:r>
     </w:p>
-    <w:bookmarkEnd w:id="22"/>
-    <w:bookmarkStart w:id="23" w:name="prod-region-input-modes"/>
+    <w:bookmarkEnd w:id="25"/>
+    <w:bookmarkStart w:id="29" w:name="prod-region-input-modes"/>
     <w:p>
       <w:pPr>
         <w:pStyle w:val="Heading4"/>
@@ -1661,7 +1702,7 @@
         <w:rPr>
           <w:rStyle w:val="VerbatimChar"/>
         </w:rPr>
-        <w:t xml:space="preserve">[Documented — §27]</w:t>
+        <w:t xml:space="preserve">[Documented]</w:t>
       </w:r>
     </w:p>
     <w:p>
@@ -1748,8 +1789,73 @@
         <w:t xml:space="preserve">used only for post-selection validation). If Restricted, route to the Exception Deployment Workflow.</w:t>
       </w:r>
     </w:p>
-    <w:bookmarkEnd w:id="23"/>
-    <w:bookmarkStart w:id="24" w:name="X844b545e4620926cc70c9c09d323b98bfdbf572"/>
+    <w:p>
+      <w:pPr>
+        <w:pStyle w:val="CaptionedFigure"/>
+      </w:pPr>
+      <w:r>
+        <w:drawing>
+          <wp:inline>
+            <wp:extent cx="5334000" cy="7136946"/>
+            <wp:effectExtent b="0" l="0" r="0" t="0"/>
+            <wp:docPr descr="Figure 2. Prod region input modes — geography-supplied (Scenario 1) versus specific-region (Scenario 2), including the restricted-region Exception Deployment Workflow." title="" id="27" name="Picture"/>
+            <a:graphic>
+              <a:graphicData uri="http://schemas.openxmlformats.org/drawingml/2006/picture">
+                <pic:pic>
+                  <pic:nvPicPr>
+                    <pic:cNvPr descr="adr/diagrams/adr001_input_modes.png" id="28" name="Picture"/>
+                    <pic:cNvPicPr>
+                      <a:picLocks noChangeArrowheads="1" noChangeAspect="1"/>
+                    </pic:cNvPicPr>
+                  </pic:nvPicPr>
+                  <pic:blipFill>
+                    <a:blip r:embed="rId26"/>
+                    <a:stretch>
+                      <a:fillRect/>
+                    </a:stretch>
+                  </pic:blipFill>
+                  <pic:spPr bwMode="auto">
+                    <a:xfrm>
+                      <a:off x="0" y="0"/>
+                      <a:ext cx="5334000" cy="7136946"/>
+                    </a:xfrm>
+                    <a:prstGeom prst="rect">
+                      <a:avLst/>
+                    </a:prstGeom>
+                    <a:noFill/>
+                    <a:ln w="9525">
+                      <a:noFill/>
+                      <a:headEnd/>
+                      <a:tailEnd/>
+                    </a:ln>
+                  </pic:spPr>
+                </pic:pic>
+              </a:graphicData>
+            </a:graphic>
+          </wp:inline>
+        </w:drawing>
+      </w:r>
+    </w:p>
+    <w:p>
+      <w:pPr>
+        <w:pStyle w:val="ImageCaption"/>
+      </w:pPr>
+      <w:r>
+        <w:rPr>
+          <w:bCs/>
+          <w:b/>
+        </w:rPr>
+        <w:t xml:space="preserve">Figure 2.</w:t>
+      </w:r>
+      <w:r>
+        <w:t xml:space="preserve"> </w:t>
+      </w:r>
+      <w:r>
+        <w:t xml:space="preserve">Prod region input modes — geography-supplied (Scenario 1) versus specific-region (Scenario 2), including the restricted-region Exception Deployment Workflow.</w:t>
+      </w:r>
+    </w:p>
+    <w:bookmarkEnd w:id="29"/>
+    <w:bookmarkStart w:id="30" w:name="X844b545e4620926cc70c9c09d323b98bfdbf572"/>
     <w:p>
       <w:pPr>
         <w:pStyle w:val="Heading4"/>
@@ -1788,7 +1894,7 @@
         <w:rPr>
           <w:rStyle w:val="VerbatimChar"/>
         </w:rPr>
-        <w:t xml:space="preserve">[Documented — §27]</w:t>
+        <w:t xml:space="preserve">[Documented]</w:t>
       </w:r>
     </w:p>
     <w:tbl>
@@ -2077,8 +2183,8 @@
         <w:t xml:space="preserve">fields (commit blocked if absent). CVAL/DR still select from Standard regions via normal scoring.</w:t>
       </w:r>
     </w:p>
-    <w:bookmarkEnd w:id="24"/>
-    <w:bookmarkStart w:id="25" w:name="validation-rule-framework-vr-1..vr-11"/>
+    <w:bookmarkEnd w:id="30"/>
+    <w:bookmarkStart w:id="31" w:name="validation-rule-framework-vr-1..vr-11"/>
     <w:p>
       <w:pPr>
         <w:pStyle w:val="Heading4"/>
@@ -2558,8 +2664,8 @@
         </w:tc>
       </w:tr>
     </w:tbl>
-    <w:bookmarkEnd w:id="25"/>
-    <w:bookmarkStart w:id="26" w:name="capacity-holds-concurrency"/>
+    <w:bookmarkEnd w:id="31"/>
+    <w:bookmarkStart w:id="32" w:name="capacity-holds-concurrency"/>
     <w:p>
       <w:pPr>
         <w:pStyle w:val="Heading4"/>
@@ -2602,20 +2708,20 @@
         <w:t xml:space="preserve">optimistic concurrency</w:t>
       </w:r>
       <w:r>
-        <w:t xml:space="preserve">; the hold expires if Azure provisioning does not begin. This closes the concurrent-placement race (B-7).</w:t>
-      </w:r>
-      <w:r>
-        <w:t xml:space="preserve"> </w:t>
-      </w:r>
-      <w:r>
-        <w:rPr>
-          <w:rStyle w:val="VerbatimChar"/>
-        </w:rPr>
-        <w:t xml:space="preserve">[Documented — §29]</w:t>
-      </w:r>
-    </w:p>
-    <w:bookmarkEnd w:id="26"/>
-    <w:bookmarkStart w:id="27" w:name="corrected-scoring-model-pilot"/>
+        <w:t xml:space="preserve">; the hold expires if Azure provisioning does not begin. This closes the concurrent-placement race.</w:t>
+      </w:r>
+      <w:r>
+        <w:t xml:space="preserve"> </w:t>
+      </w:r>
+      <w:r>
+        <w:rPr>
+          <w:rStyle w:val="VerbatimChar"/>
+        </w:rPr>
+        <w:t xml:space="preserve">[Documented]</w:t>
+      </w:r>
+    </w:p>
+    <w:bookmarkEnd w:id="32"/>
+    <w:bookmarkStart w:id="33" w:name="corrected-scoring-model-pilot"/>
     <w:p>
       <w:pPr>
         <w:pStyle w:val="Heading4"/>
@@ -2699,7 +2805,7 @@
         <w:rPr>
           <w:rStyle w:val="VerbatimChar"/>
         </w:rPr>
-        <w:t xml:space="preserve">[Undocumented — §28]</w:t>
+        <w:t xml:space="preserve">[Assumed]</w:t>
       </w:r>
     </w:p>
     <w:p>
@@ -2745,7 +2851,7 @@
         <w:rPr>
           <w:rStyle w:val="VerbatimChar"/>
         </w:rPr>
-        <w:t xml:space="preserve">[Undocumented — §28]</w:t>
+        <w:t xml:space="preserve">[Assumed]</w:t>
       </w:r>
     </w:p>
     <w:p>
@@ -2760,8 +2866,8 @@
         <w:t xml:space="preserve">Revised weights are proposed, not empirically validated — advisory until pilot measurement.</w:t>
       </w:r>
     </w:p>
-    <w:bookmarkEnd w:id="27"/>
-    <w:bookmarkStart w:id="28" w:name="governance-compliance-controls"/>
+    <w:bookmarkEnd w:id="33"/>
+    <w:bookmarkStart w:id="34" w:name="governance-compliance-controls"/>
     <w:p>
       <w:pPr>
         <w:pStyle w:val="Heading4"/>
@@ -2816,7 +2922,7 @@
         <w:rPr>
           <w:rStyle w:val="VerbatimChar"/>
         </w:rPr>
-        <w:t xml:space="preserve">[Documented — §27]</w:t>
+        <w:t xml:space="preserve">[Documented]</w:t>
       </w:r>
     </w:p>
     <w:p>
@@ -2855,9 +2961,9 @@
         <w:t xml:space="preserve">Belgium Central’s regional capacity-planning targets must include potential Middle East DR demand on top of in-geo Europe demand.</w:t>
       </w:r>
     </w:p>
-    <w:bookmarkEnd w:id="28"/>
-    <w:bookmarkEnd w:id="29"/>
-    <w:bookmarkStart w:id="30" w:name="consequences"/>
+    <w:bookmarkEnd w:id="34"/>
+    <w:bookmarkEnd w:id="35"/>
+    <w:bookmarkStart w:id="36" w:name="consequences"/>
     <w:p>
       <w:pPr>
         <w:pStyle w:val="Heading3"/>
@@ -2932,13 +3038,13 @@
         <w:t xml:space="preserve"> </w:t>
       </w:r>
       <w:r>
-        <w:t xml:space="preserve">fields increase implementation and snapshot-maintenance cost (backlog E07-S16, E03-S10).</w:t>
-      </w:r>
-      <w:r>
-        <w:t xml:space="preserve"> </w:t>
-      </w:r>
-      <w:r>
-        <w:t xml:space="preserve">- Sequential selection is greedy; if the region count ever exceeds 6, joint optimization should be revisited (D1 review trigger).</w:t>
+        <w:t xml:space="preserve">fields increase implementation and snapshot-maintenance cost.</w:t>
+      </w:r>
+      <w:r>
+        <w:t xml:space="preserve"> </w:t>
+      </w:r>
+      <w:r>
+        <w:t xml:space="preserve">- Sequential selection is greedy; if the region count ever exceeds 6, joint optimization should be revisited.</w:t>
       </w:r>
       <w:r>
         <w:t xml:space="preserve"> </w:t>
@@ -2950,7 +3056,7 @@
         <w:t xml:space="preserve"> </w:t>
       </w:r>
       <w:r>
-        <w:t xml:space="preserve">- Worked scoring examples remain a known gap (G-7) until per-CRG-type inputs are finalised.</w:t>
+        <w:t xml:space="preserve">- Worked scoring examples remain a known gap until per-CRG-type inputs are finalised.</w:t>
       </w:r>
     </w:p>
     <w:p>
@@ -2968,11 +3074,11 @@
         <w:t xml:space="preserve"> </w:t>
       </w:r>
       <w:r>
-        <w:t xml:space="preserve">- CRG_Score (RCW) is demoted from a primary scoring input to a monitoring-only signal (D9).</w:t>
-      </w:r>
-    </w:p>
-    <w:bookmarkEnd w:id="30"/>
-    <w:bookmarkStart w:id="31" w:name="alternatives-considered"/>
+        <w:t xml:space="preserve">- CRG_Score (Regional Capacity Weight) is demoted from a primary scoring input to a monitoring-only signal.</w:t>
+      </w:r>
+    </w:p>
+    <w:bookmarkEnd w:id="36"/>
+    <w:bookmarkStart w:id="37" w:name="alternatives-considered"/>
     <w:p>
       <w:pPr>
         <w:pStyle w:val="Heading3"/>
@@ -3060,7 +3166,7 @@
               <w:rPr>
                 <w:rStyle w:val="VerbatimChar"/>
               </w:rPr>
-              <w:t xml:space="preserve">[D1]</w:t>
+              <w:t xml:space="preserve">[Decided]</w:t>
             </w:r>
           </w:p>
         </w:tc>
@@ -3099,7 +3205,7 @@
               <w:rPr>
                 <w:rStyle w:val="VerbatimChar"/>
               </w:rPr>
-              <w:t xml:space="preserve">[D9]</w:t>
+              <w:t xml:space="preserve">[Decided]</w:t>
             </w:r>
           </w:p>
         </w:tc>
@@ -3138,7 +3244,7 @@
               <w:rPr>
                 <w:rStyle w:val="VerbatimChar"/>
               </w:rPr>
-              <w:t xml:space="preserve">[D4]</w:t>
+              <w:t xml:space="preserve">[Decided]</w:t>
             </w:r>
           </w:p>
         </w:tc>
@@ -3177,7 +3283,7 @@
               <w:rPr>
                 <w:rStyle w:val="VerbatimChar"/>
               </w:rPr>
-              <w:t xml:space="preserve">[§27]</w:t>
+              <w:t xml:space="preserve">[Documented]</w:t>
             </w:r>
           </w:p>
         </w:tc>
@@ -3190,9 +3296,9 @@
         </w:pict>
       </w:r>
     </w:p>
-    <w:bookmarkEnd w:id="31"/>
-    <w:bookmarkEnd w:id="32"/>
-    <w:bookmarkStart w:id="40" w:name="adr-002-quota-and-capacity-management"/>
+    <w:bookmarkEnd w:id="37"/>
+    <w:bookmarkEnd w:id="38"/>
+    <w:bookmarkStart w:id="49" w:name="adr-002-quota-and-capacity-management"/>
     <w:p>
       <w:pPr>
         <w:pStyle w:val="Heading2"/>
@@ -3258,56 +3364,16 @@
           <w:bCs/>
           <w:b/>
         </w:rPr>
-        <w:t xml:space="preserve">Related decisions:</w:t>
-      </w:r>
-      <w:r>
-        <w:t xml:space="preserve"> </w:t>
-      </w:r>
-      <w:r>
-        <w:t xml:space="preserve">D6, D7, D9; HC-2, HC-3, HC-7</w:t>
-      </w:r>
-      <w:r>
-        <w:br/>
-      </w:r>
-      <w:r>
-        <w:rPr>
-          <w:bCs/>
-          <w:b/>
-        </w:rPr>
-        <w:t xml:space="preserve">Source:</w:t>
-      </w:r>
-      <w:r>
-        <w:t xml:space="preserve"> </w:t>
-      </w:r>
-      <w:r>
-        <w:rPr>
-          <w:rStyle w:val="VerbatimChar"/>
-        </w:rPr>
-        <w:t xml:space="preserve">multi_region_placement_design.md</w:t>
-      </w:r>
-      <w:r>
-        <w:t xml:space="preserve"> </w:t>
-      </w:r>
-      <w:r>
-        <w:t xml:space="preserve">§Quota Groups;</w:t>
-      </w:r>
-      <w:r>
-        <w:t xml:space="preserve"> </w:t>
-      </w:r>
-      <w:r>
-        <w:rPr>
-          <w:rStyle w:val="VerbatimChar"/>
-        </w:rPr>
-        <w:t xml:space="preserve">design_change_summary.md</w:t>
-      </w:r>
-      <w:r>
-        <w:t xml:space="preserve"> </w:t>
-      </w:r>
-      <w:r>
-        <w:t xml:space="preserve">QG-1..QG-12</w:t>
-      </w:r>
-    </w:p>
-    <w:bookmarkStart w:id="33" w:name="context-1"/>
+        <w:t xml:space="preserve">Related constraints:</w:t>
+      </w:r>
+      <w:r>
+        <w:t xml:space="preserve"> </w:t>
+      </w:r>
+      <w:r>
+        <w:t xml:space="preserve">HC-2, HC-3, HC-7 (hard constraints)</w:t>
+      </w:r>
+    </w:p>
+    <w:bookmarkStart w:id="39" w:name="context-1"/>
     <w:p>
       <w:pPr>
         <w:pStyle w:val="Heading3"/>
@@ -3345,7 +3411,7 @@
         <w:pStyle w:val="Compact"/>
       </w:pPr>
       <w:r>
-        <w:t xml:space="preserve">Make emergency capacity transfer (ADR-003)</w:t>
+        <w:t xml:space="preserve">Make emergency capacity transfer (see ADR-003)</w:t>
       </w:r>
       <w:r>
         <w:t xml:space="preserve"> </w:t>
@@ -3428,8 +3494,8 @@
         <w:t xml:space="preserve">natively support intra-group sub-reservations — so any sub-partition of a group pool must be enforced by the engine.</w:t>
       </w:r>
     </w:p>
-    <w:bookmarkEnd w:id="33"/>
-    <w:bookmarkStart w:id="37" w:name="decision-1"/>
+    <w:bookmarkEnd w:id="39"/>
+    <w:bookmarkStart w:id="46" w:name="decision-1"/>
     <w:p>
       <w:pPr>
         <w:pStyle w:val="Heading3"/>
@@ -3518,7 +3584,7 @@
         <w:rPr>
           <w:rStyle w:val="VerbatimChar"/>
         </w:rPr>
-        <w:t xml:space="preserve">[Decided — D6]</w:t>
+        <w:t xml:space="preserve">[Decided]</w:t>
       </w:r>
     </w:p>
     <w:p>
@@ -3572,7 +3638,7 @@
         <w:rPr>
           <w:rStyle w:val="VerbatimChar"/>
         </w:rPr>
-        <w:t xml:space="preserve">[Decided — D7]</w:t>
+        <w:t xml:space="preserve">[Decided]</w:t>
       </w:r>
     </w:p>
     <w:p>
@@ -3647,7 +3713,7 @@
         <w:rPr>
           <w:rStyle w:val="VerbatimChar"/>
         </w:rPr>
-        <w:t xml:space="preserve">[Decided — D7]</w:t>
+        <w:t xml:space="preserve">[Decided]</w:t>
       </w:r>
     </w:p>
     <w:p>
@@ -3754,7 +3820,7 @@
         <w:rPr>
           <w:rStyle w:val="VerbatimChar"/>
         </w:rPr>
-        <w:t xml:space="preserve">[Decided — D9]</w:t>
+        <w:t xml:space="preserve">[Decided]</w:t>
       </w:r>
     </w:p>
     <w:p>
@@ -3816,7 +3882,7 @@
         <w:rPr>
           <w:rStyle w:val="VerbatimChar"/>
         </w:rPr>
-        <w:t xml:space="preserve">[Decided — D7]</w:t>
+        <w:t xml:space="preserve">[Decided]</w:t>
       </w:r>
     </w:p>
     <w:p>
@@ -3846,7 +3912,7 @@
         <w:rPr>
           <w:rStyle w:val="VerbatimChar"/>
         </w:rPr>
-        <w:t xml:space="preserve">[Decided — D6]</w:t>
+        <w:t xml:space="preserve">[Decided]</w:t>
       </w:r>
     </w:p>
     <w:p>
@@ -3891,7 +3957,7 @@
           <w:bCs/>
           <w:b/>
         </w:rPr>
-        <w:t xml:space="preserve">Worked POC topology (GP-06):</w:t>
+        <w:t xml:space="preserve">Worked topology example:</w:t>
       </w:r>
       <w:r>
         <w:t xml:space="preserve"> </w:t>
@@ -3900,7 +3966,72 @@
         <w:t xml:space="preserve">Prod group 128 vCPU; NonProd+DR group 80 vCPU; DR floor 32 vCPU → effective NonProd ceiling 48 vCPU.</w:t>
       </w:r>
     </w:p>
-    <w:bookmarkStart w:id="34" w:name="group-accounting-formulas-normative"/>
+    <w:p>
+      <w:pPr>
+        <w:pStyle w:val="CaptionedFigure"/>
+      </w:pPr>
+      <w:r>
+        <w:drawing>
+          <wp:inline>
+            <wp:extent cx="5334000" cy="4769303"/>
+            <wp:effectExtent b="0" l="0" r="0" t="0"/>
+            <wp:docPr descr="Figure 3. Two-quota-group-per-region model — an isolated Prod-only group and a shared NonProd+DR group with the engine-enforced DR floor and the effective NonProd ceiling." title="" id="41" name="Picture"/>
+            <a:graphic>
+              <a:graphicData uri="http://schemas.openxmlformats.org/drawingml/2006/picture">
+                <pic:pic>
+                  <pic:nvPicPr>
+                    <pic:cNvPr descr="adr/diagrams/adr002_quota_groups.png" id="42" name="Picture"/>
+                    <pic:cNvPicPr>
+                      <a:picLocks noChangeArrowheads="1" noChangeAspect="1"/>
+                    </pic:cNvPicPr>
+                  </pic:nvPicPr>
+                  <pic:blipFill>
+                    <a:blip r:embed="rId40"/>
+                    <a:stretch>
+                      <a:fillRect/>
+                    </a:stretch>
+                  </pic:blipFill>
+                  <pic:spPr bwMode="auto">
+                    <a:xfrm>
+                      <a:off x="0" y="0"/>
+                      <a:ext cx="5334000" cy="4769303"/>
+                    </a:xfrm>
+                    <a:prstGeom prst="rect">
+                      <a:avLst/>
+                    </a:prstGeom>
+                    <a:noFill/>
+                    <a:ln w="9525">
+                      <a:noFill/>
+                      <a:headEnd/>
+                      <a:tailEnd/>
+                    </a:ln>
+                  </pic:spPr>
+                </pic:pic>
+              </a:graphicData>
+            </a:graphic>
+          </wp:inline>
+        </w:drawing>
+      </w:r>
+    </w:p>
+    <w:p>
+      <w:pPr>
+        <w:pStyle w:val="ImageCaption"/>
+      </w:pPr>
+      <w:r>
+        <w:rPr>
+          <w:bCs/>
+          <w:b/>
+        </w:rPr>
+        <w:t xml:space="preserve">Figure 3.</w:t>
+      </w:r>
+      <w:r>
+        <w:t xml:space="preserve"> </w:t>
+      </w:r>
+      <w:r>
+        <w:t xml:space="preserve">Two-quota-group-per-region model — an isolated Prod-only group and a shared NonProd+DR group with the engine-enforced DR floor and the effective NonProd ceiling.</w:t>
+      </w:r>
+    </w:p>
+    <w:bookmarkStart w:id="43" w:name="group-accounting-formulas-normative"/>
     <w:p>
       <w:pPr>
         <w:pStyle w:val="Heading4"/>
@@ -3939,7 +4070,7 @@
         <w:rPr>
           <w:rStyle w:val="VerbatimChar"/>
         </w:rPr>
-        <w:t xml:space="preserve">[Documented — §26]</w:t>
+        <w:t xml:space="preserve">[Documented]</w:t>
       </w:r>
     </w:p>
     <w:p>
@@ -3980,8 +4111,8 @@
         <w:t xml:space="preserve">Group_Headroom            = Group_Limit − Group_Used</w:t>
       </w:r>
     </w:p>
-    <w:bookmarkEnd w:id="34"/>
-    <w:bookmarkStart w:id="35" w:name="exact-enforcement-controls"/>
+    <w:bookmarkEnd w:id="43"/>
+    <w:bookmarkStart w:id="44" w:name="exact-enforcement-controls"/>
     <w:p>
       <w:pPr>
         <w:pStyle w:val="Heading4"/>
@@ -4040,7 +4171,7 @@
         <w:rPr>
           <w:rStyle w:val="VerbatimChar"/>
         </w:rPr>
-        <w:t xml:space="preserve">[Documented — §26]</w:t>
+        <w:t xml:space="preserve">[Documented]</w:t>
       </w:r>
     </w:p>
     <w:p>
@@ -4171,8 +4302,8 @@
         <w:t xml:space="preserve">— no fixed propagation SLA is assumed.</w:t>
       </w:r>
     </w:p>
-    <w:bookmarkEnd w:id="35"/>
-    <w:bookmarkStart w:id="36" w:name="grouptype-preview-dependency-fc-11"/>
+    <w:bookmarkEnd w:id="44"/>
+    <w:bookmarkStart w:id="45" w:name="grouptype-preview-dependency"/>
     <w:p>
       <w:pPr>
         <w:pStyle w:val="Heading4"/>
@@ -4187,7 +4318,7 @@
         <w:t xml:space="preserve"> </w:t>
       </w:r>
       <w:r>
-        <w:t xml:space="preserve">Preview Dependency (FC-11)</w:t>
+        <w:t xml:space="preserve">Preview Dependency</w:t>
       </w:r>
     </w:p>
     <w:p>
@@ -4262,7 +4393,7 @@
         <w:rPr>
           <w:rStyle w:val="VerbatimChar"/>
         </w:rPr>
-        <w:t xml:space="preserve">[Documented — Azure Quota REST API reference]</w:t>
+        <w:t xml:space="preserve">[Documented]</w:t>
       </w:r>
       <w:r>
         <w:t xml:space="preserve"> </w:t>
@@ -4325,12 +4456,12 @@
         <w:t xml:space="preserve"> </w:t>
       </w:r>
       <w:r>
-        <w:t xml:space="preserve">is ever relied upon to drop the engine’s own subscription-level check, that dependency must pass the preview-acceptance gate (POC-30) and a Decision Log entry first. Engineering constraint: pin the exact preview API version in all quota-group calls and add version-drift detection to the platform health check.</w:t>
-      </w:r>
-    </w:p>
-    <w:bookmarkEnd w:id="36"/>
-    <w:bookmarkEnd w:id="37"/>
-    <w:bookmarkStart w:id="38" w:name="consequences-1"/>
+        <w:t xml:space="preserve">is ever relied upon to drop the engine’s own subscription-level check, that dependency must pass a preview-acceptance proof-of-concept and a recorded decision first. Engineering constraint: pin the exact preview API version in all quota-group calls and add version-drift detection to the platform health check.</w:t>
+      </w:r>
+    </w:p>
+    <w:bookmarkEnd w:id="45"/>
+    <w:bookmarkEnd w:id="46"/>
+    <w:bookmarkStart w:id="47" w:name="consequences-1"/>
     <w:p>
       <w:pPr>
         <w:pStyle w:val="Heading3"/>
@@ -4446,7 +4577,7 @@
         <w:rPr>
           <w:rStyle w:val="VerbatimChar"/>
         </w:rPr>
-        <w:t xml:space="preserve">[D6]</w:t>
+        <w:t xml:space="preserve">[Decided]</w:t>
       </w:r>
       <w:r>
         <w:t xml:space="preserve"> </w:t>
@@ -4476,7 +4607,7 @@
         <w:rPr>
           <w:rStyle w:val="VerbatimChar"/>
         </w:rPr>
-        <w:t xml:space="preserve">[D7]</w:t>
+        <w:t xml:space="preserve">[Decided]</w:t>
       </w:r>
       <w:r>
         <w:t xml:space="preserve"> </w:t>
@@ -4519,7 +4650,7 @@
         <w:t xml:space="preserve"> </w:t>
       </w:r>
       <w:r>
-        <w:t xml:space="preserve">— Blocker B-1 (POC-30); if</w:t>
+        <w:t xml:space="preserve">— validated by proof-of-concept before rollout; if</w:t>
       </w:r>
       <w:r>
         <w:t xml:space="preserve"> </w:t>
@@ -4537,8 +4668,8 @@
         <w:t xml:space="preserve">returns 404 in the target tenant/region, escalate to Azure Support.</w:t>
       </w:r>
     </w:p>
-    <w:bookmarkEnd w:id="38"/>
-    <w:bookmarkStart w:id="39" w:name="alternatives-considered-1"/>
+    <w:bookmarkEnd w:id="47"/>
+    <w:bookmarkStart w:id="48" w:name="alternatives-considered-1"/>
     <w:p>
       <w:pPr>
         <w:pStyle w:val="Heading3"/>
@@ -4626,7 +4757,7 @@
               <w:rPr>
                 <w:rStyle w:val="VerbatimChar"/>
               </w:rPr>
-              <w:t xml:space="preserve">[D6]</w:t>
+              <w:t xml:space="preserve">[Decided]</w:t>
             </w:r>
           </w:p>
         </w:tc>
@@ -4671,7 +4802,7 @@
               <w:rPr>
                 <w:rStyle w:val="VerbatimChar"/>
               </w:rPr>
-              <w:t xml:space="preserve">[D6]</w:t>
+              <w:t xml:space="preserve">[Decided]</w:t>
             </w:r>
           </w:p>
         </w:tc>
@@ -4716,7 +4847,7 @@
               <w:rPr>
                 <w:rStyle w:val="VerbatimChar"/>
               </w:rPr>
-              <w:t xml:space="preserve">[D6]</w:t>
+              <w:t xml:space="preserve">[Decided]</w:t>
             </w:r>
           </w:p>
         </w:tc>
@@ -4755,7 +4886,7 @@
               <w:rPr>
                 <w:rStyle w:val="VerbatimChar"/>
               </w:rPr>
-              <w:t xml:space="preserve">[D7]</w:t>
+              <w:t xml:space="preserve">[Decided]</w:t>
             </w:r>
           </w:p>
         </w:tc>
@@ -4768,9 +4899,9 @@
         </w:pict>
       </w:r>
     </w:p>
-    <w:bookmarkEnd w:id="39"/>
-    <w:bookmarkEnd w:id="40"/>
-    <w:bookmarkStart w:id="48" w:name="Xb03910cb3c9a0c0ecb9b813c5fa342521392efc"/>
+    <w:bookmarkEnd w:id="48"/>
+    <w:bookmarkEnd w:id="49"/>
+    <w:bookmarkStart w:id="63" w:name="Xb03910cb3c9a0c0ecb9b813c5fa342521392efc"/>
     <w:p>
       <w:pPr>
         <w:pStyle w:val="Heading2"/>
@@ -4836,56 +4967,16 @@
           <w:bCs/>
           <w:b/>
         </w:rPr>
-        <w:t xml:space="preserve">Related decisions:</w:t>
-      </w:r>
-      <w:r>
-        <w:t xml:space="preserve"> </w:t>
-      </w:r>
-      <w:r>
-        <w:t xml:space="preserve">D8, D10, D11; HC-1, HC-4, HC-6; G-14, G-15</w:t>
-      </w:r>
-      <w:r>
-        <w:br/>
-      </w:r>
-      <w:r>
-        <w:rPr>
-          <w:bCs/>
-          <w:b/>
-        </w:rPr>
-        <w:t xml:space="preserve">Source:</w:t>
-      </w:r>
-      <w:r>
-        <w:t xml:space="preserve"> </w:t>
-      </w:r>
-      <w:r>
-        <w:rPr>
-          <w:rStyle w:val="VerbatimChar"/>
-        </w:rPr>
-        <w:t xml:space="preserve">multi_region_placement_design.md</w:t>
-      </w:r>
-      <w:r>
-        <w:t xml:space="preserve"> </w:t>
-      </w:r>
-      <w:r>
-        <w:t xml:space="preserve">§Emergency Capacity Transfer;</w:t>
-      </w:r>
-      <w:r>
-        <w:t xml:space="preserve"> </w:t>
-      </w:r>
-      <w:r>
-        <w:rPr>
-          <w:rStyle w:val="VerbatimChar"/>
-        </w:rPr>
-        <w:t xml:space="preserve">acrme_production_readiness_review_and_architecture.md</w:t>
-      </w:r>
-      <w:r>
-        <w:t xml:space="preserve"> </w:t>
-      </w:r>
-      <w:r>
-        <w:t xml:space="preserve">§29</w:t>
-      </w:r>
-    </w:p>
-    <w:bookmarkStart w:id="41" w:name="context-2"/>
+        <w:t xml:space="preserve">Related constraints:</w:t>
+      </w:r>
+      <w:r>
+        <w:t xml:space="preserve"> </w:t>
+      </w:r>
+      <w:r>
+        <w:t xml:space="preserve">HC-1, HC-4, HC-6 (hard constraints)</w:t>
+      </w:r>
+    </w:p>
+    <w:bookmarkStart w:id="50" w:name="context-2"/>
     <w:p>
       <w:pPr>
         <w:pStyle w:val="Heading3"/>
@@ -4954,8 +5045,8 @@
         <w:t xml:space="preserve">- A safe, tiered escalation model for expanding DR capacity during a declared event.</w:t>
       </w:r>
     </w:p>
-    <w:bookmarkEnd w:id="41"/>
-    <w:bookmarkStart w:id="45" w:name="decision-2"/>
+    <w:bookmarkEnd w:id="50"/>
+    <w:bookmarkStart w:id="60" w:name="decision-2"/>
     <w:p>
       <w:pPr>
         <w:pStyle w:val="Heading3"/>
@@ -5065,7 +5156,7 @@
         <w:rPr>
           <w:rStyle w:val="VerbatimChar"/>
         </w:rPr>
-        <w:t xml:space="preserve">[Decided — D8]</w:t>
+        <w:t xml:space="preserve">[Decided]</w:t>
       </w:r>
     </w:p>
     <w:p>
@@ -5168,7 +5259,7 @@
         <w:rPr>
           <w:rStyle w:val="VerbatimChar"/>
         </w:rPr>
-        <w:t xml:space="preserve">[Decided — D10]</w:t>
+        <w:t xml:space="preserve">[Decided]</w:t>
       </w:r>
     </w:p>
     <w:p>
@@ -5206,7 +5297,7 @@
         <w:t xml:space="preserve"> </w:t>
       </w:r>
       <w:r>
-        <w:t xml:space="preserve">(ADR-004). Emergency Transfer is</w:t>
+        <w:t xml:space="preserve">(see ADR-004). Emergency Transfer is</w:t>
       </w:r>
       <w:r>
         <w:t xml:space="preserve"> </w:t>
@@ -5273,16 +5364,16 @@
         <w:t xml:space="preserve">EngineModeState</w:t>
       </w:r>
       <w:r>
-        <w:t xml:space="preserve">, PRR §29), never automatic.</w:t>
-      </w:r>
-      <w:r>
-        <w:t xml:space="preserve"> </w:t>
-      </w:r>
-      <w:r>
-        <w:rPr>
-          <w:rStyle w:val="VerbatimChar"/>
-        </w:rPr>
-        <w:t xml:space="preserve">[Decided — D10]</w:t>
+        <w:t xml:space="preserve">), never automatic.</w:t>
+      </w:r>
+      <w:r>
+        <w:t xml:space="preserve"> </w:t>
+      </w:r>
+      <w:r>
+        <w:rPr>
+          <w:rStyle w:val="VerbatimChar"/>
+        </w:rPr>
+        <w:t xml:space="preserve">[Decided]</w:t>
       </w:r>
     </w:p>
     <w:p>
@@ -5306,7 +5397,7 @@
         <w:rPr>
           <w:rStyle w:val="VerbatimChar"/>
         </w:rPr>
-        <w:t xml:space="preserve">[Decided — D11]</w:t>
+        <w:t xml:space="preserve">[Decided]</w:t>
       </w:r>
     </w:p>
     <w:p>
@@ -5382,7 +5473,7 @@
         <w:t xml:space="preserve"> </w:t>
       </w:r>
       <w:r>
-        <w:t xml:space="preserve">because of the two-group model (ADR-002).</w:t>
+        <w:t xml:space="preserve">because of the two-group model (see ADR-002).</w:t>
       </w:r>
     </w:p>
     <w:p>
@@ -5551,7 +5642,7 @@
         <w:t xml:space="preserve"> </w:t>
       </w:r>
       <w:r>
-        <w:t xml:space="preserve">(ADR-002/D7).</w:t>
+        <w:t xml:space="preserve">(see ADR-002).</w:t>
       </w:r>
     </w:p>
     <w:p>
@@ -5588,10 +5679,75 @@
         <w:t xml:space="preserve"> </w:t>
       </w:r>
       <w:r>
-        <w:t xml:space="preserve">pending the G-14 consumer-credential model and G-15 engine-mode state machine. No invented SLA — propagation/approval times are measured and reported as unknown until observed.</w:t>
-      </w:r>
-    </w:p>
-    <w:bookmarkStart w:id="42" w:name="full-engine-state-machine-normative"/>
+        <w:t xml:space="preserve">pending the consumer-credential model and the engine-mode state machine. No invented SLA — propagation/approval times are measured and reported as unknown until observed.</w:t>
+      </w:r>
+    </w:p>
+    <w:p>
+      <w:pPr>
+        <w:pStyle w:val="CaptionedFigure"/>
+      </w:pPr>
+      <w:r>
+        <w:drawing>
+          <wp:inline>
+            <wp:extent cx="5334000" cy="17597437"/>
+            <wp:effectExtent b="0" l="0" r="0" t="0"/>
+            <wp:docPr descr="Figure 4. Three-tier Emergency Capacity Transfer escalation — Tier 1 automated, Tier 2 quota-neutral, Tier 3 destructive (blocked in Phase 1)." title="" id="52" name="Picture"/>
+            <a:graphic>
+              <a:graphicData uri="http://schemas.openxmlformats.org/drawingml/2006/picture">
+                <pic:pic>
+                  <pic:nvPicPr>
+                    <pic:cNvPr descr="adr/diagrams/adr003_transfer_tiers.png" id="53" name="Picture"/>
+                    <pic:cNvPicPr>
+                      <a:picLocks noChangeArrowheads="1" noChangeAspect="1"/>
+                    </pic:cNvPicPr>
+                  </pic:nvPicPr>
+                  <pic:blipFill>
+                    <a:blip r:embed="rId51"/>
+                    <a:stretch>
+                      <a:fillRect/>
+                    </a:stretch>
+                  </pic:blipFill>
+                  <pic:spPr bwMode="auto">
+                    <a:xfrm>
+                      <a:off x="0" y="0"/>
+                      <a:ext cx="5334000" cy="17597437"/>
+                    </a:xfrm>
+                    <a:prstGeom prst="rect">
+                      <a:avLst/>
+                    </a:prstGeom>
+                    <a:noFill/>
+                    <a:ln w="9525">
+                      <a:noFill/>
+                      <a:headEnd/>
+                      <a:tailEnd/>
+                    </a:ln>
+                  </pic:spPr>
+                </pic:pic>
+              </a:graphicData>
+            </a:graphic>
+          </wp:inline>
+        </w:drawing>
+      </w:r>
+    </w:p>
+    <w:p>
+      <w:pPr>
+        <w:pStyle w:val="ImageCaption"/>
+      </w:pPr>
+      <w:r>
+        <w:rPr>
+          <w:bCs/>
+          <w:b/>
+        </w:rPr>
+        <w:t xml:space="preserve">Figure 4.</w:t>
+      </w:r>
+      <w:r>
+        <w:t xml:space="preserve"> </w:t>
+      </w:r>
+      <w:r>
+        <w:t xml:space="preserve">Three-tier Emergency Capacity Transfer escalation — Tier 1 automated, Tier 2 quota-neutral, Tier 3 destructive (blocked in Phase 1).</w:t>
+      </w:r>
+    </w:p>
+    <w:bookmarkStart w:id="57" w:name="full-engine-state-machine-normative"/>
     <w:p>
       <w:pPr>
         <w:pStyle w:val="Heading4"/>
@@ -5630,16 +5786,16 @@
         <w:t xml:space="preserve"> </w:t>
       </w:r>
       <w:r>
-        <w:t xml:space="preserve">persisted in Cosmos DB with conditional writes, transition guards, and recovery tests — a production blocker until implemented (G-15):</w:t>
-      </w:r>
-      <w:r>
-        <w:t xml:space="preserve"> </w:t>
-      </w:r>
-      <w:r>
-        <w:rPr>
-          <w:rStyle w:val="VerbatimChar"/>
-        </w:rPr>
-        <w:t xml:space="preserve">[Documented — §29]</w:t>
+        <w:t xml:space="preserve">persisted in Cosmos DB with conditional writes, transition guards, and recovery tests — a production blocker until implemented:</w:t>
+      </w:r>
+      <w:r>
+        <w:t xml:space="preserve"> </w:t>
+      </w:r>
+      <w:r>
+        <w:rPr>
+          <w:rStyle w:val="VerbatimChar"/>
+        </w:rPr>
+        <w:t xml:space="preserve">[Documented]</w:t>
       </w:r>
     </w:p>
     <w:tbl>
@@ -5929,8 +6085,73 @@
         <w:t xml:space="preserve">— never automatic.</w:t>
       </w:r>
     </w:p>
-    <w:bookmarkEnd w:id="42"/>
-    <w:bookmarkStart w:id="43" w:name="enginemodestate-entity"/>
+    <w:p>
+      <w:pPr>
+        <w:pStyle w:val="CaptionedFigure"/>
+      </w:pPr>
+      <w:r>
+        <w:drawing>
+          <wp:inline>
+            <wp:extent cx="5334000" cy="3918857"/>
+            <wp:effectExtent b="0" l="0" r="0" t="0"/>
+            <wp:docPr descr="Figure 5. Five-state engine mode machine — every transition is operator-gated with dual approval." title="" id="55" name="Picture"/>
+            <a:graphic>
+              <a:graphicData uri="http://schemas.openxmlformats.org/drawingml/2006/picture">
+                <pic:pic>
+                  <pic:nvPicPr>
+                    <pic:cNvPr descr="adr/diagrams/adr003_state_machine.png" id="56" name="Picture"/>
+                    <pic:cNvPicPr>
+                      <a:picLocks noChangeArrowheads="1" noChangeAspect="1"/>
+                    </pic:cNvPicPr>
+                  </pic:nvPicPr>
+                  <pic:blipFill>
+                    <a:blip r:embed="rId54"/>
+                    <a:stretch>
+                      <a:fillRect/>
+                    </a:stretch>
+                  </pic:blipFill>
+                  <pic:spPr bwMode="auto">
+                    <a:xfrm>
+                      <a:off x="0" y="0"/>
+                      <a:ext cx="5334000" cy="3918857"/>
+                    </a:xfrm>
+                    <a:prstGeom prst="rect">
+                      <a:avLst/>
+                    </a:prstGeom>
+                    <a:noFill/>
+                    <a:ln w="9525">
+                      <a:noFill/>
+                      <a:headEnd/>
+                      <a:tailEnd/>
+                    </a:ln>
+                  </pic:spPr>
+                </pic:pic>
+              </a:graphicData>
+            </a:graphic>
+          </wp:inline>
+        </w:drawing>
+      </w:r>
+    </w:p>
+    <w:p>
+      <w:pPr>
+        <w:pStyle w:val="ImageCaption"/>
+      </w:pPr>
+      <w:r>
+        <w:rPr>
+          <w:bCs/>
+          <w:b/>
+        </w:rPr>
+        <w:t xml:space="preserve">Figure 5.</w:t>
+      </w:r>
+      <w:r>
+        <w:t xml:space="preserve"> </w:t>
+      </w:r>
+      <w:r>
+        <w:t xml:space="preserve">Five-state engine mode machine — every transition is operator-gated with dual approval.</w:t>
+      </w:r>
+    </w:p>
+    <w:bookmarkEnd w:id="57"/>
+    <w:bookmarkStart w:id="58" w:name="enginemodestate-entity"/>
     <w:p>
       <w:pPr>
         <w:pStyle w:val="Heading4"/>
@@ -5962,11 +6183,11 @@
         <w:rPr>
           <w:rStyle w:val="VerbatimChar"/>
         </w:rPr>
-        <w:t xml:space="preserve">[Documented — §29]</w:t>
-      </w:r>
-    </w:p>
-    <w:bookmarkEnd w:id="43"/>
-    <w:bookmarkStart w:id="44" w:name="dr-activation-semantics"/>
+        <w:t xml:space="preserve">[Documented]</w:t>
+      </w:r>
+    </w:p>
+    <w:bookmarkEnd w:id="58"/>
+    <w:bookmarkStart w:id="59" w:name="dr-activation-semantics"/>
     <w:p>
       <w:pPr>
         <w:pStyle w:val="Heading4"/>
@@ -6021,21 +6242,21 @@
         <w:t xml:space="preserve"> </w:t>
       </w:r>
       <w:r>
-        <w:t xml:space="preserve">automatically authorize Tier 2 or Tier 3. Each tier is independently gated. The DR orchestrator validates group+subscription quota and CR/sharing state before starting any approved failover deployment, and records active-or-incident-hold state back to the state service.</w:t>
-      </w:r>
-      <w:r>
-        <w:t xml:space="preserve"> </w:t>
-      </w:r>
-      <w:r>
-        <w:rPr>
-          <w:rStyle w:val="VerbatimChar"/>
-        </w:rPr>
-        <w:t xml:space="preserve">[Documented — §31]</w:t>
-      </w:r>
-    </w:p>
-    <w:bookmarkEnd w:id="44"/>
-    <w:bookmarkEnd w:id="45"/>
-    <w:bookmarkStart w:id="46" w:name="consequences-2"/>
+        <w:t xml:space="preserve">automatically authorize Tier 2 or Tier 3. Each tier is independently gated. The DR orchestrator validates group and subscription quota and CR/sharing state before starting any approved failover deployment, and records active-or-incident-hold state back to the state service.</w:t>
+      </w:r>
+      <w:r>
+        <w:t xml:space="preserve"> </w:t>
+      </w:r>
+      <w:r>
+        <w:rPr>
+          <w:rStyle w:val="VerbatimChar"/>
+        </w:rPr>
+        <w:t xml:space="preserve">[Documented]</w:t>
+      </w:r>
+    </w:p>
+    <w:bookmarkEnd w:id="59"/>
+    <w:bookmarkEnd w:id="60"/>
+    <w:bookmarkStart w:id="61" w:name="consequences-2"/>
     <w:p>
       <w:pPr>
         <w:pStyle w:val="Heading3"/>
@@ -6181,7 +6402,7 @@
         <w:t xml:space="preserve"> </w:t>
       </w:r>
       <w:r>
-        <w:t xml:space="preserve">until G-14 (Managed Identity vs cross-tenant SP credential model) and G-15 (state machine) are resolved — a known Phase-1 limitation.</w:t>
+        <w:t xml:space="preserve">until the consumer-credential model (Managed Identity vs cross-tenant service-principal) and the engine-mode state machine are resolved — a known Phase-1 limitation.</w:t>
       </w:r>
       <w:r>
         <w:t xml:space="preserve"> </w:t>
@@ -6220,8 +6441,8 @@
         <w:t xml:space="preserve">fields to evaluate HC-6.</w:t>
       </w:r>
     </w:p>
-    <w:bookmarkEnd w:id="46"/>
-    <w:bookmarkStart w:id="47" w:name="alternatives-considered-2"/>
+    <w:bookmarkEnd w:id="61"/>
+    <w:bookmarkStart w:id="62" w:name="alternatives-considered-2"/>
     <w:p>
       <w:pPr>
         <w:pStyle w:val="Heading3"/>
@@ -6303,7 +6524,7 @@
               <w:rPr>
                 <w:rStyle w:val="VerbatimChar"/>
               </w:rPr>
-              <w:t xml:space="preserve">[D8]</w:t>
+              <w:t xml:space="preserve">[Decided]</w:t>
             </w:r>
           </w:p>
         </w:tc>
@@ -6342,7 +6563,7 @@
               <w:rPr>
                 <w:rStyle w:val="VerbatimChar"/>
               </w:rPr>
-              <w:t xml:space="preserve">[D8]</w:t>
+              <w:t xml:space="preserve">[Decided]</w:t>
             </w:r>
           </w:p>
         </w:tc>
@@ -6381,7 +6602,7 @@
               <w:rPr>
                 <w:rStyle w:val="VerbatimChar"/>
               </w:rPr>
-              <w:t xml:space="preserve">[D10]</w:t>
+              <w:t xml:space="preserve">[Decided]</w:t>
             </w:r>
           </w:p>
         </w:tc>
@@ -6420,7 +6641,7 @@
               <w:rPr>
                 <w:rStyle w:val="VerbatimChar"/>
               </w:rPr>
-              <w:t xml:space="preserve">[D10]</w:t>
+              <w:t xml:space="preserve">[Decided]</w:t>
             </w:r>
           </w:p>
         </w:tc>
@@ -6459,7 +6680,7 @@
               <w:rPr>
                 <w:rStyle w:val="VerbatimChar"/>
               </w:rPr>
-              <w:t xml:space="preserve">[D11]</w:t>
+              <w:t xml:space="preserve">[Decided]</w:t>
             </w:r>
           </w:p>
         </w:tc>
@@ -6498,7 +6719,7 @@
               <w:rPr>
                 <w:rStyle w:val="VerbatimChar"/>
               </w:rPr>
-              <w:t xml:space="preserve">[D11]</w:t>
+              <w:t xml:space="preserve">[Decided]</w:t>
             </w:r>
           </w:p>
         </w:tc>
@@ -6511,9 +6732,9 @@
         </w:pict>
       </w:r>
     </w:p>
-    <w:bookmarkEnd w:id="47"/>
-    <w:bookmarkEnd w:id="48"/>
-    <w:bookmarkStart w:id="56" w:name="X26bb2dd1e6ed50cfaa8bfd7d8d9521ec21700a3"/>
+    <w:bookmarkEnd w:id="62"/>
+    <w:bookmarkEnd w:id="63"/>
+    <w:bookmarkStart w:id="74" w:name="X26bb2dd1e6ed50cfaa8bfd7d8d9521ec21700a3"/>
     <w:p>
       <w:pPr>
         <w:pStyle w:val="Heading2"/>
@@ -6579,56 +6800,16 @@
           <w:bCs/>
           <w:b/>
         </w:rPr>
-        <w:t xml:space="preserve">Related decisions:</w:t>
-      </w:r>
-      <w:r>
-        <w:t xml:space="preserve"> </w:t>
-      </w:r>
-      <w:r>
-        <w:t xml:space="preserve">D10; FR-7, FR-4.4; G-24</w:t>
-      </w:r>
-      <w:r>
-        <w:br/>
-      </w:r>
-      <w:r>
-        <w:rPr>
-          <w:bCs/>
-          <w:b/>
-        </w:rPr>
-        <w:t xml:space="preserve">Source:</w:t>
-      </w:r>
-      <w:r>
-        <w:t xml:space="preserve"> </w:t>
-      </w:r>
-      <w:r>
-        <w:rPr>
-          <w:rStyle w:val="VerbatimChar"/>
-        </w:rPr>
-        <w:t xml:space="preserve">azure_cr_management_engine_design.md</w:t>
-      </w:r>
-      <w:r>
-        <w:t xml:space="preserve"> </w:t>
-      </w:r>
-      <w:r>
-        <w:t xml:space="preserve">FR-7;</w:t>
-      </w:r>
-      <w:r>
-        <w:t xml:space="preserve"> </w:t>
-      </w:r>
-      <w:r>
-        <w:rPr>
-          <w:rStyle w:val="VerbatimChar"/>
-        </w:rPr>
-        <w:t xml:space="preserve">acrme_production_readiness_review_and_architecture.md</w:t>
-      </w:r>
-      <w:r>
-        <w:t xml:space="preserve"> </w:t>
-      </w:r>
-      <w:r>
-        <w:t xml:space="preserve">§Forecast/§30</w:t>
-      </w:r>
-    </w:p>
-    <w:bookmarkStart w:id="49" w:name="context-3"/>
+        <w:t xml:space="preserve">Related constraints:</w:t>
+      </w:r>
+      <w:r>
+        <w:t xml:space="preserve"> </w:t>
+      </w:r>
+      <w:r>
+        <w:t xml:space="preserve">HC-3 (applied at increase-execution time)</w:t>
+      </w:r>
+    </w:p>
+    <w:bookmarkStart w:id="64" w:name="context-3"/>
     <w:p>
       <w:pPr>
         <w:pStyle w:val="Heading3"/>
@@ -6658,11 +6839,11 @@
         <w:t xml:space="preserve"> </w:t>
       </w:r>
       <w:r>
-        <w:t xml:space="preserve">ever autonomously performing material or destructive changes in Phase 1. This growth path must be architecturally distinct from crisis operations (ADR-003).</w:t>
-      </w:r>
-    </w:p>
-    <w:bookmarkEnd w:id="49"/>
-    <w:bookmarkStart w:id="53" w:name="decision-3"/>
+        <w:t xml:space="preserve">ever autonomously performing material or destructive changes in Phase 1. This growth path must be architecturally distinct from crisis operations (see ADR-003).</w:t>
+      </w:r>
+    </w:p>
+    <w:bookmarkEnd w:id="64"/>
+    <w:bookmarkStart w:id="71" w:name="decision-3"/>
     <w:p>
       <w:pPr>
         <w:pStyle w:val="Heading3"/>
@@ -6734,7 +6915,7 @@
         <w:rPr>
           <w:rStyle w:val="VerbatimChar"/>
         </w:rPr>
-        <w:t xml:space="preserve">[Documented — FR-7.1/7.6]</w:t>
+        <w:t xml:space="preserve">[Documented]</w:t>
       </w:r>
     </w:p>
     <w:p>
@@ -6758,7 +6939,7 @@
         <w:rPr>
           <w:rStyle w:val="VerbatimChar"/>
         </w:rPr>
-        <w:t xml:space="preserve">[Documented — FR-7.3]</w:t>
+        <w:t xml:space="preserve">[Documented]</w:t>
       </w:r>
     </w:p>
     <w:p>
@@ -6858,7 +7039,7 @@
         <w:rPr>
           <w:rStyle w:val="VerbatimChar"/>
         </w:rPr>
-        <w:t xml:space="preserve">[Documented — FR-7.4]</w:t>
+        <w:t xml:space="preserve">[Documented]</w:t>
       </w:r>
     </w:p>
     <w:p>
@@ -6935,7 +7116,7 @@
         <w:rPr>
           <w:rStyle w:val="VerbatimChar"/>
         </w:rPr>
-        <w:t xml:space="preserve">[Decided — D10; Derived — §30, G-24]</w:t>
+        <w:t xml:space="preserve">[Decided]</w:t>
       </w:r>
     </w:p>
     <w:p>
@@ -6965,16 +7146,16 @@
         <w:t xml:space="preserve">Microsoft.Capacity/.../serviceLimits</w:t>
       </w:r>
       <w:r>
-        <w:t xml:space="preserve">) — at group level where Quota Groups apply (ADR-002) — subject to the same operator-approval gate.</w:t>
-      </w:r>
-      <w:r>
-        <w:t xml:space="preserve"> </w:t>
-      </w:r>
-      <w:r>
-        <w:rPr>
-          <w:rStyle w:val="VerbatimChar"/>
-        </w:rPr>
-        <w:t xml:space="preserve">[Documented — FR-4.4]</w:t>
+        <w:t xml:space="preserve">) — at group level where Quota Groups apply (see ADR-002) — subject to the same operator-approval gate.</w:t>
+      </w:r>
+      <w:r>
+        <w:t xml:space="preserve"> </w:t>
+      </w:r>
+      <w:r>
+        <w:rPr>
+          <w:rStyle w:val="VerbatimChar"/>
+        </w:rPr>
+        <w:t xml:space="preserve">[Documented]</w:t>
       </w:r>
     </w:p>
     <w:p>
@@ -7054,16 +7235,16 @@
         <w:t xml:space="preserve">DR_EVENT_ACTIVE</w:t>
       </w:r>
       <w:r>
-        <w:t xml:space="preserve">, keeping organic growth strictly separate from crisis transfer (ADR-003).</w:t>
-      </w:r>
-      <w:r>
-        <w:t xml:space="preserve"> </w:t>
-      </w:r>
-      <w:r>
-        <w:rPr>
-          <w:rStyle w:val="VerbatimChar"/>
-        </w:rPr>
-        <w:t xml:space="preserve">[Decided — D10]</w:t>
+        <w:t xml:space="preserve">, keeping organic growth strictly separate from crisis transfer (see ADR-003).</w:t>
+      </w:r>
+      <w:r>
+        <w:t xml:space="preserve"> </w:t>
+      </w:r>
+      <w:r>
+        <w:rPr>
+          <w:rStyle w:val="VerbatimChar"/>
+        </w:rPr>
+        <w:t xml:space="preserve">[Decided]</w:t>
       </w:r>
     </w:p>
     <w:p>
@@ -7084,10 +7265,10 @@
         <w:t xml:space="preserve"> </w:t>
       </w:r>
       <w:r>
-        <w:t xml:space="preserve">Increases only ever raise CR quantity or request more quota; guarded reduction (right-sizing) never drops a CR below its allocated count (platform floor, FR-1.6) and is itself approval-gated.</w:t>
-      </w:r>
-    </w:p>
-    <w:bookmarkStart w:id="50" w:name="Xf1426b79a09c525d9ee2bfb22640520d79a16bd"/>
+        <w:t xml:space="preserve">Increases only ever raise CR quantity or request more quota; guarded reduction (right-sizing) never drops a CR below its allocated count (the platform floor) and is itself approval-gated.</w:t>
+      </w:r>
+    </w:p>
+    <w:bookmarkStart w:id="68" w:name="Xf1426b79a09c525d9ee2bfb22640520d79a16bd"/>
     <w:p>
       <w:pPr>
         <w:pStyle w:val="Heading4"/>
@@ -7123,7 +7304,7 @@
         <w:rPr>
           <w:rStyle w:val="VerbatimChar"/>
         </w:rPr>
-        <w:t xml:space="preserve">[Documented — §30]</w:t>
+        <w:t xml:space="preserve">[Documented]</w:t>
       </w:r>
     </w:p>
     <w:p>
@@ -7287,8 +7468,73 @@
         <w:t xml:space="preserve">Refresh the snapshot and close the request.</w:t>
       </w:r>
     </w:p>
-    <w:bookmarkEnd w:id="50"/>
-    <w:bookmarkStart w:id="51" w:name="auto-decrease-exclusion"/>
+    <w:p>
+      <w:pPr>
+        <w:pStyle w:val="CaptionedFigure"/>
+      </w:pPr>
+      <w:r>
+        <w:drawing>
+          <wp:inline>
+            <wp:extent cx="5334000" cy="24080304"/>
+            <wp:effectExtent b="0" l="0" r="0" t="0"/>
+            <wp:docPr descr="Figure 6. Ten-step steady-state capacity-increase lifecycle, running only in STEADY_STATE behind an operator-approval gate." title="" id="66" name="Picture"/>
+            <a:graphic>
+              <a:graphicData uri="http://schemas.openxmlformats.org/drawingml/2006/picture">
+                <pic:pic>
+                  <pic:nvPicPr>
+                    <pic:cNvPr descr="adr/diagrams/adr004_lifecycle.png" id="67" name="Picture"/>
+                    <pic:cNvPicPr>
+                      <a:picLocks noChangeArrowheads="1" noChangeAspect="1"/>
+                    </pic:cNvPicPr>
+                  </pic:nvPicPr>
+                  <pic:blipFill>
+                    <a:blip r:embed="rId65"/>
+                    <a:stretch>
+                      <a:fillRect/>
+                    </a:stretch>
+                  </pic:blipFill>
+                  <pic:spPr bwMode="auto">
+                    <a:xfrm>
+                      <a:off x="0" y="0"/>
+                      <a:ext cx="5334000" cy="24080304"/>
+                    </a:xfrm>
+                    <a:prstGeom prst="rect">
+                      <a:avLst/>
+                    </a:prstGeom>
+                    <a:noFill/>
+                    <a:ln w="9525">
+                      <a:noFill/>
+                      <a:headEnd/>
+                      <a:tailEnd/>
+                    </a:ln>
+                  </pic:spPr>
+                </pic:pic>
+              </a:graphicData>
+            </a:graphic>
+          </wp:inline>
+        </w:drawing>
+      </w:r>
+    </w:p>
+    <w:p>
+      <w:pPr>
+        <w:pStyle w:val="ImageCaption"/>
+      </w:pPr>
+      <w:r>
+        <w:rPr>
+          <w:bCs/>
+          <w:b/>
+        </w:rPr>
+        <w:t xml:space="preserve">Figure 6.</w:t>
+      </w:r>
+      <w:r>
+        <w:t xml:space="preserve"> </w:t>
+      </w:r>
+      <w:r>
+        <w:t xml:space="preserve">Ten-step steady-state capacity-increase lifecycle, running only in STEADY_STATE behind an operator-approval gate.</w:t>
+      </w:r>
+    </w:p>
+    <w:bookmarkEnd w:id="68"/>
+    <w:bookmarkStart w:id="69" w:name="auto-decrease-exclusion"/>
     <w:p>
       <w:pPr>
         <w:pStyle w:val="Heading4"/>
@@ -7324,11 +7570,11 @@
         <w:rPr>
           <w:rStyle w:val="VerbatimChar"/>
         </w:rPr>
-        <w:t xml:space="preserve">[Documented — §30]</w:t>
-      </w:r>
-    </w:p>
-    <w:bookmarkEnd w:id="51"/>
-    <w:bookmarkStart w:id="52" w:name="forecast-advisory-posture"/>
+        <w:t xml:space="preserve">[Documented]</w:t>
+      </w:r>
+    </w:p>
+    <w:bookmarkEnd w:id="69"/>
+    <w:bookmarkStart w:id="70" w:name="forecast-advisory-posture"/>
     <w:p>
       <w:pPr>
         <w:pStyle w:val="Heading4"/>
@@ -7388,12 +7634,12 @@
         <w:rPr>
           <w:rStyle w:val="VerbatimChar"/>
         </w:rPr>
-        <w:t xml:space="preserve">[Documented — §28]</w:t>
-      </w:r>
-    </w:p>
-    <w:bookmarkEnd w:id="52"/>
-    <w:bookmarkEnd w:id="53"/>
-    <w:bookmarkStart w:id="54" w:name="consequences-3"/>
+        <w:t xml:space="preserve">[Documented]</w:t>
+      </w:r>
+    </w:p>
+    <w:bookmarkEnd w:id="70"/>
+    <w:bookmarkEnd w:id="71"/>
+    <w:bookmarkStart w:id="72" w:name="consequences-3"/>
     <w:p>
       <w:pPr>
         <w:pStyle w:val="Heading3"/>
@@ -7468,13 +7714,13 @@
         <w:t xml:space="preserve"> </w:t>
       </w:r>
       <w:r>
-        <w:t xml:space="preserve">- Approval-gated in Phase 1 means growth is not instantaneous — acceptable because Emergency Transfer (ADR-003) covers crisis speed.</w:t>
-      </w:r>
-      <w:r>
-        <w:t xml:space="preserve"> </w:t>
-      </w:r>
-      <w:r>
-        <w:t xml:space="preserve">- Forecast accuracy depends on history; workload-tagged per-workload forecasts (FR-7.5) are only partially covered (gap G-16).</w:t>
+        <w:t xml:space="preserve">- Approval-gated in Phase 1 means growth is not instantaneous — acceptable because Emergency Transfer (see ADR-003) covers crisis speed.</w:t>
+      </w:r>
+      <w:r>
+        <w:t xml:space="preserve"> </w:t>
+      </w:r>
+      <w:r>
+        <w:t xml:space="preserve">- Forecast accuracy depends on history; workload-tagged per-workload forecasts are only partially covered.</w:t>
       </w:r>
       <w:r>
         <w:t xml:space="preserve"> </w:t>
@@ -7486,7 +7732,7 @@
         <w:t xml:space="preserve"> </w:t>
       </w:r>
       <w:r>
-        <w:t xml:space="preserve">-</w:t>
+        <w:t xml:space="preserve">- the</w:t>
       </w:r>
       <w:r>
         <w:t xml:space="preserve"> </w:t>
@@ -7501,11 +7747,11 @@
         <w:t xml:space="preserve"> </w:t>
       </w:r>
       <w:r>
-        <w:t xml:space="preserve">lifecycle (entity, approval, retry, cancellation) is still a backlog item (G-24) requiring an end-to-end approved-increase test.</w:t>
-      </w:r>
-    </w:p>
-    <w:bookmarkEnd w:id="54"/>
-    <w:bookmarkStart w:id="55" w:name="alternatives-considered-3"/>
+        <w:t xml:space="preserve">lifecycle (entity, approval, retry, cancellation) is still a backlog item requiring an end-to-end approved-increase test.</w:t>
+      </w:r>
+    </w:p>
+    <w:bookmarkEnd w:id="72"/>
+    <w:bookmarkStart w:id="73" w:name="alternatives-considered-3"/>
     <w:p>
       <w:pPr>
         <w:pStyle w:val="Heading3"/>
@@ -7587,7 +7833,7 @@
               <w:rPr>
                 <w:rStyle w:val="VerbatimChar"/>
               </w:rPr>
-              <w:t xml:space="preserve">[§30]</w:t>
+              <w:t xml:space="preserve">[Documented]</w:t>
             </w:r>
           </w:p>
         </w:tc>
@@ -7626,7 +7872,7 @@
               <w:rPr>
                 <w:rStyle w:val="VerbatimChar"/>
               </w:rPr>
-              <w:t xml:space="preserve">[D10]</w:t>
+              <w:t xml:space="preserve">[Decided]</w:t>
             </w:r>
           </w:p>
         </w:tc>
@@ -7665,7 +7911,7 @@
               <w:rPr>
                 <w:rStyle w:val="VerbatimChar"/>
               </w:rPr>
-              <w:t xml:space="preserve">[PRR §—]</w:t>
+              <w:t xml:space="preserve">[Assumed]</w:t>
             </w:r>
           </w:p>
         </w:tc>
@@ -7704,7 +7950,7 @@
               <w:rPr>
                 <w:rStyle w:val="VerbatimChar"/>
               </w:rPr>
-              <w:t xml:space="preserve">[FR-7.4]</w:t>
+              <w:t xml:space="preserve">[Documented]</w:t>
             </w:r>
           </w:p>
         </w:tc>
@@ -7758,7 +8004,7 @@
               <w:rPr>
                 <w:rStyle w:val="VerbatimChar"/>
               </w:rPr>
-              <w:t xml:space="preserve">[FR-7.3]</w:t>
+              <w:t xml:space="preserve">[Documented]</w:t>
             </w:r>
           </w:p>
         </w:tc>
@@ -7771,15 +8017,15 @@
         </w:pict>
       </w:r>
     </w:p>
-    <w:bookmarkEnd w:id="55"/>
-    <w:bookmarkEnd w:id="56"/>
-    <w:bookmarkStart w:id="57" w:name="appendix-a-decision-log-cross-reference"/>
+    <w:bookmarkEnd w:id="73"/>
+    <w:bookmarkEnd w:id="74"/>
+    <w:bookmarkStart w:id="75" w:name="appendix-a-adr-summary"/>
     <w:p>
       <w:pPr>
         <w:pStyle w:val="Heading2"/>
       </w:pPr>
       <w:r>
-        <w:t xml:space="preserve">Appendix A — Decision Log Cross-Reference</w:t>
+        <w:t xml:space="preserve">Appendix A — ADR Summary</w:t>
       </w:r>
     </w:p>
     <w:tbl>
@@ -7789,10 +8035,9 @@
         <w:tblLook w:firstRow="1" w:lastRow="0" w:firstColumn="0" w:lastColumn="0" w:noHBand="0" w:noVBand="0" w:val="0020"/>
       </w:tblPr>
       <w:tblGrid>
-        <w:gridCol w:w="1980"/>
-        <w:gridCol w:w="1980"/>
-        <w:gridCol w:w="1980"/>
-        <w:gridCol w:w="1980"/>
+        <w:gridCol w:w="2640"/>
+        <w:gridCol w:w="2640"/>
+        <w:gridCol w:w="2640"/>
       </w:tblGrid>
       <w:tr>
         <w:trPr>
@@ -7818,31 +8063,19 @@
               <w:jc w:val="left"/>
             </w:pPr>
             <w:r>
-              <w:t xml:space="preserve">Primary Decisions</w:t>
-            </w:r>
-          </w:p>
-        </w:tc>
-        <w:tc>
-          <w:tcPr/>
-          <w:p>
-            <w:pPr>
-              <w:pStyle w:val="Compact"/>
-              <w:jc w:val="left"/>
-            </w:pPr>
-            <w:r>
-              <w:t xml:space="preserve">Hard Constraints</w:t>
-            </w:r>
-          </w:p>
-        </w:tc>
-        <w:tc>
-          <w:tcPr/>
-          <w:p>
-            <w:pPr>
-              <w:pStyle w:val="Compact"/>
-              <w:jc w:val="left"/>
-            </w:pPr>
-            <w:r>
-              <w:t xml:space="preserve">Key Gaps/Blockers</w:t>
+              <w:t xml:space="preserve">Hard Constraints Applied</w:t>
+            </w:r>
+          </w:p>
+        </w:tc>
+        <w:tc>
+          <w:tcPr/>
+          <w:p>
+            <w:pPr>
+              <w:pStyle w:val="Compact"/>
+              <w:jc w:val="left"/>
+            </w:pPr>
+            <w:r>
+              <w:t xml:space="preserve">Key Open Items</w:t>
             </w:r>
           </w:p>
         </w:tc>
@@ -7868,18 +8101,6 @@
               <w:jc w:val="left"/>
             </w:pPr>
             <w:r>
-              <w:t xml:space="preserve">D1, D4, D5, D8, D9</w:t>
-            </w:r>
-          </w:p>
-        </w:tc>
-        <w:tc>
-          <w:tcPr/>
-          <w:p>
-            <w:pPr>
-              <w:pStyle w:val="Compact"/>
-              <w:jc w:val="left"/>
-            </w:pPr>
-            <w:r>
               <w:t xml:space="preserve">HC-1, HC-4, HC-5, HC-8, HC-9, HC-10</w:t>
             </w:r>
           </w:p>
@@ -7892,7 +8113,7 @@
               <w:jc w:val="left"/>
             </w:pPr>
             <w:r>
-              <w:t xml:space="preserve">G-7 (worked examples)</w:t>
+              <w:t xml:space="preserve">Worked scoring examples pending final per-CRG-type inputs</w:t>
             </w:r>
           </w:p>
         </w:tc>
@@ -7918,18 +8139,6 @@
               <w:jc w:val="left"/>
             </w:pPr>
             <w:r>
-              <w:t xml:space="preserve">D6, D7, D9</w:t>
-            </w:r>
-          </w:p>
-        </w:tc>
-        <w:tc>
-          <w:tcPr/>
-          <w:p>
-            <w:pPr>
-              <w:pStyle w:val="Compact"/>
-              <w:jc w:val="left"/>
-            </w:pPr>
-            <w:r>
               <w:t xml:space="preserve">HC-2, HC-3, HC-7</w:t>
             </w:r>
           </w:p>
@@ -7942,7 +8151,7 @@
               <w:jc w:val="left"/>
             </w:pPr>
             <w:r>
-              <w:t xml:space="preserve">B-1 (Quota Groups GA, POC-30)</w:t>
+              <w:t xml:space="preserve">Azure Quota Groups GA validated by proof-of-concept before rollout</w:t>
             </w:r>
           </w:p>
         </w:tc>
@@ -7968,18 +8177,6 @@
               <w:jc w:val="left"/>
             </w:pPr>
             <w:r>
-              <w:t xml:space="preserve">D8, D10, D11</w:t>
-            </w:r>
-          </w:p>
-        </w:tc>
-        <w:tc>
-          <w:tcPr/>
-          <w:p>
-            <w:pPr>
-              <w:pStyle w:val="Compact"/>
-              <w:jc w:val="left"/>
-            </w:pPr>
-            <w:r>
               <w:t xml:space="preserve">HC-1, HC-4, HC-6</w:t>
             </w:r>
           </w:p>
@@ -7992,7 +8189,7 @@
               <w:jc w:val="left"/>
             </w:pPr>
             <w:r>
-              <w:t xml:space="preserve">G-14 (credential), G-15 (engine mode), B-2 (POC-31)</w:t>
+              <w:t xml:space="preserve">Consumer-credential model and engine-mode state machine; quota-release latency measured</w:t>
             </w:r>
           </w:p>
         </w:tc>
@@ -8018,38 +8215,41 @@
               <w:jc w:val="left"/>
             </w:pPr>
             <w:r>
-              <w:t xml:space="preserve">D10</w:t>
-            </w:r>
-          </w:p>
-        </w:tc>
-        <w:tc>
-          <w:tcPr/>
-          <w:p>
-            <w:pPr>
-              <w:pStyle w:val="Compact"/>
-              <w:jc w:val="left"/>
-            </w:pPr>
-            <w:r>
-              <w:t xml:space="preserve">— (uses HC-3 at execution)</w:t>
-            </w:r>
-          </w:p>
-        </w:tc>
-        <w:tc>
-          <w:tcPr/>
-          <w:p>
-            <w:pPr>
-              <w:pStyle w:val="Compact"/>
-              <w:jc w:val="left"/>
-            </w:pPr>
-            <w:r>
-              <w:t xml:space="preserve">G-16 (workload tags), G-24 (increase entity)</w:t>
+              <w:t xml:space="preserve">HC-3 (at execution)</w:t>
+            </w:r>
+          </w:p>
+        </w:tc>
+        <w:tc>
+          <w:tcPr/>
+          <w:p>
+            <w:pPr>
+              <w:pStyle w:val="Compact"/>
+              <w:jc w:val="left"/>
+            </w:pPr>
+            <w:r>
+              <w:t xml:space="preserve">Workload-tagged forecasts;</w:t>
+            </w:r>
+            <w:r>
+              <w:t xml:space="preserve"> </w:t>
+            </w:r>
+            <w:r>
+              <w:rPr>
+                <w:rStyle w:val="VerbatimChar"/>
+              </w:rPr>
+              <w:t xml:space="preserve">CapacityIncreaseRequest</w:t>
+            </w:r>
+            <w:r>
+              <w:t xml:space="preserve"> </w:t>
+            </w:r>
+            <w:r>
+              <w:t xml:space="preserve">lifecycle end-to-end test</w:t>
             </w:r>
           </w:p>
         </w:tc>
       </w:tr>
     </w:tbl>
-    <w:bookmarkEnd w:id="57"/>
-    <w:bookmarkStart w:id="58" w:name="appendix-b-status-legend"/>
+    <w:bookmarkEnd w:id="75"/>
+    <w:bookmarkStart w:id="76" w:name="appendix-b-status-legend"/>
     <w:p>
       <w:pPr>
         <w:pStyle w:val="Heading2"/>
@@ -8218,8 +8418,8 @@
         </w:tc>
       </w:tr>
     </w:tbl>
-    <w:bookmarkEnd w:id="58"/>
-    <w:bookmarkStart w:id="59" w:name="appendix-c-evidence-tag-taxonomy"/>
+    <w:bookmarkEnd w:id="76"/>
+    <w:bookmarkStart w:id="77" w:name="appendix-c-evidence-tag-taxonomy"/>
     <w:p>
       <w:pPr>
         <w:pStyle w:val="Heading2"/>
@@ -8291,7 +8491,7 @@
               <w:jc w:val="left"/>
             </w:pPr>
             <w:r>
-              <w:t xml:space="preserve">Traceable to Azure platform documentation or a formal FR/NFR</w:t>
+              <w:t xml:space="preserve">Traceable to Azure platform behaviour or documentation</w:t>
             </w:r>
           </w:p>
         </w:tc>
@@ -8320,7 +8520,7 @@
               <w:jc w:val="left"/>
             </w:pPr>
             <w:r>
-              <w:t xml:space="preserve">Explicit design choice in the Decision Log (D1–D11)</w:t>
+              <w:t xml:space="preserve">An explicit ACRME design choice recorded in this ADR set</w:t>
             </w:r>
           </w:p>
         </w:tc>
@@ -8349,7 +8549,7 @@
               <w:jc w:val="left"/>
             </w:pPr>
             <w:r>
-              <w:t xml:space="preserve">Logical consequence of a documented constraint or decision</w:t>
+              <w:t xml:space="preserve">A logical consequence of a documented constraint or decision</w:t>
             </w:r>
           </w:p>
         </w:tc>
@@ -8378,7 +8578,7 @@
               <w:jc w:val="left"/>
             </w:pPr>
             <w:r>
-              <w:t xml:space="preserve">Architectural judgement pending POC validation</w:t>
+              <w:t xml:space="preserve">Architectural judgement pending proof-of-concept validation</w:t>
             </w:r>
           </w:p>
         </w:tc>
@@ -8422,11 +8622,11 @@
         <w:t xml:space="preserve"> </w:t>
       </w:r>
       <w:r>
-        <w:t xml:space="preserve">After POC-30 (Quota Groups GA) and POC-31 (quota release latency), and on resolution of G-14 / G-15.</w:t>
-      </w:r>
-    </w:p>
-    <w:bookmarkEnd w:id="59"/>
-    <w:bookmarkEnd w:id="60"/>
+        <w:t xml:space="preserve">After proof-of-concept validation of Azure Quota Groups GA and quota-release latency, and on resolution of the consumer-credential model and engine-mode state-machine items.</w:t>
+      </w:r>
+    </w:p>
+    <w:bookmarkEnd w:id="77"/>
+    <w:bookmarkEnd w:id="78"/>
     <w:sectPr/>
   </w:body>
 </w:document>

</xml_diff>

<commit_message>
Reconcile ACRME design to Requirements Baseline v2.2; author net-new FDD & TDD
- Author net-new Functional Design Document (FDD v1.0) and Technical Design
  Document (TDD v1.0), Markdown+Mermaid primary with PNG secondary renders
- Single governed quota pool as primary quota model with logical Prod/DR
  earmarks (QUA-004); two-group retained as exception topology (ADR-002 v2.2)
- Belgium Central -> Switzerland North as EU cross-geo DR extension (REG-002)
- max-not-sum DR destination sizing + SourceDestinationDRIndex (DR-017/018);
  new ADR-005 distributed DR reference model
- Add CustomerSeedRecord, SourceDestinationDRIndex, CVALEarmarkRecord entities
- Bump ADR-001/003/004 to v2.2; update ADR README
- Archive superseded docs (Executive Design, PRR, consolidated ADRs) with banners
- Reconcile UML summary and Hard Constraints reference to v2.2
- Render 20 new Mermaid diagrams to PNG (docs/diagrams/)
</commit_message>
<xml_diff>
--- a/docs/acrme_architecture_decision_records.docx
+++ b/docs/acrme_architecture_decision_records.docx
@@ -2,13 +2,209 @@
 <file path=word/document.xml><?xml version="1.0" encoding="utf-8"?>
 <w:document xmlns:w="http://schemas.openxmlformats.org/wordprocessingml/2006/main" xmlns:m="http://schemas.openxmlformats.org/officeDocument/2006/math" xmlns:r="http://schemas.openxmlformats.org/officeDocument/2006/relationships" xmlns:o="urn:schemas-microsoft-com:office:office" xmlns:v="urn:schemas-microsoft-com:vml" xmlns:w10="urn:schemas-microsoft-com:office:word" xmlns:a="http://schemas.openxmlformats.org/drawingml/2006/main" xmlns:pic="http://schemas.openxmlformats.org/drawingml/2006/picture" xmlns:wp="http://schemas.openxmlformats.org/drawingml/2006/wordprocessingDrawing">
   <w:body>
-    <w:bookmarkStart w:id="78" w:name="acrme-architecture-decision-records-adrs"/>
+    <w:bookmarkStart w:id="61" w:name="acrme-architecture-decision-records-adrs"/>
     <w:p>
       <w:pPr>
         <w:pStyle w:val="Heading1"/>
       </w:pPr>
       <w:r>
         <w:t xml:space="preserve">ACRME Architecture Decision Records (ADRs)</w:t>
+      </w:r>
+    </w:p>
+    <w:p>
+      <w:pPr>
+        <w:pStyle w:val="Heading2"/>
+      </w:pPr>
+      <w:bookmarkStart w:id="20" w:name="Xbfde2313b71d1ed81840698baffb3e956d3ca99"/>
+      <w:r>
+        <w:t xml:space="preserve">⚠️ ARCHIVED — SUPERSEDED by the split, v2.2 ADRs (2 Sep 2026)</w:t>
+      </w:r>
+      <w:bookmarkEnd w:id="20"/>
+    </w:p>
+    <w:p>
+      <w:pPr>
+        <w:pStyle w:val="BlockText"/>
+      </w:pPr>
+      <w:r>
+        <w:t xml:space="preserve">This</w:t>
+      </w:r>
+      <w:r>
+        <w:t xml:space="preserve"> </w:t>
+      </w:r>
+      <w:r>
+        <w:rPr>
+          <w:bCs/>
+          <w:b/>
+        </w:rPr>
+        <w:t xml:space="preserve">consolidated</w:t>
+      </w:r>
+      <w:r>
+        <w:t xml:space="preserve"> </w:t>
+      </w:r>
+      <w:r>
+        <w:t xml:space="preserve">ADR document is</w:t>
+      </w:r>
+      <w:r>
+        <w:t xml:space="preserve"> </w:t>
+      </w:r>
+      <w:r>
+        <w:rPr>
+          <w:bCs/>
+          <w:b/>
+        </w:rPr>
+        <w:t xml:space="preserve">archived</w:t>
+      </w:r>
+      <w:r>
+        <w:t xml:space="preserve">. The authoritative decision records are the individual, v2.2-aligned ADRs in</w:t>
+      </w:r>
+      <w:r>
+        <w:t xml:space="preserve"> </w:t>
+      </w:r>
+      <w:r>
+        <w:rPr>
+          <w:rStyle w:val="VerbatimChar"/>
+        </w:rPr>
+        <w:t xml:space="preserve">docs/adr/</w:t>
+      </w:r>
+      <w:r>
+        <w:t xml:space="preserve">:</w:t>
+      </w:r>
+      <w:r>
+        <w:t xml:space="preserve"> </w:t>
+      </w:r>
+      <w:r>
+        <w:rPr>
+          <w:bCs/>
+          <w:b/>
+        </w:rPr>
+        <w:t xml:space="preserve">ADR-001</w:t>
+      </w:r>
+      <w:r>
+        <w:t xml:space="preserve"> </w:t>
+      </w:r>
+      <w:r>
+        <w:t xml:space="preserve">(region selection),</w:t>
+      </w:r>
+      <w:r>
+        <w:t xml:space="preserve"> </w:t>
+      </w:r>
+      <w:r>
+        <w:rPr>
+          <w:bCs/>
+          <w:b/>
+        </w:rPr>
+        <w:t xml:space="preserve">ADR-002</w:t>
+      </w:r>
+      <w:r>
+        <w:t xml:space="preserve"> </w:t>
+      </w:r>
+      <w:r>
+        <w:t xml:space="preserve">(quota &amp; capacity —</w:t>
+      </w:r>
+      <w:r>
+        <w:t xml:space="preserve"> </w:t>
+      </w:r>
+      <w:r>
+        <w:rPr>
+          <w:bCs/>
+          <w:b/>
+        </w:rPr>
+        <w:t xml:space="preserve">single governed pool</w:t>
+      </w:r>
+      <w:r>
+        <w:t xml:space="preserve">),</w:t>
+      </w:r>
+      <w:r>
+        <w:t xml:space="preserve"> </w:t>
+      </w:r>
+      <w:r>
+        <w:rPr>
+          <w:bCs/>
+          <w:b/>
+        </w:rPr>
+        <w:t xml:space="preserve">ADR-003</w:t>
+      </w:r>
+      <w:r>
+        <w:t xml:space="preserve"> </w:t>
+      </w:r>
+      <w:r>
+        <w:t xml:space="preserve">(capacity during DR),</w:t>
+      </w:r>
+      <w:r>
+        <w:t xml:space="preserve"> </w:t>
+      </w:r>
+      <w:r>
+        <w:rPr>
+          <w:bCs/>
+          <w:b/>
+        </w:rPr>
+        <w:t xml:space="preserve">ADR-004</w:t>
+      </w:r>
+      <w:r>
+        <w:t xml:space="preserve"> </w:t>
+      </w:r>
+      <w:r>
+        <w:t xml:space="preserve">(forecast &amp; increase), and</w:t>
+      </w:r>
+      <w:r>
+        <w:t xml:space="preserve"> </w:t>
+      </w:r>
+      <w:r>
+        <w:rPr>
+          <w:bCs/>
+          <w:b/>
+        </w:rPr>
+        <w:t xml:space="preserve">ADR-005</w:t>
+      </w:r>
+      <w:r>
+        <w:t xml:space="preserve"> </w:t>
+      </w:r>
+      <w:r>
+        <w:t xml:space="preserve">(distributed DR reference model). See</w:t>
+      </w:r>
+      <w:r>
+        <w:t xml:space="preserve"> </w:t>
+      </w:r>
+      <w:r>
+        <w:rPr>
+          <w:rStyle w:val="VerbatimChar"/>
+        </w:rPr>
+        <w:t xml:space="preserve">docs/adr/README.md</w:t>
+      </w:r>
+      <w:r>
+        <w:t xml:space="preserve"> </w:t>
+      </w:r>
+      <w:r>
+        <w:t xml:space="preserve">for the index. This consolidated file has had its region references corrected (Belgium →</w:t>
+      </w:r>
+      <w:r>
+        <w:t xml:space="preserve"> </w:t>
+      </w:r>
+      <w:r>
+        <w:rPr>
+          <w:bCs/>
+          <w:b/>
+        </w:rPr>
+        <w:t xml:space="preserve">Switzerland North</w:t>
+      </w:r>
+      <w:r>
+        <w:t xml:space="preserve">) but does</w:t>
+      </w:r>
+      <w:r>
+        <w:t xml:space="preserve"> </w:t>
+      </w:r>
+      <w:r>
+        <w:rPr>
+          <w:bCs/>
+          <w:b/>
+        </w:rPr>
+        <w:t xml:space="preserve">not</w:t>
+      </w:r>
+      <w:r>
+        <w:t xml:space="preserve"> </w:t>
+      </w:r>
+      <w:r>
+        <w:t xml:space="preserve">carry the full single-pool (QUA-004) and max-not-sum (DR-017) reconciliation — use the split ADRs and the FDD/TDD for current decisions.</w:t>
       </w:r>
     </w:p>
     <w:p>
@@ -162,7 +358,7 @@
         </w:pict>
       </w:r>
     </w:p>
-    <w:bookmarkStart w:id="20" w:name="about-this-document"/>
+    <w:bookmarkStart w:id="21" w:name="about-this-document"/>
     <w:p>
       <w:pPr>
         <w:pStyle w:val="Heading2"/>
@@ -570,8 +766,8 @@
         </w:pict>
       </w:r>
     </w:p>
-    <w:bookmarkEnd w:id="20"/>
-    <w:bookmarkStart w:id="38" w:name="adr-001-region-selection"/>
+    <w:bookmarkEnd w:id="21"/>
+    <w:bookmarkStart w:id="33" w:name="adr-001-region-selection"/>
     <w:p>
       <w:pPr>
         <w:pStyle w:val="Heading2"/>
@@ -646,7 +842,7 @@
         <w:t xml:space="preserve">HC-1..HC-10 (hard constraints); VR-1..VR-11 (validation rules)</w:t>
       </w:r>
     </w:p>
-    <w:bookmarkStart w:id="21" w:name="context"/>
+    <w:bookmarkStart w:id="22" w:name="context"/>
     <w:p>
       <w:pPr>
         <w:pStyle w:val="Heading3"/>
@@ -866,8 +1062,8 @@
         <w:t xml:space="preserve">— the same inputs must always produce the same output, and every decision must be reconstructable for compliance.</w:t>
       </w:r>
     </w:p>
-    <w:bookmarkEnd w:id="21"/>
-    <w:bookmarkStart w:id="35" w:name="decision"/>
+    <w:bookmarkEnd w:id="22"/>
+    <w:bookmarkStart w:id="30" w:name="decision"/>
     <w:p>
       <w:pPr>
         <w:pStyle w:val="Heading3"/>
@@ -1241,13 +1437,13 @@
           <w:bCs/>
           <w:b/>
         </w:rPr>
-        <w:t xml:space="preserve">Belgium Central</w:t>
-      </w:r>
-      <w:r>
-        <w:t xml:space="preserve"> </w:t>
-      </w:r>
-      <w:r>
-        <w:t xml:space="preserve">via the only approved Cross-Geo Extension paths (Saudi Arabia → Belgium Central, UAE North → Belgium Central). Belgium Central must itself pass HC-1..HC-10; if it fails, the placement is rejected with an ops alert — the engine never silently substitutes another region.</w:t>
+        <w:t xml:space="preserve">Switzerland North</w:t>
+      </w:r>
+      <w:r>
+        <w:t xml:space="preserve"> </w:t>
+      </w:r>
+      <w:r>
+        <w:t xml:space="preserve">via the only approved Cross-Geo Extension paths (Saudi Arabia → Switzerland North, UAE North → Switzerland North). Switzerland North must itself pass HC-1..HC-10; if it fails, the placement is rejected with an ops alert — the engine never silently substitutes another region.</w:t>
       </w:r>
       <w:r>
         <w:t xml:space="preserve"> </w:t>
@@ -1358,54 +1554,7 @@
     </w:p>
     <w:p>
       <w:pPr>
-        <w:pStyle w:val="CaptionedFigure"/>
-      </w:pPr>
-      <w:r>
-        <w:drawing>
-          <wp:inline>
-            <wp:extent cx="5334000" cy="5442857"/>
-            <wp:effectExtent b="0" l="0" r="0" t="0"/>
-            <wp:docPr descr="Figure 1. ACRME staged placement pipeline — Stage 1 eligibility pre-filter, Stage 2 hard-constraint gate, Stage 3 environment-type-specific scoring, then sequential Prod → NonProd → DR selection." title="" id="23" name="Picture"/>
-            <a:graphic>
-              <a:graphicData uri="http://schemas.openxmlformats.org/drawingml/2006/picture">
-                <pic:pic>
-                  <pic:nvPicPr>
-                    <pic:cNvPr descr="adr/diagrams/adr001_pipeline.png" id="24" name="Picture"/>
-                    <pic:cNvPicPr>
-                      <a:picLocks noChangeArrowheads="1" noChangeAspect="1"/>
-                    </pic:cNvPicPr>
-                  </pic:nvPicPr>
-                  <pic:blipFill>
-                    <a:blip r:embed="rId22"/>
-                    <a:stretch>
-                      <a:fillRect/>
-                    </a:stretch>
-                  </pic:blipFill>
-                  <pic:spPr bwMode="auto">
-                    <a:xfrm>
-                      <a:off x="0" y="0"/>
-                      <a:ext cx="5334000" cy="5442857"/>
-                    </a:xfrm>
-                    <a:prstGeom prst="rect">
-                      <a:avLst/>
-                    </a:prstGeom>
-                    <a:noFill/>
-                    <a:ln w="9525">
-                      <a:noFill/>
-                      <a:headEnd/>
-                      <a:tailEnd/>
-                    </a:ln>
-                  </pic:spPr>
-                </pic:pic>
-              </a:graphicData>
-            </a:graphic>
-          </wp:inline>
-        </w:drawing>
-      </w:r>
-    </w:p>
-    <w:p>
-      <w:pPr>
-        <w:pStyle w:val="ImageCaption"/>
+        <w:pStyle w:val="FirstParagraph"/>
       </w:pPr>
       <w:r>
         <w:rPr>
@@ -1421,7 +1570,7 @@
         <w:t xml:space="preserve">ACRME staged placement pipeline — Stage 1 eligibility pre-filter, Stage 2 hard-constraint gate, Stage 3 environment-type-specific scoring, then sequential Prod → NonProd → DR selection.</w:t>
       </w:r>
     </w:p>
-    <w:bookmarkStart w:id="25" w:name="region-classification-model-normative"/>
+    <w:bookmarkStart w:id="23" w:name="region-classification-model-normative"/>
     <w:p>
       <w:pPr>
         <w:pStyle w:val="Heading4"/>
@@ -1564,7 +1713,7 @@
               <w:jc w:val="left"/>
             </w:pPr>
             <w:r>
-              <w:t xml:space="preserve">NA: West US 3, Central US, Canada Central · EU: Sweden Central, Belgium Central · ME: Saudi Arabia, UAE North · APAC: Japan East, Southeast Asia, Australia East</w:t>
+              <w:t xml:space="preserve">NA: West US 3, Central US, Canada Central · EU: Sweden Central, Switzerland North · ME: Saudi Arabia, UAE North · APAC: Japan East, Southeast Asia, Australia East</w:t>
             </w:r>
           </w:p>
         </w:tc>
@@ -1648,7 +1797,7 @@
               <w:jc w:val="left"/>
             </w:pPr>
             <w:r>
-              <w:t xml:space="preserve">Saudi Arabia → Belgium Central; UAE North → Belgium Central (Middle East only)</w:t>
+              <w:t xml:space="preserve">Saudi Arabia → Switzerland North; UAE North → Switzerland North (Middle East only)</w:t>
             </w:r>
           </w:p>
         </w:tc>
@@ -1678,8 +1827,8 @@
         <w:t xml:space="preserve">(HC-9), never as a scoring penalty.</w:t>
       </w:r>
     </w:p>
-    <w:bookmarkEnd w:id="25"/>
-    <w:bookmarkStart w:id="29" w:name="prod-region-input-modes"/>
+    <w:bookmarkEnd w:id="23"/>
+    <w:bookmarkStart w:id="24" w:name="prod-region-input-modes"/>
     <w:p>
       <w:pPr>
         <w:pStyle w:val="Heading4"/>
@@ -1791,54 +1940,7 @@
     </w:p>
     <w:p>
       <w:pPr>
-        <w:pStyle w:val="CaptionedFigure"/>
-      </w:pPr>
-      <w:r>
-        <w:drawing>
-          <wp:inline>
-            <wp:extent cx="5334000" cy="7136946"/>
-            <wp:effectExtent b="0" l="0" r="0" t="0"/>
-            <wp:docPr descr="Figure 2. Prod region input modes — geography-supplied (Scenario 1) versus specific-region (Scenario 2), including the restricted-region Exception Deployment Workflow." title="" id="27" name="Picture"/>
-            <a:graphic>
-              <a:graphicData uri="http://schemas.openxmlformats.org/drawingml/2006/picture">
-                <pic:pic>
-                  <pic:nvPicPr>
-                    <pic:cNvPr descr="adr/diagrams/adr001_input_modes.png" id="28" name="Picture"/>
-                    <pic:cNvPicPr>
-                      <a:picLocks noChangeArrowheads="1" noChangeAspect="1"/>
-                    </pic:cNvPicPr>
-                  </pic:nvPicPr>
-                  <pic:blipFill>
-                    <a:blip r:embed="rId26"/>
-                    <a:stretch>
-                      <a:fillRect/>
-                    </a:stretch>
-                  </pic:blipFill>
-                  <pic:spPr bwMode="auto">
-                    <a:xfrm>
-                      <a:off x="0" y="0"/>
-                      <a:ext cx="5334000" cy="7136946"/>
-                    </a:xfrm>
-                    <a:prstGeom prst="rect">
-                      <a:avLst/>
-                    </a:prstGeom>
-                    <a:noFill/>
-                    <a:ln w="9525">
-                      <a:noFill/>
-                      <a:headEnd/>
-                      <a:tailEnd/>
-                    </a:ln>
-                  </pic:spPr>
-                </pic:pic>
-              </a:graphicData>
-            </a:graphic>
-          </wp:inline>
-        </w:drawing>
-      </w:r>
-    </w:p>
-    <w:p>
-      <w:pPr>
-        <w:pStyle w:val="ImageCaption"/>
+        <w:pStyle w:val="FirstParagraph"/>
       </w:pPr>
       <w:r>
         <w:rPr>
@@ -1854,8 +1956,8 @@
         <w:t xml:space="preserve">Prod region input modes — geography-supplied (Scenario 1) versus specific-region (Scenario 2), including the restricted-region Exception Deployment Workflow.</w:t>
       </w:r>
     </w:p>
-    <w:bookmarkEnd w:id="29"/>
-    <w:bookmarkStart w:id="30" w:name="X844b545e4620926cc70c9c09d323b98bfdbf572"/>
+    <w:bookmarkEnd w:id="24"/>
+    <w:bookmarkStart w:id="25" w:name="X844b545e4620926cc70c9c09d323b98bfdbf572"/>
     <w:p>
       <w:pPr>
         <w:pStyle w:val="Heading4"/>
@@ -2183,8 +2285,8 @@
         <w:t xml:space="preserve">fields (commit blocked if absent). CVAL/DR still select from Standard regions via normal scoring.</w:t>
       </w:r>
     </w:p>
-    <w:bookmarkEnd w:id="30"/>
-    <w:bookmarkStart w:id="31" w:name="validation-rule-framework-vr-1..vr-11"/>
+    <w:bookmarkEnd w:id="25"/>
+    <w:bookmarkStart w:id="26" w:name="validation-rule-framework-vr-1..vr-11"/>
     <w:p>
       <w:pPr>
         <w:pStyle w:val="Heading4"/>
@@ -2456,19 +2558,19 @@
               <w:jc w:val="left"/>
             </w:pPr>
             <w:r>
-              <w:t xml:space="preserve">Middle East DR = Belgium Central via approved path</w:t>
-            </w:r>
-          </w:p>
-        </w:tc>
-        <w:tc>
-          <w:tcPr/>
-          <w:p>
-            <w:pPr>
-              <w:pStyle w:val="Compact"/>
-              <w:jc w:val="left"/>
-            </w:pPr>
-            <w:r>
-              <w:t xml:space="preserve">Block with ops alert if Belgium Central fails HC-1..HC-10</w:t>
+              <w:t xml:space="preserve">Middle East DR = Switzerland North via approved path</w:t>
+            </w:r>
+          </w:p>
+        </w:tc>
+        <w:tc>
+          <w:tcPr/>
+          <w:p>
+            <w:pPr>
+              <w:pStyle w:val="Compact"/>
+              <w:jc w:val="left"/>
+            </w:pPr>
+            <w:r>
+              <w:t xml:space="preserve">Block with ops alert if Switzerland North fails HC-1..HC-10</w:t>
             </w:r>
           </w:p>
         </w:tc>
@@ -2664,8 +2766,8 @@
         </w:tc>
       </w:tr>
     </w:tbl>
-    <w:bookmarkEnd w:id="31"/>
-    <w:bookmarkStart w:id="32" w:name="capacity-holds-concurrency"/>
+    <w:bookmarkEnd w:id="26"/>
+    <w:bookmarkStart w:id="27" w:name="capacity-holds-concurrency"/>
     <w:p>
       <w:pPr>
         <w:pStyle w:val="Heading4"/>
@@ -2720,8 +2822,8 @@
         <w:t xml:space="preserve">[Documented]</w:t>
       </w:r>
     </w:p>
-    <w:bookmarkEnd w:id="32"/>
-    <w:bookmarkStart w:id="33" w:name="corrected-scoring-model-pilot"/>
+    <w:bookmarkEnd w:id="27"/>
+    <w:bookmarkStart w:id="28" w:name="corrected-scoring-model-pilot"/>
     <w:p>
       <w:pPr>
         <w:pStyle w:val="Heading4"/>
@@ -2866,8 +2968,8 @@
         <w:t xml:space="preserve">Revised weights are proposed, not empirically validated — advisory until pilot measurement.</w:t>
       </w:r>
     </w:p>
-    <w:bookmarkEnd w:id="33"/>
-    <w:bookmarkStart w:id="34" w:name="governance-compliance-controls"/>
+    <w:bookmarkEnd w:id="28"/>
+    <w:bookmarkStart w:id="29" w:name="governance-compliance-controls"/>
     <w:p>
       <w:pPr>
         <w:pStyle w:val="Heading4"/>
@@ -2958,12 +3060,12 @@
         <w:pStyle w:val="Compact"/>
       </w:pPr>
       <w:r>
-        <w:t xml:space="preserve">Belgium Central’s regional capacity-planning targets must include potential Middle East DR demand on top of in-geo Europe demand.</w:t>
-      </w:r>
-    </w:p>
-    <w:bookmarkEnd w:id="34"/>
-    <w:bookmarkEnd w:id="35"/>
-    <w:bookmarkStart w:id="36" w:name="consequences"/>
+        <w:t xml:space="preserve">Switzerland North’s regional capacity-planning targets must include potential Middle East DR demand on top of in-geo Europe demand.</w:t>
+      </w:r>
+    </w:p>
+    <w:bookmarkEnd w:id="29"/>
+    <w:bookmarkEnd w:id="30"/>
+    <w:bookmarkStart w:id="31" w:name="consequences"/>
     <w:p>
       <w:pPr>
         <w:pStyle w:val="Heading3"/>
@@ -3077,8 +3179,8 @@
         <w:t xml:space="preserve">- CRG_Score (Regional Capacity Weight) is demoted from a primary scoring input to a monitoring-only signal.</w:t>
       </w:r>
     </w:p>
-    <w:bookmarkEnd w:id="36"/>
-    <w:bookmarkStart w:id="37" w:name="alternatives-considered"/>
+    <w:bookmarkEnd w:id="31"/>
+    <w:bookmarkStart w:id="32" w:name="alternatives-considered"/>
     <w:p>
       <w:pPr>
         <w:pStyle w:val="Heading3"/>
@@ -3296,9 +3398,9 @@
         </w:pict>
       </w:r>
     </w:p>
-    <w:bookmarkEnd w:id="37"/>
-    <w:bookmarkEnd w:id="38"/>
-    <w:bookmarkStart w:id="49" w:name="adr-002-quota-and-capacity-management"/>
+    <w:bookmarkEnd w:id="32"/>
+    <w:bookmarkEnd w:id="33"/>
+    <w:bookmarkStart w:id="41" w:name="adr-002-quota-and-capacity-management"/>
     <w:p>
       <w:pPr>
         <w:pStyle w:val="Heading2"/>
@@ -3373,7 +3475,7 @@
         <w:t xml:space="preserve">HC-2, HC-3, HC-7 (hard constraints)</w:t>
       </w:r>
     </w:p>
-    <w:bookmarkStart w:id="39" w:name="context-1"/>
+    <w:bookmarkStart w:id="34" w:name="context-1"/>
     <w:p>
       <w:pPr>
         <w:pStyle w:val="Heading3"/>
@@ -3494,8 +3596,8 @@
         <w:t xml:space="preserve">natively support intra-group sub-reservations — so any sub-partition of a group pool must be enforced by the engine.</w:t>
       </w:r>
     </w:p>
-    <w:bookmarkEnd w:id="39"/>
-    <w:bookmarkStart w:id="46" w:name="decision-1"/>
+    <w:bookmarkEnd w:id="34"/>
+    <w:bookmarkStart w:id="38" w:name="decision-1"/>
     <w:p>
       <w:pPr>
         <w:pStyle w:val="Heading3"/>
@@ -3968,54 +4070,7 @@
     </w:p>
     <w:p>
       <w:pPr>
-        <w:pStyle w:val="CaptionedFigure"/>
-      </w:pPr>
-      <w:r>
-        <w:drawing>
-          <wp:inline>
-            <wp:extent cx="5334000" cy="4769303"/>
-            <wp:effectExtent b="0" l="0" r="0" t="0"/>
-            <wp:docPr descr="Figure 3. Two-quota-group-per-region model — an isolated Prod-only group and a shared NonProd+DR group with the engine-enforced DR floor and the effective NonProd ceiling." title="" id="41" name="Picture"/>
-            <a:graphic>
-              <a:graphicData uri="http://schemas.openxmlformats.org/drawingml/2006/picture">
-                <pic:pic>
-                  <pic:nvPicPr>
-                    <pic:cNvPr descr="adr/diagrams/adr002_quota_groups.png" id="42" name="Picture"/>
-                    <pic:cNvPicPr>
-                      <a:picLocks noChangeArrowheads="1" noChangeAspect="1"/>
-                    </pic:cNvPicPr>
-                  </pic:nvPicPr>
-                  <pic:blipFill>
-                    <a:blip r:embed="rId40"/>
-                    <a:stretch>
-                      <a:fillRect/>
-                    </a:stretch>
-                  </pic:blipFill>
-                  <pic:spPr bwMode="auto">
-                    <a:xfrm>
-                      <a:off x="0" y="0"/>
-                      <a:ext cx="5334000" cy="4769303"/>
-                    </a:xfrm>
-                    <a:prstGeom prst="rect">
-                      <a:avLst/>
-                    </a:prstGeom>
-                    <a:noFill/>
-                    <a:ln w="9525">
-                      <a:noFill/>
-                      <a:headEnd/>
-                      <a:tailEnd/>
-                    </a:ln>
-                  </pic:spPr>
-                </pic:pic>
-              </a:graphicData>
-            </a:graphic>
-          </wp:inline>
-        </w:drawing>
-      </w:r>
-    </w:p>
-    <w:p>
-      <w:pPr>
-        <w:pStyle w:val="ImageCaption"/>
+        <w:pStyle w:val="BodyText"/>
       </w:pPr>
       <w:r>
         <w:rPr>
@@ -4031,7 +4086,7 @@
         <w:t xml:space="preserve">Two-quota-group-per-region model — an isolated Prod-only group and a shared NonProd+DR group with the engine-enforced DR floor and the effective NonProd ceiling.</w:t>
       </w:r>
     </w:p>
-    <w:bookmarkStart w:id="43" w:name="group-accounting-formulas-normative"/>
+    <w:bookmarkStart w:id="35" w:name="group-accounting-formulas-normative"/>
     <w:p>
       <w:pPr>
         <w:pStyle w:val="Heading4"/>
@@ -4111,8 +4166,8 @@
         <w:t xml:space="preserve">Group_Headroom            = Group_Limit − Group_Used</w:t>
       </w:r>
     </w:p>
-    <w:bookmarkEnd w:id="43"/>
-    <w:bookmarkStart w:id="44" w:name="exact-enforcement-controls"/>
+    <w:bookmarkEnd w:id="35"/>
+    <w:bookmarkStart w:id="36" w:name="exact-enforcement-controls"/>
     <w:p>
       <w:pPr>
         <w:pStyle w:val="Heading4"/>
@@ -4302,8 +4357,8 @@
         <w:t xml:space="preserve">— no fixed propagation SLA is assumed.</w:t>
       </w:r>
     </w:p>
-    <w:bookmarkEnd w:id="44"/>
-    <w:bookmarkStart w:id="45" w:name="grouptype-preview-dependency"/>
+    <w:bookmarkEnd w:id="36"/>
+    <w:bookmarkStart w:id="37" w:name="grouptype-preview-dependency"/>
     <w:p>
       <w:pPr>
         <w:pStyle w:val="Heading4"/>
@@ -4459,9 +4514,9 @@
         <w:t xml:space="preserve">is ever relied upon to drop the engine’s own subscription-level check, that dependency must pass a preview-acceptance proof-of-concept and a recorded decision first. Engineering constraint: pin the exact preview API version in all quota-group calls and add version-drift detection to the platform health check.</w:t>
       </w:r>
     </w:p>
-    <w:bookmarkEnd w:id="45"/>
-    <w:bookmarkEnd w:id="46"/>
-    <w:bookmarkStart w:id="47" w:name="consequences-1"/>
+    <w:bookmarkEnd w:id="37"/>
+    <w:bookmarkEnd w:id="38"/>
+    <w:bookmarkStart w:id="39" w:name="consequences-1"/>
     <w:p>
       <w:pPr>
         <w:pStyle w:val="Heading3"/>
@@ -4668,8 +4723,8 @@
         <w:t xml:space="preserve">returns 404 in the target tenant/region, escalate to Azure Support.</w:t>
       </w:r>
     </w:p>
-    <w:bookmarkEnd w:id="47"/>
-    <w:bookmarkStart w:id="48" w:name="alternatives-considered-1"/>
+    <w:bookmarkEnd w:id="39"/>
+    <w:bookmarkStart w:id="40" w:name="alternatives-considered-1"/>
     <w:p>
       <w:pPr>
         <w:pStyle w:val="Heading3"/>
@@ -4899,9 +4954,9 @@
         </w:pict>
       </w:r>
     </w:p>
-    <w:bookmarkEnd w:id="48"/>
-    <w:bookmarkEnd w:id="49"/>
-    <w:bookmarkStart w:id="63" w:name="Xb03910cb3c9a0c0ecb9b813c5fa342521392efc"/>
+    <w:bookmarkEnd w:id="40"/>
+    <w:bookmarkEnd w:id="41"/>
+    <w:bookmarkStart w:id="49" w:name="Xb03910cb3c9a0c0ecb9b813c5fa342521392efc"/>
     <w:p>
       <w:pPr>
         <w:pStyle w:val="Heading2"/>
@@ -4976,7 +5031,7 @@
         <w:t xml:space="preserve">HC-1, HC-4, HC-6 (hard constraints)</w:t>
       </w:r>
     </w:p>
-    <w:bookmarkStart w:id="50" w:name="context-2"/>
+    <w:bookmarkStart w:id="42" w:name="context-2"/>
     <w:p>
       <w:pPr>
         <w:pStyle w:val="Heading3"/>
@@ -5045,8 +5100,8 @@
         <w:t xml:space="preserve">- A safe, tiered escalation model for expanding DR capacity during a declared event.</w:t>
       </w:r>
     </w:p>
-    <w:bookmarkEnd w:id="50"/>
-    <w:bookmarkStart w:id="60" w:name="decision-2"/>
+    <w:bookmarkEnd w:id="42"/>
+    <w:bookmarkStart w:id="46" w:name="decision-2"/>
     <w:p>
       <w:pPr>
         <w:pStyle w:val="Heading3"/>
@@ -5684,54 +5739,7 @@
     </w:p>
     <w:p>
       <w:pPr>
-        <w:pStyle w:val="CaptionedFigure"/>
-      </w:pPr>
-      <w:r>
-        <w:drawing>
-          <wp:inline>
-            <wp:extent cx="5334000" cy="17597437"/>
-            <wp:effectExtent b="0" l="0" r="0" t="0"/>
-            <wp:docPr descr="Figure 4. Three-tier Emergency Capacity Transfer escalation — Tier 1 automated, Tier 2 quota-neutral, Tier 3 destructive (blocked in Phase 1)." title="" id="52" name="Picture"/>
-            <a:graphic>
-              <a:graphicData uri="http://schemas.openxmlformats.org/drawingml/2006/picture">
-                <pic:pic>
-                  <pic:nvPicPr>
-                    <pic:cNvPr descr="adr/diagrams/adr003_transfer_tiers.png" id="53" name="Picture"/>
-                    <pic:cNvPicPr>
-                      <a:picLocks noChangeArrowheads="1" noChangeAspect="1"/>
-                    </pic:cNvPicPr>
-                  </pic:nvPicPr>
-                  <pic:blipFill>
-                    <a:blip r:embed="rId51"/>
-                    <a:stretch>
-                      <a:fillRect/>
-                    </a:stretch>
-                  </pic:blipFill>
-                  <pic:spPr bwMode="auto">
-                    <a:xfrm>
-                      <a:off x="0" y="0"/>
-                      <a:ext cx="5334000" cy="17597437"/>
-                    </a:xfrm>
-                    <a:prstGeom prst="rect">
-                      <a:avLst/>
-                    </a:prstGeom>
-                    <a:noFill/>
-                    <a:ln w="9525">
-                      <a:noFill/>
-                      <a:headEnd/>
-                      <a:tailEnd/>
-                    </a:ln>
-                  </pic:spPr>
-                </pic:pic>
-              </a:graphicData>
-            </a:graphic>
-          </wp:inline>
-        </w:drawing>
-      </w:r>
-    </w:p>
-    <w:p>
-      <w:pPr>
-        <w:pStyle w:val="ImageCaption"/>
+        <w:pStyle w:val="FirstParagraph"/>
       </w:pPr>
       <w:r>
         <w:rPr>
@@ -5747,7 +5755,7 @@
         <w:t xml:space="preserve">Three-tier Emergency Capacity Transfer escalation — Tier 1 automated, Tier 2 quota-neutral, Tier 3 destructive (blocked in Phase 1).</w:t>
       </w:r>
     </w:p>
-    <w:bookmarkStart w:id="57" w:name="full-engine-state-machine-normative"/>
+    <w:bookmarkStart w:id="43" w:name="full-engine-state-machine-normative"/>
     <w:p>
       <w:pPr>
         <w:pStyle w:val="Heading4"/>
@@ -6087,54 +6095,7 @@
     </w:p>
     <w:p>
       <w:pPr>
-        <w:pStyle w:val="CaptionedFigure"/>
-      </w:pPr>
-      <w:r>
-        <w:drawing>
-          <wp:inline>
-            <wp:extent cx="5334000" cy="3918857"/>
-            <wp:effectExtent b="0" l="0" r="0" t="0"/>
-            <wp:docPr descr="Figure 5. Five-state engine mode machine — every transition is operator-gated with dual approval." title="" id="55" name="Picture"/>
-            <a:graphic>
-              <a:graphicData uri="http://schemas.openxmlformats.org/drawingml/2006/picture">
-                <pic:pic>
-                  <pic:nvPicPr>
-                    <pic:cNvPr descr="adr/diagrams/adr003_state_machine.png" id="56" name="Picture"/>
-                    <pic:cNvPicPr>
-                      <a:picLocks noChangeArrowheads="1" noChangeAspect="1"/>
-                    </pic:cNvPicPr>
-                  </pic:nvPicPr>
-                  <pic:blipFill>
-                    <a:blip r:embed="rId54"/>
-                    <a:stretch>
-                      <a:fillRect/>
-                    </a:stretch>
-                  </pic:blipFill>
-                  <pic:spPr bwMode="auto">
-                    <a:xfrm>
-                      <a:off x="0" y="0"/>
-                      <a:ext cx="5334000" cy="3918857"/>
-                    </a:xfrm>
-                    <a:prstGeom prst="rect">
-                      <a:avLst/>
-                    </a:prstGeom>
-                    <a:noFill/>
-                    <a:ln w="9525">
-                      <a:noFill/>
-                      <a:headEnd/>
-                      <a:tailEnd/>
-                    </a:ln>
-                  </pic:spPr>
-                </pic:pic>
-              </a:graphicData>
-            </a:graphic>
-          </wp:inline>
-        </w:drawing>
-      </w:r>
-    </w:p>
-    <w:p>
-      <w:pPr>
-        <w:pStyle w:val="ImageCaption"/>
+        <w:pStyle w:val="BodyText"/>
       </w:pPr>
       <w:r>
         <w:rPr>
@@ -6150,8 +6111,8 @@
         <w:t xml:space="preserve">Five-state engine mode machine — every transition is operator-gated with dual approval.</w:t>
       </w:r>
     </w:p>
-    <w:bookmarkEnd w:id="57"/>
-    <w:bookmarkStart w:id="58" w:name="enginemodestate-entity"/>
+    <w:bookmarkEnd w:id="43"/>
+    <w:bookmarkStart w:id="44" w:name="enginemodestate-entity"/>
     <w:p>
       <w:pPr>
         <w:pStyle w:val="Heading4"/>
@@ -6186,8 +6147,8 @@
         <w:t xml:space="preserve">[Documented]</w:t>
       </w:r>
     </w:p>
-    <w:bookmarkEnd w:id="58"/>
-    <w:bookmarkStart w:id="59" w:name="dr-activation-semantics"/>
+    <w:bookmarkEnd w:id="44"/>
+    <w:bookmarkStart w:id="45" w:name="dr-activation-semantics"/>
     <w:p>
       <w:pPr>
         <w:pStyle w:val="Heading4"/>
@@ -6254,9 +6215,9 @@
         <w:t xml:space="preserve">[Documented]</w:t>
       </w:r>
     </w:p>
-    <w:bookmarkEnd w:id="59"/>
-    <w:bookmarkEnd w:id="60"/>
-    <w:bookmarkStart w:id="61" w:name="consequences-2"/>
+    <w:bookmarkEnd w:id="45"/>
+    <w:bookmarkEnd w:id="46"/>
+    <w:bookmarkStart w:id="47" w:name="consequences-2"/>
     <w:p>
       <w:pPr>
         <w:pStyle w:val="Heading3"/>
@@ -6441,8 +6402,8 @@
         <w:t xml:space="preserve">fields to evaluate HC-6.</w:t>
       </w:r>
     </w:p>
-    <w:bookmarkEnd w:id="61"/>
-    <w:bookmarkStart w:id="62" w:name="alternatives-considered-2"/>
+    <w:bookmarkEnd w:id="47"/>
+    <w:bookmarkStart w:id="48" w:name="alternatives-considered-2"/>
     <w:p>
       <w:pPr>
         <w:pStyle w:val="Heading3"/>
@@ -6732,9 +6693,9 @@
         </w:pict>
       </w:r>
     </w:p>
-    <w:bookmarkEnd w:id="62"/>
-    <w:bookmarkEnd w:id="63"/>
-    <w:bookmarkStart w:id="74" w:name="X26bb2dd1e6ed50cfaa8bfd7d8d9521ec21700a3"/>
+    <w:bookmarkEnd w:id="48"/>
+    <w:bookmarkEnd w:id="49"/>
+    <w:bookmarkStart w:id="57" w:name="X26bb2dd1e6ed50cfaa8bfd7d8d9521ec21700a3"/>
     <w:p>
       <w:pPr>
         <w:pStyle w:val="Heading2"/>
@@ -6809,7 +6770,7 @@
         <w:t xml:space="preserve">HC-3 (applied at increase-execution time)</w:t>
       </w:r>
     </w:p>
-    <w:bookmarkStart w:id="64" w:name="context-3"/>
+    <w:bookmarkStart w:id="50" w:name="context-3"/>
     <w:p>
       <w:pPr>
         <w:pStyle w:val="Heading3"/>
@@ -6842,8 +6803,8 @@
         <w:t xml:space="preserve">ever autonomously performing material or destructive changes in Phase 1. This growth path must be architecturally distinct from crisis operations (see ADR-003).</w:t>
       </w:r>
     </w:p>
-    <w:bookmarkEnd w:id="64"/>
-    <w:bookmarkStart w:id="71" w:name="decision-3"/>
+    <w:bookmarkEnd w:id="50"/>
+    <w:bookmarkStart w:id="54" w:name="decision-3"/>
     <w:p>
       <w:pPr>
         <w:pStyle w:val="Heading3"/>
@@ -7268,7 +7229,7 @@
         <w:t xml:space="preserve">Increases only ever raise CR quantity or request more quota; guarded reduction (right-sizing) never drops a CR below its allocated count (the platform floor) and is itself approval-gated.</w:t>
       </w:r>
     </w:p>
-    <w:bookmarkStart w:id="68" w:name="Xf1426b79a09c525d9ee2bfb22640520d79a16bd"/>
+    <w:bookmarkStart w:id="51" w:name="Xf1426b79a09c525d9ee2bfb22640520d79a16bd"/>
     <w:p>
       <w:pPr>
         <w:pStyle w:val="Heading4"/>
@@ -7470,54 +7431,7 @@
     </w:p>
     <w:p>
       <w:pPr>
-        <w:pStyle w:val="CaptionedFigure"/>
-      </w:pPr>
-      <w:r>
-        <w:drawing>
-          <wp:inline>
-            <wp:extent cx="5334000" cy="24080304"/>
-            <wp:effectExtent b="0" l="0" r="0" t="0"/>
-            <wp:docPr descr="Figure 6. Ten-step steady-state capacity-increase lifecycle, running only in STEADY_STATE behind an operator-approval gate." title="" id="66" name="Picture"/>
-            <a:graphic>
-              <a:graphicData uri="http://schemas.openxmlformats.org/drawingml/2006/picture">
-                <pic:pic>
-                  <pic:nvPicPr>
-                    <pic:cNvPr descr="adr/diagrams/adr004_lifecycle.png" id="67" name="Picture"/>
-                    <pic:cNvPicPr>
-                      <a:picLocks noChangeArrowheads="1" noChangeAspect="1"/>
-                    </pic:cNvPicPr>
-                  </pic:nvPicPr>
-                  <pic:blipFill>
-                    <a:blip r:embed="rId65"/>
-                    <a:stretch>
-                      <a:fillRect/>
-                    </a:stretch>
-                  </pic:blipFill>
-                  <pic:spPr bwMode="auto">
-                    <a:xfrm>
-                      <a:off x="0" y="0"/>
-                      <a:ext cx="5334000" cy="24080304"/>
-                    </a:xfrm>
-                    <a:prstGeom prst="rect">
-                      <a:avLst/>
-                    </a:prstGeom>
-                    <a:noFill/>
-                    <a:ln w="9525">
-                      <a:noFill/>
-                      <a:headEnd/>
-                      <a:tailEnd/>
-                    </a:ln>
-                  </pic:spPr>
-                </pic:pic>
-              </a:graphicData>
-            </a:graphic>
-          </wp:inline>
-        </w:drawing>
-      </w:r>
-    </w:p>
-    <w:p>
-      <w:pPr>
-        <w:pStyle w:val="ImageCaption"/>
+        <w:pStyle w:val="FirstParagraph"/>
       </w:pPr>
       <w:r>
         <w:rPr>
@@ -7533,8 +7447,8 @@
         <w:t xml:space="preserve">Ten-step steady-state capacity-increase lifecycle, running only in STEADY_STATE behind an operator-approval gate.</w:t>
       </w:r>
     </w:p>
-    <w:bookmarkEnd w:id="68"/>
-    <w:bookmarkStart w:id="69" w:name="auto-decrease-exclusion"/>
+    <w:bookmarkEnd w:id="51"/>
+    <w:bookmarkStart w:id="52" w:name="auto-decrease-exclusion"/>
     <w:p>
       <w:pPr>
         <w:pStyle w:val="Heading4"/>
@@ -7573,8 +7487,8 @@
         <w:t xml:space="preserve">[Documented]</w:t>
       </w:r>
     </w:p>
-    <w:bookmarkEnd w:id="69"/>
-    <w:bookmarkStart w:id="70" w:name="forecast-advisory-posture"/>
+    <w:bookmarkEnd w:id="52"/>
+    <w:bookmarkStart w:id="53" w:name="forecast-advisory-posture"/>
     <w:p>
       <w:pPr>
         <w:pStyle w:val="Heading4"/>
@@ -7637,9 +7551,9 @@
         <w:t xml:space="preserve">[Documented]</w:t>
       </w:r>
     </w:p>
-    <w:bookmarkEnd w:id="70"/>
-    <w:bookmarkEnd w:id="71"/>
-    <w:bookmarkStart w:id="72" w:name="consequences-3"/>
+    <w:bookmarkEnd w:id="53"/>
+    <w:bookmarkEnd w:id="54"/>
+    <w:bookmarkStart w:id="55" w:name="consequences-3"/>
     <w:p>
       <w:pPr>
         <w:pStyle w:val="Heading3"/>
@@ -7750,8 +7664,8 @@
         <w:t xml:space="preserve">lifecycle (entity, approval, retry, cancellation) is still a backlog item requiring an end-to-end approved-increase test.</w:t>
       </w:r>
     </w:p>
-    <w:bookmarkEnd w:id="72"/>
-    <w:bookmarkStart w:id="73" w:name="alternatives-considered-3"/>
+    <w:bookmarkEnd w:id="55"/>
+    <w:bookmarkStart w:id="56" w:name="alternatives-considered-3"/>
     <w:p>
       <w:pPr>
         <w:pStyle w:val="Heading3"/>
@@ -8017,9 +7931,9 @@
         </w:pict>
       </w:r>
     </w:p>
-    <w:bookmarkEnd w:id="73"/>
-    <w:bookmarkEnd w:id="74"/>
-    <w:bookmarkStart w:id="75" w:name="appendix-a-adr-summary"/>
+    <w:bookmarkEnd w:id="56"/>
+    <w:bookmarkEnd w:id="57"/>
+    <w:bookmarkStart w:id="58" w:name="appendix-a-adr-summary"/>
     <w:p>
       <w:pPr>
         <w:pStyle w:val="Heading2"/>
@@ -8248,8 +8162,8 @@
         </w:tc>
       </w:tr>
     </w:tbl>
-    <w:bookmarkEnd w:id="75"/>
-    <w:bookmarkStart w:id="76" w:name="appendix-b-status-legend"/>
+    <w:bookmarkEnd w:id="58"/>
+    <w:bookmarkStart w:id="59" w:name="appendix-b-status-legend"/>
     <w:p>
       <w:pPr>
         <w:pStyle w:val="Heading2"/>
@@ -8418,8 +8332,8 @@
         </w:tc>
       </w:tr>
     </w:tbl>
-    <w:bookmarkEnd w:id="76"/>
-    <w:bookmarkStart w:id="77" w:name="appendix-c-evidence-tag-taxonomy"/>
+    <w:bookmarkEnd w:id="59"/>
+    <w:bookmarkStart w:id="60" w:name="appendix-c-evidence-tag-taxonomy"/>
     <w:p>
       <w:pPr>
         <w:pStyle w:val="Heading2"/>
@@ -8625,8 +8539,8 @@
         <w:t xml:space="preserve">After proof-of-concept validation of Azure Quota Groups GA and quota-release latency, and on resolution of the consumer-credential model and engine-mode state-machine items.</w:t>
       </w:r>
     </w:p>
-    <w:bookmarkEnd w:id="77"/>
-    <w:bookmarkEnd w:id="78"/>
+    <w:bookmarkEnd w:id="60"/>
+    <w:bookmarkEnd w:id="61"/>
     <w:sectPr/>
   </w:body>
 </w:document>

</xml_diff>